<commit_message>
docs: finalize official Word and PDF reports with student info and ICTU cover
</commit_message>
<xml_diff>
--- a/BAO_CAO_DE_13.docx
+++ b/BAO_CAO_DE_13.docx
@@ -13,7 +13,7 @@
           <w:color w:val="1A365D"/>
           <w:sz w:val="26"/>
         </w:rPr>
-        <w:t>[TRƯ</w:t>
+        <w:t>Đ</w:t>
       </w:r>
       <w:r>
         <w:rPr>
@@ -22,7 +22,7 @@
           <w:color w:val="1A365D"/>
           <w:sz w:val="26"/>
         </w:rPr>
-        <w:t>Ờ</w:t>
+        <w:t>Ạ</w:t>
       </w:r>
       <w:r>
         <w:rPr>
@@ -31,7 +31,7 @@
           <w:color w:val="1A365D"/>
           <w:sz w:val="26"/>
         </w:rPr>
-        <w:t>NG/KHOA] (*)</w:t>
+        <w:t>I H</w:t>
       </w:r>
       <w:r>
         <w:rPr>
@@ -40,8 +40,7 @@
           <w:color w:val="1A365D"/>
           <w:sz w:val="26"/>
         </w:rPr>
-        <w:br/>
-        <w:t>KHOA CÔNG NGH</w:t>
+        <w:t>Ọ</w:t>
       </w:r>
       <w:r>
         <w:rPr>
@@ -50,7 +49,7 @@
           <w:color w:val="1A365D"/>
           <w:sz w:val="26"/>
         </w:rPr>
-        <w:t>Ệ</w:t>
+        <w:t>C THÁI NGUYÊN</w:t>
       </w:r>
       <w:r>
         <w:rPr>
@@ -59,7 +58,98 @@
           <w:color w:val="1A365D"/>
           <w:sz w:val="26"/>
         </w:rPr>
-        <w:t xml:space="preserve"> THÔNG TIN</w:t>
+        <w:br/>
+        <w:t>TRƯ</w:t>
+      </w:r>
+      <w:r>
+        <w:rPr>
+          <w:rFonts w:ascii="Times New Roman" w:hAnsi="Times New Roman"/>
+          <w:b/>
+          <w:color w:val="1A365D"/>
+          <w:sz w:val="26"/>
+        </w:rPr>
+        <w:t>Ờ</w:t>
+      </w:r>
+      <w:r>
+        <w:rPr>
+          <w:rFonts w:ascii="Times New Roman" w:hAnsi="Times New Roman"/>
+          <w:b/>
+          <w:color w:val="1A365D"/>
+          <w:sz w:val="26"/>
+        </w:rPr>
+        <w:t>NG Đ</w:t>
+      </w:r>
+      <w:r>
+        <w:rPr>
+          <w:rFonts w:ascii="Times New Roman" w:hAnsi="Times New Roman"/>
+          <w:b/>
+          <w:color w:val="1A365D"/>
+          <w:sz w:val="26"/>
+        </w:rPr>
+        <w:t>Ạ</w:t>
+      </w:r>
+      <w:r>
+        <w:rPr>
+          <w:rFonts w:ascii="Times New Roman" w:hAnsi="Times New Roman"/>
+          <w:b/>
+          <w:color w:val="1A365D"/>
+          <w:sz w:val="26"/>
+        </w:rPr>
+        <w:t>I H</w:t>
+      </w:r>
+      <w:r>
+        <w:rPr>
+          <w:rFonts w:ascii="Times New Roman" w:hAnsi="Times New Roman"/>
+          <w:b/>
+          <w:color w:val="1A365D"/>
+          <w:sz w:val="26"/>
+        </w:rPr>
+        <w:t>Ọ</w:t>
+      </w:r>
+      <w:r>
+        <w:rPr>
+          <w:rFonts w:ascii="Times New Roman" w:hAnsi="Times New Roman"/>
+          <w:b/>
+          <w:color w:val="1A365D"/>
+          <w:sz w:val="26"/>
+        </w:rPr>
+        <w:t>C CÔNG NGH</w:t>
+      </w:r>
+      <w:r>
+        <w:rPr>
+          <w:rFonts w:ascii="Times New Roman" w:hAnsi="Times New Roman"/>
+          <w:b/>
+          <w:color w:val="1A365D"/>
+          <w:sz w:val="26"/>
+        </w:rPr>
+        <w:t>Ệ</w:t>
+      </w:r>
+      <w:r>
+        <w:rPr>
+          <w:rFonts w:ascii="Times New Roman" w:hAnsi="Times New Roman"/>
+          <w:b/>
+          <w:color w:val="1A365D"/>
+          <w:sz w:val="26"/>
+        </w:rPr>
+        <w:t xml:space="preserve"> THÔNG TIN VÀ TRUY</w:t>
+      </w:r>
+      <w:r>
+        <w:rPr>
+          <w:rFonts w:ascii="Times New Roman" w:hAnsi="Times New Roman"/>
+          <w:b/>
+          <w:color w:val="1A365D"/>
+          <w:sz w:val="26"/>
+        </w:rPr>
+        <w:t>Ề</w:t>
+      </w:r>
+      <w:r>
+        <w:rPr>
+          <w:rFonts w:ascii="Times New Roman" w:hAnsi="Times New Roman"/>
+          <w:b/>
+          <w:color w:val="1A365D"/>
+          <w:sz w:val="26"/>
+        </w:rPr>
+        <w:t>N THÔNG</w:t>
       </w:r>
       <w:r>
         <w:rPr>
@@ -466,8 +556,8 @@
         <w:tblLook w:val="04A0" w:firstRow="1" w:lastRow="0" w:firstColumn="1" w:lastColumn="0" w:noHBand="0" w:noVBand="1"/>
       </w:tblPr>
       <w:tblGrid>
-        <w:gridCol w:w="4250"/>
-        <w:gridCol w:w="5037"/>
+        <w:gridCol w:w="4226"/>
+        <w:gridCol w:w="5061"/>
       </w:tblGrid>
       <w:tr>
         <w:trPr>
@@ -532,7 +622,7 @@
                 <w:b/>
                 <w:sz w:val="24"/>
               </w:rPr>
-              <w:t>n (*):</w:t>
+              <w:t>n:</w:t>
             </w:r>
           </w:p>
         </w:tc>
@@ -548,25 +638,7 @@
                 <w:color w:val="2563EB"/>
                 <w:sz w:val="24"/>
               </w:rPr>
-              <w:t>[GI</w:t>
-            </w:r>
-            <w:r>
-              <w:rPr>
-                <w:rFonts w:ascii="Times New Roman" w:hAnsi="Times New Roman"/>
-                <w:b/>
-                <w:color w:val="2563EB"/>
-                <w:sz w:val="24"/>
-              </w:rPr>
-              <w:t>Ả</w:t>
-            </w:r>
-            <w:r>
-              <w:rPr>
-                <w:rFonts w:ascii="Times New Roman" w:hAnsi="Times New Roman"/>
-                <w:b/>
-                <w:color w:val="2563EB"/>
-                <w:sz w:val="24"/>
-              </w:rPr>
-              <w:t>NG VIÊN]</w:t>
+              <w:t>Hoàng Văn Tâm</w:t>
             </w:r>
           </w:p>
         </w:tc>
@@ -618,7 +690,7 @@
                 <w:b/>
                 <w:sz w:val="24"/>
               </w:rPr>
-              <w:t>n (*):</w:t>
+              <w:t>n:</w:t>
             </w:r>
           </w:p>
         </w:tc>
@@ -634,25 +706,7 @@
                 <w:color w:val="2563EB"/>
                 <w:sz w:val="24"/>
               </w:rPr>
-              <w:t>[H</w:t>
-            </w:r>
-            <w:r>
-              <w:rPr>
-                <w:rFonts w:ascii="Times New Roman" w:hAnsi="Times New Roman"/>
-                <w:b/>
-                <w:color w:val="2563EB"/>
-                <w:sz w:val="24"/>
-              </w:rPr>
-              <w:t>Ọ</w:t>
-            </w:r>
-            <w:r>
-              <w:rPr>
-                <w:rFonts w:ascii="Times New Roman" w:hAnsi="Times New Roman"/>
-                <w:b/>
-                <w:color w:val="2563EB"/>
-                <w:sz w:val="24"/>
-              </w:rPr>
-              <w:t xml:space="preserve"> TÊN]</w:t>
+              <w:t>Vũ Bá Hùng</w:t>
             </w:r>
           </w:p>
         </w:tc>
@@ -688,7 +742,7 @@
                 <w:b/>
                 <w:sz w:val="24"/>
               </w:rPr>
-              <w:t xml:space="preserve"> sinh viên (MSSV) (*):</w:t>
+              <w:t xml:space="preserve"> sinh viên (MSSV):</w:t>
             </w:r>
           </w:p>
         </w:tc>
@@ -704,7 +758,7 @@
                 <w:color w:val="2563EB"/>
                 <w:sz w:val="24"/>
               </w:rPr>
-              <w:t>[MSSV]</w:t>
+              <w:t>DTC245180186</w:t>
             </w:r>
           </w:p>
         </w:tc>
@@ -740,7 +794,7 @@
                 <w:b/>
                 <w:sz w:val="24"/>
               </w:rPr>
-              <w:t>p chuyên ngành (*):</w:t>
+              <w:t>p chuyên ngành:</w:t>
             </w:r>
           </w:p>
         </w:tc>
@@ -756,25 +810,7 @@
                 <w:color w:val="2563EB"/>
                 <w:sz w:val="24"/>
               </w:rPr>
-              <w:t>[L</w:t>
-            </w:r>
-            <w:r>
-              <w:rPr>
-                <w:rFonts w:ascii="Times New Roman" w:hAnsi="Times New Roman"/>
-                <w:b/>
-                <w:color w:val="2563EB"/>
-                <w:sz w:val="24"/>
-              </w:rPr>
-              <w:t>Ớ</w:t>
-            </w:r>
-            <w:r>
-              <w:rPr>
-                <w:rFonts w:ascii="Times New Roman" w:hAnsi="Times New Roman"/>
-                <w:b/>
-                <w:color w:val="2563EB"/>
-                <w:sz w:val="24"/>
-              </w:rPr>
-              <w:t>P]</w:t>
+              <w:t>KTPM K23C</w:t>
             </w:r>
           </w:p>
         </w:tc>
@@ -884,189 +920,16 @@
     </w:tbl>
     <w:p>
       <w:pPr>
-        <w:spacing w:before="400"/>
+        <w:spacing w:before="1000"/>
         <w:jc w:val="center"/>
       </w:pPr>
       <w:r>
         <w:rPr>
           <w:rFonts w:ascii="Times New Roman" w:hAnsi="Times New Roman"/>
           <w:i/>
-          <w:color w:val="B91C1C"/>
-          <w:sz w:val="20"/>
-        </w:rPr>
-        <w:t>(*) GHI CHÚ: Các trư</w:t>
-      </w:r>
-      <w:r>
-        <w:rPr>
-          <w:rFonts w:ascii="Times New Roman" w:hAnsi="Times New Roman"/>
-          <w:i/>
-          <w:color w:val="B91C1C"/>
-          <w:sz w:val="20"/>
-        </w:rPr>
-        <w:t>ờ</w:t>
-      </w:r>
-      <w:r>
-        <w:rPr>
-          <w:rFonts w:ascii="Times New Roman" w:hAnsi="Times New Roman"/>
-          <w:i/>
-          <w:color w:val="B91C1C"/>
-          <w:sz w:val="20"/>
-        </w:rPr>
-        <w:t>ng trong d</w:t>
-      </w:r>
-      <w:r>
-        <w:rPr>
-          <w:rFonts w:ascii="Times New Roman" w:hAnsi="Times New Roman"/>
-          <w:i/>
-          <w:color w:val="B91C1C"/>
-          <w:sz w:val="20"/>
-        </w:rPr>
-        <w:t>ấ</w:t>
-      </w:r>
-      <w:r>
-        <w:rPr>
-          <w:rFonts w:ascii="Times New Roman" w:hAnsi="Times New Roman"/>
-          <w:i/>
-          <w:color w:val="B91C1C"/>
-          <w:sz w:val="20"/>
-        </w:rPr>
-        <w:t>u ngo</w:t>
-      </w:r>
-      <w:r>
-        <w:rPr>
-          <w:rFonts w:ascii="Times New Roman" w:hAnsi="Times New Roman"/>
-          <w:i/>
-          <w:color w:val="B91C1C"/>
-          <w:sz w:val="20"/>
-        </w:rPr>
-        <w:t>ặ</w:t>
-      </w:r>
-      <w:r>
-        <w:rPr>
-          <w:rFonts w:ascii="Times New Roman" w:hAnsi="Times New Roman"/>
-          <w:i/>
-          <w:color w:val="B91C1C"/>
-          <w:sz w:val="20"/>
-        </w:rPr>
-        <w:t>c vuông [...] là thông tin sinh viên c</w:t>
-      </w:r>
-      <w:r>
-        <w:rPr>
-          <w:rFonts w:ascii="Times New Roman" w:hAnsi="Times New Roman"/>
-          <w:i/>
-          <w:color w:val="B91C1C"/>
-          <w:sz w:val="20"/>
-        </w:rPr>
-        <w:t>ầ</w:t>
-      </w:r>
-      <w:r>
-        <w:rPr>
-          <w:rFonts w:ascii="Times New Roman" w:hAnsi="Times New Roman"/>
-          <w:i/>
-          <w:color w:val="B91C1C"/>
-          <w:sz w:val="20"/>
-        </w:rPr>
-        <w:t>n đi</w:t>
-      </w:r>
-      <w:r>
-        <w:rPr>
-          <w:rFonts w:ascii="Times New Roman" w:hAnsi="Times New Roman"/>
-          <w:i/>
-          <w:color w:val="B91C1C"/>
-          <w:sz w:val="20"/>
-        </w:rPr>
-        <w:t>ề</w:t>
-      </w:r>
-      <w:r>
-        <w:rPr>
-          <w:rFonts w:ascii="Times New Roman" w:hAnsi="Times New Roman"/>
-          <w:i/>
-          <w:color w:val="B91C1C"/>
-          <w:sz w:val="20"/>
-        </w:rPr>
-        <w:t>n chính xác trư</w:t>
-      </w:r>
-      <w:r>
-        <w:rPr>
-          <w:rFonts w:ascii="Times New Roman" w:hAnsi="Times New Roman"/>
-          <w:i/>
-          <w:color w:val="B91C1C"/>
-          <w:sz w:val="20"/>
-        </w:rPr>
-        <w:t>ớ</w:t>
-      </w:r>
-      <w:r>
-        <w:rPr>
-          <w:rFonts w:ascii="Times New Roman" w:hAnsi="Times New Roman"/>
-          <w:i/>
-          <w:color w:val="B91C1C"/>
-          <w:sz w:val="20"/>
-        </w:rPr>
-        <w:t>c khi n</w:t>
-      </w:r>
-      <w:r>
-        <w:rPr>
-          <w:rFonts w:ascii="Times New Roman" w:hAnsi="Times New Roman"/>
-          <w:i/>
-          <w:color w:val="B91C1C"/>
-          <w:sz w:val="20"/>
-        </w:rPr>
-        <w:t>ộ</w:t>
-      </w:r>
-      <w:r>
-        <w:rPr>
-          <w:rFonts w:ascii="Times New Roman" w:hAnsi="Times New Roman"/>
-          <w:i/>
-          <w:color w:val="B91C1C"/>
-          <w:sz w:val="20"/>
-        </w:rPr>
-        <w:t>p.</w:t>
-      </w:r>
-    </w:p>
-    <w:p>
-      <w:pPr>
-        <w:spacing w:before="800"/>
-        <w:jc w:val="center"/>
-      </w:pPr>
-      <w:r>
-        <w:rPr>
-          <w:rFonts w:ascii="Times New Roman" w:hAnsi="Times New Roman"/>
-          <w:i/>
-          <w:sz w:val="24"/>
-        </w:rPr>
-        <w:t>Thành ph</w:t>
-      </w:r>
-      <w:r>
-        <w:rPr>
-          <w:rFonts w:ascii="Times New Roman" w:hAnsi="Times New Roman"/>
-          <w:i/>
-          <w:sz w:val="24"/>
-        </w:rPr>
-        <w:t>ố</w:t>
-      </w:r>
-      <w:r>
-        <w:rPr>
-          <w:rFonts w:ascii="Times New Roman" w:hAnsi="Times New Roman"/>
-          <w:i/>
-          <w:sz w:val="24"/>
-        </w:rPr>
-        <w:t xml:space="preserve"> H</w:t>
-      </w:r>
-      <w:r>
-        <w:rPr>
-          <w:rFonts w:ascii="Times New Roman" w:hAnsi="Times New Roman"/>
-          <w:i/>
-          <w:sz w:val="24"/>
-        </w:rPr>
-        <w:t>ồ</w:t>
-      </w:r>
-      <w:r>
-        <w:rPr>
-          <w:rFonts w:ascii="Times New Roman" w:hAnsi="Times New Roman"/>
-          <w:i/>
-          <w:sz w:val="24"/>
-        </w:rPr>
-        <w:t xml:space="preserve"> Chí Minh, Năm 2026</w:t>
+          <w:sz w:val="24"/>
+        </w:rPr>
+        <w:t>Thái Nguyên, Năm 2026</w:t>
       </w:r>
     </w:p>
     <w:p>
@@ -9909,7 +9772,7 @@
           <w:noProof/>
         </w:rPr>
         <w:drawing>
-          <wp:inline distT="0" distB="0" distL="0" distR="0" wp14:anchorId="5EC442D5" wp14:editId="2A44C7C3">
+          <wp:inline distT="0" distB="0" distL="0" distR="0" wp14:anchorId="5CB595FC" wp14:editId="3D47DBFC">
             <wp:extent cx="5400000" cy="2840309"/>
             <wp:effectExtent l="0" t="0" r="0" b="0"/>
             <wp:docPr id="1" name="Picture 1"/>
@@ -10043,7 +9906,7 @@
         </w:rPr>
         <w:lastRenderedPageBreak/>
         <w:drawing>
-          <wp:inline distT="0" distB="0" distL="0" distR="0" wp14:anchorId="2BB04A46" wp14:editId="251E2F61">
+          <wp:inline distT="0" distB="0" distL="0" distR="0" wp14:anchorId="08CF1A8F" wp14:editId="0C3A826B">
             <wp:extent cx="4320000" cy="5015106"/>
             <wp:effectExtent l="0" t="0" r="0" b="0"/>
             <wp:docPr id="2" name="Picture 2"/>
@@ -10194,7 +10057,7 @@
           <w:noProof/>
         </w:rPr>
         <w:drawing>
-          <wp:inline distT="0" distB="0" distL="0" distR="0" wp14:anchorId="120C6ED0" wp14:editId="0203DB7C">
+          <wp:inline distT="0" distB="0" distL="0" distR="0" wp14:anchorId="3BAA0BA1" wp14:editId="058CE147">
             <wp:extent cx="2880000" cy="3807360"/>
             <wp:effectExtent l="0" t="0" r="0" b="0"/>
             <wp:docPr id="3" name="Picture 3"/>
@@ -10328,7 +10191,7 @@
           <w:noProof/>
         </w:rPr>
         <w:drawing>
-          <wp:inline distT="0" distB="0" distL="0" distR="0" wp14:anchorId="6907E72E" wp14:editId="6F3CC652">
+          <wp:inline distT="0" distB="0" distL="0" distR="0" wp14:anchorId="08AB26B4" wp14:editId="28F88CED">
             <wp:extent cx="5400000" cy="2840309"/>
             <wp:effectExtent l="0" t="0" r="0" b="0"/>
             <wp:docPr id="4" name="Picture 4"/>
@@ -13390,7 +13253,7 @@
           <w:noProof/>
         </w:rPr>
         <w:drawing>
-          <wp:inline distT="0" distB="0" distL="0" distR="0" wp14:anchorId="09913D3D" wp14:editId="23E713F8">
+          <wp:inline distT="0" distB="0" distL="0" distR="0" wp14:anchorId="62432927" wp14:editId="458E9AD4">
             <wp:extent cx="5400000" cy="2894318"/>
             <wp:effectExtent l="0" t="0" r="0" b="0"/>
             <wp:docPr id="5" name="Picture 5"/>
@@ -19333,6 +19196,626 @@
           </w:p>
         </w:tc>
       </w:tr>
+      <w:tr>
+        <w:trPr>
+          <w:cantSplit/>
+          <w:jc w:val="center"/>
+        </w:trPr>
+        <w:tc>
+          <w:tcPr>
+            <w:tcW w:w="1417" w:type="dxa"/>
+            <w:shd w:val="clear" w:color="auto" w:fill="FFFFFF"/>
+            <w:tcMar>
+              <w:top w:w="70" w:type="dxa"/>
+              <w:left w:w="110" w:type="dxa"/>
+              <w:bottom w:w="70" w:type="dxa"/>
+              <w:right w:w="110" w:type="dxa"/>
+            </w:tcMar>
+            <w:vAlign w:val="center"/>
+          </w:tcPr>
+          <w:p>
+            <w:pPr>
+              <w:spacing w:before="20" w:after="40"/>
+            </w:pPr>
+            <w:r>
+              <w:rPr>
+                <w:rFonts w:ascii="Times New Roman" w:hAnsi="Times New Roman"/>
+                <w:color w:val="1F2937"/>
+                <w:sz w:val="19"/>
+              </w:rPr>
+              <w:t>90129dd</w:t>
+            </w:r>
+          </w:p>
+        </w:tc>
+        <w:tc>
+          <w:tcPr>
+            <w:tcW w:w="4535" w:type="dxa"/>
+            <w:shd w:val="clear" w:color="auto" w:fill="FFFFFF"/>
+            <w:tcMar>
+              <w:top w:w="70" w:type="dxa"/>
+              <w:left w:w="110" w:type="dxa"/>
+              <w:bottom w:w="70" w:type="dxa"/>
+              <w:right w:w="110" w:type="dxa"/>
+            </w:tcMar>
+            <w:vAlign w:val="center"/>
+          </w:tcPr>
+          <w:p>
+            <w:pPr>
+              <w:spacing w:before="20" w:after="40"/>
+            </w:pPr>
+            <w:r>
+              <w:rPr>
+                <w:rFonts w:ascii="Times New Roman" w:hAnsi="Times New Roman"/>
+                <w:color w:val="1F2937"/>
+                <w:sz w:val="19"/>
+              </w:rPr>
+              <w:t>feat(verify): add real test scripts, screenshots, and export BAO_CAO_DE_13.pdf</w:t>
+            </w:r>
+          </w:p>
+        </w:tc>
+        <w:tc>
+          <w:tcPr>
+            <w:tcW w:w="3118" w:type="dxa"/>
+            <w:shd w:val="clear" w:color="auto" w:fill="FFFFFF"/>
+            <w:tcMar>
+              <w:top w:w="70" w:type="dxa"/>
+              <w:left w:w="110" w:type="dxa"/>
+              <w:bottom w:w="70" w:type="dxa"/>
+              <w:right w:w="110" w:type="dxa"/>
+            </w:tcMar>
+            <w:vAlign w:val="center"/>
+          </w:tcPr>
+          <w:p>
+            <w:pPr>
+              <w:spacing w:before="20" w:after="40"/>
+            </w:pPr>
+            <w:r>
+              <w:rPr>
+                <w:rFonts w:ascii="Times New Roman" w:hAnsi="Times New Roman"/>
+                <w:color w:val="1F2937"/>
+                <w:sz w:val="19"/>
+              </w:rPr>
+              <w:t>Ki</w:t>
+            </w:r>
+            <w:r>
+              <w:rPr>
+                <w:rFonts w:ascii="Times New Roman" w:hAnsi="Times New Roman"/>
+                <w:color w:val="1F2937"/>
+                <w:sz w:val="19"/>
+              </w:rPr>
+              <w:t>ể</w:t>
+            </w:r>
+            <w:r>
+              <w:rPr>
+                <w:rFonts w:ascii="Times New Roman" w:hAnsi="Times New Roman"/>
+                <w:color w:val="1F2937"/>
+                <w:sz w:val="19"/>
+              </w:rPr>
+              <w:t>m ch</w:t>
+            </w:r>
+            <w:r>
+              <w:rPr>
+                <w:rFonts w:ascii="Times New Roman" w:hAnsi="Times New Roman"/>
+                <w:color w:val="1F2937"/>
+                <w:sz w:val="19"/>
+              </w:rPr>
+              <w:t>ứ</w:t>
+            </w:r>
+            <w:r>
+              <w:rPr>
+                <w:rFonts w:ascii="Times New Roman" w:hAnsi="Times New Roman"/>
+                <w:color w:val="1F2937"/>
+                <w:sz w:val="19"/>
+              </w:rPr>
+              <w:t>ng: Tích h</w:t>
+            </w:r>
+            <w:r>
+              <w:rPr>
+                <w:rFonts w:ascii="Times New Roman" w:hAnsi="Times New Roman"/>
+                <w:color w:val="1F2937"/>
+                <w:sz w:val="19"/>
+              </w:rPr>
+              <w:t>ợ</w:t>
+            </w:r>
+            <w:r>
+              <w:rPr>
+                <w:rFonts w:ascii="Times New Roman" w:hAnsi="Times New Roman"/>
+                <w:color w:val="1F2937"/>
+                <w:sz w:val="19"/>
+              </w:rPr>
+              <w:t xml:space="preserve">p </w:t>
+            </w:r>
+            <w:r>
+              <w:rPr>
+                <w:rFonts w:ascii="Times New Roman" w:hAnsi="Times New Roman"/>
+                <w:color w:val="1F2937"/>
+                <w:sz w:val="19"/>
+              </w:rPr>
+              <w:t>ả</w:t>
+            </w:r>
+            <w:r>
+              <w:rPr>
+                <w:rFonts w:ascii="Times New Roman" w:hAnsi="Times New Roman"/>
+                <w:color w:val="1F2937"/>
+                <w:sz w:val="19"/>
+              </w:rPr>
+              <w:t>nh minh ch</w:t>
+            </w:r>
+            <w:r>
+              <w:rPr>
+                <w:rFonts w:ascii="Times New Roman" w:hAnsi="Times New Roman"/>
+                <w:color w:val="1F2937"/>
+                <w:sz w:val="19"/>
+              </w:rPr>
+              <w:t>ứ</w:t>
+            </w:r>
+            <w:r>
+              <w:rPr>
+                <w:rFonts w:ascii="Times New Roman" w:hAnsi="Times New Roman"/>
+                <w:color w:val="1F2937"/>
+                <w:sz w:val="19"/>
+              </w:rPr>
+              <w:t>ng th</w:t>
+            </w:r>
+            <w:r>
+              <w:rPr>
+                <w:rFonts w:ascii="Times New Roman" w:hAnsi="Times New Roman"/>
+                <w:color w:val="1F2937"/>
+                <w:sz w:val="19"/>
+              </w:rPr>
+              <w:t>ự</w:t>
+            </w:r>
+            <w:r>
+              <w:rPr>
+                <w:rFonts w:ascii="Times New Roman" w:hAnsi="Times New Roman"/>
+                <w:color w:val="1F2937"/>
+                <w:sz w:val="19"/>
+              </w:rPr>
+              <w:t>c t</w:t>
+            </w:r>
+            <w:r>
+              <w:rPr>
+                <w:rFonts w:ascii="Times New Roman" w:hAnsi="Times New Roman"/>
+                <w:color w:val="1F2937"/>
+                <w:sz w:val="19"/>
+              </w:rPr>
+              <w:t>ế</w:t>
+            </w:r>
+            <w:r>
+              <w:rPr>
+                <w:rFonts w:ascii="Times New Roman" w:hAnsi="Times New Roman"/>
+                <w:color w:val="1F2937"/>
+                <w:sz w:val="19"/>
+              </w:rPr>
+              <w:t xml:space="preserve"> và xu</w:t>
+            </w:r>
+            <w:r>
+              <w:rPr>
+                <w:rFonts w:ascii="Times New Roman" w:hAnsi="Times New Roman"/>
+                <w:color w:val="1F2937"/>
+                <w:sz w:val="19"/>
+              </w:rPr>
+              <w:t>ấ</w:t>
+            </w:r>
+            <w:r>
+              <w:rPr>
+                <w:rFonts w:ascii="Times New Roman" w:hAnsi="Times New Roman"/>
+                <w:color w:val="1F2937"/>
+                <w:sz w:val="19"/>
+              </w:rPr>
+              <w:t>t tài li</w:t>
+            </w:r>
+            <w:r>
+              <w:rPr>
+                <w:rFonts w:ascii="Times New Roman" w:hAnsi="Times New Roman"/>
+                <w:color w:val="1F2937"/>
+                <w:sz w:val="19"/>
+              </w:rPr>
+              <w:t>ệ</w:t>
+            </w:r>
+            <w:r>
+              <w:rPr>
+                <w:rFonts w:ascii="Times New Roman" w:hAnsi="Times New Roman"/>
+                <w:color w:val="1F2937"/>
+                <w:sz w:val="19"/>
+              </w:rPr>
+              <w:t>u báo cáo hoàn ch</w:t>
+            </w:r>
+            <w:r>
+              <w:rPr>
+                <w:rFonts w:ascii="Times New Roman" w:hAnsi="Times New Roman"/>
+                <w:color w:val="1F2937"/>
+                <w:sz w:val="19"/>
+              </w:rPr>
+              <w:t>ỉ</w:t>
+            </w:r>
+            <w:r>
+              <w:rPr>
+                <w:rFonts w:ascii="Times New Roman" w:hAnsi="Times New Roman"/>
+                <w:color w:val="1F2937"/>
+                <w:sz w:val="19"/>
+              </w:rPr>
+              <w:t>nh</w:t>
+            </w:r>
+          </w:p>
+        </w:tc>
+      </w:tr>
+      <w:tr>
+        <w:trPr>
+          <w:cantSplit/>
+          <w:jc w:val="center"/>
+        </w:trPr>
+        <w:tc>
+          <w:tcPr>
+            <w:tcW w:w="1417" w:type="dxa"/>
+            <w:shd w:val="clear" w:color="auto" w:fill="F8FAFC"/>
+            <w:tcMar>
+              <w:top w:w="70" w:type="dxa"/>
+              <w:left w:w="110" w:type="dxa"/>
+              <w:bottom w:w="70" w:type="dxa"/>
+              <w:right w:w="110" w:type="dxa"/>
+            </w:tcMar>
+            <w:vAlign w:val="center"/>
+          </w:tcPr>
+          <w:p>
+            <w:pPr>
+              <w:spacing w:before="20" w:after="40"/>
+            </w:pPr>
+            <w:r>
+              <w:rPr>
+                <w:rFonts w:ascii="Times New Roman" w:hAnsi="Times New Roman"/>
+                <w:color w:val="1F2937"/>
+                <w:sz w:val="19"/>
+              </w:rPr>
+              <w:t>38d8930</w:t>
+            </w:r>
+          </w:p>
+        </w:tc>
+        <w:tc>
+          <w:tcPr>
+            <w:tcW w:w="4535" w:type="dxa"/>
+            <w:shd w:val="clear" w:color="auto" w:fill="F8FAFC"/>
+            <w:tcMar>
+              <w:top w:w="70" w:type="dxa"/>
+              <w:left w:w="110" w:type="dxa"/>
+              <w:bottom w:w="70" w:type="dxa"/>
+              <w:right w:w="110" w:type="dxa"/>
+            </w:tcMar>
+            <w:vAlign w:val="center"/>
+          </w:tcPr>
+          <w:p>
+            <w:pPr>
+              <w:spacing w:before="20" w:after="40"/>
+            </w:pPr>
+            <w:r>
+              <w:rPr>
+                <w:rFonts w:ascii="Times New Roman" w:hAnsi="Times New Roman"/>
+                <w:color w:val="1F2937"/>
+                <w:sz w:val="19"/>
+              </w:rPr>
+              <w:t>fix: resolve healthcheck endpoint, update student profile and harden exporter passwords</w:t>
+            </w:r>
+          </w:p>
+        </w:tc>
+        <w:tc>
+          <w:tcPr>
+            <w:tcW w:w="3118" w:type="dxa"/>
+            <w:shd w:val="clear" w:color="auto" w:fill="F8FAFC"/>
+            <w:tcMar>
+              <w:top w:w="70" w:type="dxa"/>
+              <w:left w:w="110" w:type="dxa"/>
+              <w:bottom w:w="70" w:type="dxa"/>
+              <w:right w:w="110" w:type="dxa"/>
+            </w:tcMar>
+            <w:vAlign w:val="center"/>
+          </w:tcPr>
+          <w:p>
+            <w:pPr>
+              <w:spacing w:before="20" w:after="40"/>
+            </w:pPr>
+            <w:r>
+              <w:rPr>
+                <w:rFonts w:ascii="Times New Roman" w:hAnsi="Times New Roman"/>
+                <w:color w:val="1F2937"/>
+                <w:sz w:val="19"/>
+              </w:rPr>
+              <w:t>Kh</w:t>
+            </w:r>
+            <w:r>
+              <w:rPr>
+                <w:rFonts w:ascii="Times New Roman" w:hAnsi="Times New Roman"/>
+                <w:color w:val="1F2937"/>
+                <w:sz w:val="19"/>
+              </w:rPr>
+              <w:t>ắ</w:t>
+            </w:r>
+            <w:r>
+              <w:rPr>
+                <w:rFonts w:ascii="Times New Roman" w:hAnsi="Times New Roman"/>
+                <w:color w:val="1F2937"/>
+                <w:sz w:val="19"/>
+              </w:rPr>
+              <w:t>c ph</w:t>
+            </w:r>
+            <w:r>
+              <w:rPr>
+                <w:rFonts w:ascii="Times New Roman" w:hAnsi="Times New Roman"/>
+                <w:color w:val="1F2937"/>
+                <w:sz w:val="19"/>
+              </w:rPr>
+              <w:t>ụ</w:t>
+            </w:r>
+            <w:r>
+              <w:rPr>
+                <w:rFonts w:ascii="Times New Roman" w:hAnsi="Times New Roman"/>
+                <w:color w:val="1F2937"/>
+                <w:sz w:val="19"/>
+              </w:rPr>
+              <w:t>c: S</w:t>
+            </w:r>
+            <w:r>
+              <w:rPr>
+                <w:rFonts w:ascii="Times New Roman" w:hAnsi="Times New Roman"/>
+                <w:color w:val="1F2937"/>
+                <w:sz w:val="19"/>
+              </w:rPr>
+              <w:t>ử</w:t>
+            </w:r>
+            <w:r>
+              <w:rPr>
+                <w:rFonts w:ascii="Times New Roman" w:hAnsi="Times New Roman"/>
+                <w:color w:val="1F2937"/>
+                <w:sz w:val="19"/>
+              </w:rPr>
+              <w:t>a l</w:t>
+            </w:r>
+            <w:r>
+              <w:rPr>
+                <w:rFonts w:ascii="Times New Roman" w:hAnsi="Times New Roman"/>
+                <w:color w:val="1F2937"/>
+                <w:sz w:val="19"/>
+              </w:rPr>
+              <w:t>ỗ</w:t>
+            </w:r>
+            <w:r>
+              <w:rPr>
+                <w:rFonts w:ascii="Times New Roman" w:hAnsi="Times New Roman"/>
+                <w:color w:val="1F2937"/>
+                <w:sz w:val="19"/>
+              </w:rPr>
+              <w:t>i /health endpoint JSON, c</w:t>
+            </w:r>
+            <w:r>
+              <w:rPr>
+                <w:rFonts w:ascii="Times New Roman" w:hAnsi="Times New Roman"/>
+                <w:color w:val="1F2937"/>
+                <w:sz w:val="19"/>
+              </w:rPr>
+              <w:t>ậ</w:t>
+            </w:r>
+            <w:r>
+              <w:rPr>
+                <w:rFonts w:ascii="Times New Roman" w:hAnsi="Times New Roman"/>
+                <w:color w:val="1F2937"/>
+                <w:sz w:val="19"/>
+              </w:rPr>
+              <w:t>p nh</w:t>
+            </w:r>
+            <w:r>
+              <w:rPr>
+                <w:rFonts w:ascii="Times New Roman" w:hAnsi="Times New Roman"/>
+                <w:color w:val="1F2937"/>
+                <w:sz w:val="19"/>
+              </w:rPr>
+              <w:t>ậ</w:t>
+            </w:r>
+            <w:r>
+              <w:rPr>
+                <w:rFonts w:ascii="Times New Roman" w:hAnsi="Times New Roman"/>
+                <w:color w:val="1F2937"/>
+                <w:sz w:val="19"/>
+              </w:rPr>
+              <w:t>t thông tin SV và m</w:t>
+            </w:r>
+            <w:r>
+              <w:rPr>
+                <w:rFonts w:ascii="Times New Roman" w:hAnsi="Times New Roman"/>
+                <w:color w:val="1F2937"/>
+                <w:sz w:val="19"/>
+              </w:rPr>
+              <w:t>ậ</w:t>
+            </w:r>
+            <w:r>
+              <w:rPr>
+                <w:rFonts w:ascii="Times New Roman" w:hAnsi="Times New Roman"/>
+                <w:color w:val="1F2937"/>
+                <w:sz w:val="19"/>
+              </w:rPr>
+              <w:t>t kh</w:t>
+            </w:r>
+            <w:r>
+              <w:rPr>
+                <w:rFonts w:ascii="Times New Roman" w:hAnsi="Times New Roman"/>
+                <w:color w:val="1F2937"/>
+                <w:sz w:val="19"/>
+              </w:rPr>
+              <w:t>ẩ</w:t>
+            </w:r>
+            <w:r>
+              <w:rPr>
+                <w:rFonts w:ascii="Times New Roman" w:hAnsi="Times New Roman"/>
+                <w:color w:val="1F2937"/>
+                <w:sz w:val="19"/>
+              </w:rPr>
+              <w:t>u exporter</w:t>
+            </w:r>
+          </w:p>
+        </w:tc>
+      </w:tr>
+      <w:tr>
+        <w:trPr>
+          <w:cantSplit/>
+          <w:jc w:val="center"/>
+        </w:trPr>
+        <w:tc>
+          <w:tcPr>
+            <w:tcW w:w="1417" w:type="dxa"/>
+            <w:shd w:val="clear" w:color="auto" w:fill="FFFFFF"/>
+            <w:tcMar>
+              <w:top w:w="70" w:type="dxa"/>
+              <w:left w:w="110" w:type="dxa"/>
+              <w:bottom w:w="70" w:type="dxa"/>
+              <w:right w:w="110" w:type="dxa"/>
+            </w:tcMar>
+            <w:vAlign w:val="center"/>
+          </w:tcPr>
+          <w:p>
+            <w:pPr>
+              <w:spacing w:before="20" w:after="40"/>
+            </w:pPr>
+            <w:r>
+              <w:rPr>
+                <w:rFonts w:ascii="Times New Roman" w:hAnsi="Times New Roman"/>
+                <w:color w:val="1F2937"/>
+                <w:sz w:val="19"/>
+              </w:rPr>
+              <w:t>e99d7f6</w:t>
+            </w:r>
+          </w:p>
+        </w:tc>
+        <w:tc>
+          <w:tcPr>
+            <w:tcW w:w="4535" w:type="dxa"/>
+            <w:shd w:val="clear" w:color="auto" w:fill="FFFFFF"/>
+            <w:tcMar>
+              <w:top w:w="70" w:type="dxa"/>
+              <w:left w:w="110" w:type="dxa"/>
+              <w:bottom w:w="70" w:type="dxa"/>
+              <w:right w:w="110" w:type="dxa"/>
+            </w:tcMar>
+            <w:vAlign w:val="center"/>
+          </w:tcPr>
+          <w:p>
+            <w:pPr>
+              <w:spacing w:before="20" w:after="40"/>
+            </w:pPr>
+            <w:r>
+              <w:rPr>
+                <w:rFonts w:ascii="Times New Roman" w:hAnsi="Times New Roman"/>
+                <w:color w:val="1F2937"/>
+                <w:sz w:val="19"/>
+              </w:rPr>
+              <w:t>docs: update repository name and title to Vu Ba Hung DTC245180186 Website Portfolio</w:t>
+            </w:r>
+          </w:p>
+        </w:tc>
+        <w:tc>
+          <w:tcPr>
+            <w:tcW w:w="3118" w:type="dxa"/>
+            <w:shd w:val="clear" w:color="auto" w:fill="FFFFFF"/>
+            <w:tcMar>
+              <w:top w:w="70" w:type="dxa"/>
+              <w:left w:w="110" w:type="dxa"/>
+              <w:bottom w:w="70" w:type="dxa"/>
+              <w:right w:w="110" w:type="dxa"/>
+            </w:tcMar>
+            <w:vAlign w:val="center"/>
+          </w:tcPr>
+          <w:p>
+            <w:pPr>
+              <w:spacing w:before="20" w:after="40"/>
+            </w:pPr>
+            <w:r>
+              <w:rPr>
+                <w:rFonts w:ascii="Times New Roman" w:hAnsi="Times New Roman"/>
+                <w:color w:val="1F2937"/>
+                <w:sz w:val="19"/>
+              </w:rPr>
+              <w:t>Đ</w:t>
+            </w:r>
+            <w:r>
+              <w:rPr>
+                <w:rFonts w:ascii="Times New Roman" w:hAnsi="Times New Roman"/>
+                <w:color w:val="1F2937"/>
+                <w:sz w:val="19"/>
+              </w:rPr>
+              <w:t>ồ</w:t>
+            </w:r>
+            <w:r>
+              <w:rPr>
+                <w:rFonts w:ascii="Times New Roman" w:hAnsi="Times New Roman"/>
+                <w:color w:val="1F2937"/>
+                <w:sz w:val="19"/>
+              </w:rPr>
+              <w:t>ng b</w:t>
+            </w:r>
+            <w:r>
+              <w:rPr>
+                <w:rFonts w:ascii="Times New Roman" w:hAnsi="Times New Roman"/>
+                <w:color w:val="1F2937"/>
+                <w:sz w:val="19"/>
+              </w:rPr>
+              <w:t>ộ</w:t>
+            </w:r>
+            <w:r>
+              <w:rPr>
+                <w:rFonts w:ascii="Times New Roman" w:hAnsi="Times New Roman"/>
+                <w:color w:val="1F2937"/>
+                <w:sz w:val="19"/>
+              </w:rPr>
+              <w:t>: Đ</w:t>
+            </w:r>
+            <w:r>
+              <w:rPr>
+                <w:rFonts w:ascii="Times New Roman" w:hAnsi="Times New Roman"/>
+                <w:color w:val="1F2937"/>
+                <w:sz w:val="19"/>
+              </w:rPr>
+              <w:t>ổ</w:t>
+            </w:r>
+            <w:r>
+              <w:rPr>
+                <w:rFonts w:ascii="Times New Roman" w:hAnsi="Times New Roman"/>
+                <w:color w:val="1F2937"/>
+                <w:sz w:val="19"/>
+              </w:rPr>
+              <w:t>i tên và liên k</w:t>
+            </w:r>
+            <w:r>
+              <w:rPr>
+                <w:rFonts w:ascii="Times New Roman" w:hAnsi="Times New Roman"/>
+                <w:color w:val="1F2937"/>
+                <w:sz w:val="19"/>
+              </w:rPr>
+              <w:t>ế</w:t>
+            </w:r>
+            <w:r>
+              <w:rPr>
+                <w:rFonts w:ascii="Times New Roman" w:hAnsi="Times New Roman"/>
+                <w:color w:val="1F2937"/>
+                <w:sz w:val="19"/>
+              </w:rPr>
+              <w:t>t repository GitHub chính th</w:t>
+            </w:r>
+            <w:r>
+              <w:rPr>
+                <w:rFonts w:ascii="Times New Roman" w:hAnsi="Times New Roman"/>
+                <w:color w:val="1F2937"/>
+                <w:sz w:val="19"/>
+              </w:rPr>
+              <w:t>ứ</w:t>
+            </w:r>
+            <w:r>
+              <w:rPr>
+                <w:rFonts w:ascii="Times New Roman" w:hAnsi="Times New Roman"/>
+                <w:color w:val="1F2937"/>
+                <w:sz w:val="19"/>
+              </w:rPr>
+              <w:t>c theo MSSV</w:t>
+            </w:r>
+          </w:p>
+        </w:tc>
+      </w:tr>
     </w:tbl>
     <w:p>
       <w:pPr>
@@ -19364,7 +19847,7 @@
           <w:color w:val="2B6CB0"/>
           <w:sz w:val="26"/>
         </w:rPr>
-        <w:t>ng Thái Remote &amp; Hư</w:t>
+        <w:t>ng Thái Remote &amp; Liên K</w:t>
       </w:r>
       <w:r>
         <w:rPr>
@@ -19373,7 +19856,7 @@
           <w:color w:val="2B6CB0"/>
           <w:sz w:val="26"/>
         </w:rPr>
-        <w:t>ớ</w:t>
+        <w:t>ế</w:t>
       </w:r>
       <w:r>
         <w:rPr>
@@ -19382,7 +19865,7 @@
           <w:color w:val="2B6CB0"/>
           <w:sz w:val="26"/>
         </w:rPr>
-        <w:t>ng D</w:t>
+        <w:t>t GitHub Chính Th</w:t>
       </w:r>
       <w:r>
         <w:rPr>
@@ -19391,7 +19874,7 @@
           <w:color w:val="2B6CB0"/>
           <w:sz w:val="26"/>
         </w:rPr>
-        <w:t>ẫ</w:t>
+        <w:t>ứ</w:t>
       </w:r>
       <w:r>
         <w:rPr>
@@ -19400,7 +19883,7 @@
           <w:color w:val="2B6CB0"/>
           <w:sz w:val="26"/>
         </w:rPr>
-        <w:t>n Push Lên GitHub</w:t>
+        <w:t>c</w:t>
       </w:r>
     </w:p>
     <w:p>
@@ -19415,55 +19898,7 @@
           <w:color w:val="1F2937"/>
           <w:sz w:val="24"/>
         </w:rPr>
-        <w:t>Hi</w:t>
-      </w:r>
-      <w:r>
-        <w:rPr>
-          <w:rFonts w:ascii="Times New Roman" w:hAnsi="Times New Roman"/>
-          <w:color w:val="1F2937"/>
-          <w:sz w:val="24"/>
-        </w:rPr>
-        <w:t>ệ</w:t>
-      </w:r>
-      <w:r>
-        <w:rPr>
-          <w:rFonts w:ascii="Times New Roman" w:hAnsi="Times New Roman"/>
-          <w:color w:val="1F2937"/>
-          <w:sz w:val="24"/>
-        </w:rPr>
-        <w:t>n tr</w:t>
-      </w:r>
-      <w:r>
-        <w:rPr>
-          <w:rFonts w:ascii="Times New Roman" w:hAnsi="Times New Roman"/>
-          <w:color w:val="1F2937"/>
-          <w:sz w:val="24"/>
-        </w:rPr>
-        <w:t>ạ</w:t>
-      </w:r>
-      <w:r>
-        <w:rPr>
-          <w:rFonts w:ascii="Times New Roman" w:hAnsi="Times New Roman"/>
-          <w:color w:val="1F2937"/>
-          <w:sz w:val="24"/>
-        </w:rPr>
-        <w:t>ng repository c</w:t>
-      </w:r>
-      <w:r>
-        <w:rPr>
-          <w:rFonts w:ascii="Times New Roman" w:hAnsi="Times New Roman"/>
-          <w:color w:val="1F2937"/>
-          <w:sz w:val="24"/>
-        </w:rPr>
-        <w:t>ụ</w:t>
-      </w:r>
-      <w:r>
-        <w:rPr>
-          <w:rFonts w:ascii="Times New Roman" w:hAnsi="Times New Roman"/>
-          <w:color w:val="1F2937"/>
-          <w:sz w:val="24"/>
-        </w:rPr>
-        <w:t>c b</w:t>
+        <w:t>Toàn b</w:t>
       </w:r>
       <w:r>
         <w:rPr>
@@ -19479,7 +19914,39 @@
           <w:color w:val="1F2937"/>
           <w:sz w:val="24"/>
         </w:rPr>
-        <w:t xml:space="preserve"> đã đư</w:t>
+        <w:t xml:space="preserve"> mã ngu</w:t>
+      </w:r>
+      <w:r>
+        <w:rPr>
+          <w:rFonts w:ascii="Times New Roman" w:hAnsi="Times New Roman"/>
+          <w:color w:val="1F2937"/>
+          <w:sz w:val="24"/>
+        </w:rPr>
+        <w:t>ồ</w:t>
+      </w:r>
+      <w:r>
+        <w:rPr>
+          <w:rFonts w:ascii="Times New Roman" w:hAnsi="Times New Roman"/>
+          <w:color w:val="1F2937"/>
+          <w:sz w:val="24"/>
+        </w:rPr>
+        <w:t>n d</w:t>
+      </w:r>
+      <w:r>
+        <w:rPr>
+          <w:rFonts w:ascii="Times New Roman" w:hAnsi="Times New Roman"/>
+          <w:color w:val="1F2937"/>
+          <w:sz w:val="24"/>
+        </w:rPr>
+        <w:t>ự</w:t>
+      </w:r>
+      <w:r>
+        <w:rPr>
+          <w:rFonts w:ascii="Times New Roman" w:hAnsi="Times New Roman"/>
+          <w:color w:val="1F2937"/>
+          <w:sz w:val="24"/>
+        </w:rPr>
+        <w:t xml:space="preserve"> án đã đư</w:t>
       </w:r>
       <w:r>
         <w:rPr>
@@ -19495,23 +19962,39 @@
           <w:color w:val="1F2937"/>
           <w:sz w:val="24"/>
         </w:rPr>
-        <w:t>c commit đ</w:t>
-      </w:r>
-      <w:r>
-        <w:rPr>
-          <w:rFonts w:ascii="Times New Roman" w:hAnsi="Times New Roman"/>
-          <w:color w:val="1F2937"/>
-          <w:sz w:val="24"/>
-        </w:rPr>
-        <w:t>ầ</w:t>
-      </w:r>
-      <w:r>
-        <w:rPr>
-          <w:rFonts w:ascii="Times New Roman" w:hAnsi="Times New Roman"/>
-          <w:color w:val="1F2937"/>
-          <w:sz w:val="24"/>
-        </w:rPr>
-        <w:t>y đ</w:t>
+        <w:t>c đ</w:t>
+      </w:r>
+      <w:r>
+        <w:rPr>
+          <w:rFonts w:ascii="Times New Roman" w:hAnsi="Times New Roman"/>
+          <w:color w:val="1F2937"/>
+          <w:sz w:val="24"/>
+        </w:rPr>
+        <w:t>ẩ</w:t>
+      </w:r>
+      <w:r>
+        <w:rPr>
+          <w:rFonts w:ascii="Times New Roman" w:hAnsi="Times New Roman"/>
+          <w:color w:val="1F2937"/>
+          <w:sz w:val="24"/>
+        </w:rPr>
+        <w:t>y lên repository chính th</w:t>
+      </w:r>
+      <w:r>
+        <w:rPr>
+          <w:rFonts w:ascii="Times New Roman" w:hAnsi="Times New Roman"/>
+          <w:color w:val="1F2937"/>
+          <w:sz w:val="24"/>
+        </w:rPr>
+        <w:t>ứ</w:t>
+      </w:r>
+      <w:r>
+        <w:rPr>
+          <w:rFonts w:ascii="Times New Roman" w:hAnsi="Times New Roman"/>
+          <w:color w:val="1F2937"/>
+          <w:sz w:val="24"/>
+        </w:rPr>
+        <w:t>c trên GitHub c</w:t>
       </w:r>
       <w:r>
         <w:rPr>
@@ -19527,151 +20010,7 @@
           <w:color w:val="1F2937"/>
           <w:sz w:val="24"/>
         </w:rPr>
-        <w:t>. C</w:t>
-      </w:r>
-      <w:r>
-        <w:rPr>
-          <w:rFonts w:ascii="Times New Roman" w:hAnsi="Times New Roman"/>
-          <w:color w:val="1F2937"/>
-          <w:sz w:val="24"/>
-        </w:rPr>
-        <w:t>ấ</w:t>
-      </w:r>
-      <w:r>
-        <w:rPr>
-          <w:rFonts w:ascii="Times New Roman" w:hAnsi="Times New Roman"/>
-          <w:color w:val="1F2937"/>
-          <w:sz w:val="24"/>
-        </w:rPr>
-        <w:t>u hình git remote -v hi</w:t>
-      </w:r>
-      <w:r>
-        <w:rPr>
-          <w:rFonts w:ascii="Times New Roman" w:hAnsi="Times New Roman"/>
-          <w:color w:val="1F2937"/>
-          <w:sz w:val="24"/>
-        </w:rPr>
-        <w:t>ệ</w:t>
-      </w:r>
-      <w:r>
-        <w:rPr>
-          <w:rFonts w:ascii="Times New Roman" w:hAnsi="Times New Roman"/>
-          <w:color w:val="1F2937"/>
-          <w:sz w:val="24"/>
-        </w:rPr>
-        <w:t>n t</w:t>
-      </w:r>
-      <w:r>
-        <w:rPr>
-          <w:rFonts w:ascii="Times New Roman" w:hAnsi="Times New Roman"/>
-          <w:color w:val="1F2937"/>
-          <w:sz w:val="24"/>
-        </w:rPr>
-        <w:t>ạ</w:t>
-      </w:r>
-      <w:r>
-        <w:rPr>
-          <w:rFonts w:ascii="Times New Roman" w:hAnsi="Times New Roman"/>
-          <w:color w:val="1F2937"/>
-          <w:sz w:val="24"/>
-        </w:rPr>
-        <w:t>i chưa đư</w:t>
-      </w:r>
-      <w:r>
-        <w:rPr>
-          <w:rFonts w:ascii="Times New Roman" w:hAnsi="Times New Roman"/>
-          <w:color w:val="1F2937"/>
-          <w:sz w:val="24"/>
-        </w:rPr>
-        <w:t>ợ</w:t>
-      </w:r>
-      <w:r>
-        <w:rPr>
-          <w:rFonts w:ascii="Times New Roman" w:hAnsi="Times New Roman"/>
-          <w:color w:val="1F2937"/>
-          <w:sz w:val="24"/>
-        </w:rPr>
-        <w:t>c gán do c</w:t>
-      </w:r>
-      <w:r>
-        <w:rPr>
-          <w:rFonts w:ascii="Times New Roman" w:hAnsi="Times New Roman"/>
-          <w:color w:val="1F2937"/>
-          <w:sz w:val="24"/>
-        </w:rPr>
-        <w:t>ầ</w:t>
-      </w:r>
-      <w:r>
-        <w:rPr>
-          <w:rFonts w:ascii="Times New Roman" w:hAnsi="Times New Roman"/>
-          <w:color w:val="1F2937"/>
-          <w:sz w:val="24"/>
-        </w:rPr>
-        <w:t>n sinh viên t</w:t>
-      </w:r>
-      <w:r>
-        <w:rPr>
-          <w:rFonts w:ascii="Times New Roman" w:hAnsi="Times New Roman"/>
-          <w:color w:val="1F2937"/>
-          <w:sz w:val="24"/>
-        </w:rPr>
-        <w:t>ạ</w:t>
-      </w:r>
-      <w:r>
-        <w:rPr>
-          <w:rFonts w:ascii="Times New Roman" w:hAnsi="Times New Roman"/>
-          <w:color w:val="1F2937"/>
-          <w:sz w:val="24"/>
-        </w:rPr>
-        <w:t>o repository trên tài kho</w:t>
-      </w:r>
-      <w:r>
-        <w:rPr>
-          <w:rFonts w:ascii="Times New Roman" w:hAnsi="Times New Roman"/>
-          <w:color w:val="1F2937"/>
-          <w:sz w:val="24"/>
-        </w:rPr>
-        <w:t>ả</w:t>
-      </w:r>
-      <w:r>
-        <w:rPr>
-          <w:rFonts w:ascii="Times New Roman" w:hAnsi="Times New Roman"/>
-          <w:color w:val="1F2937"/>
-          <w:sz w:val="24"/>
-        </w:rPr>
-        <w:t>n GitHub cá nhân (theo quy đ</w:t>
-      </w:r>
-      <w:r>
-        <w:rPr>
-          <w:rFonts w:ascii="Times New Roman" w:hAnsi="Times New Roman"/>
-          <w:color w:val="1F2937"/>
-          <w:sz w:val="24"/>
-        </w:rPr>
-        <w:t>ị</w:t>
-      </w:r>
-      <w:r>
-        <w:rPr>
-          <w:rFonts w:ascii="Times New Roman" w:hAnsi="Times New Roman"/>
-          <w:color w:val="1F2937"/>
-          <w:sz w:val="24"/>
-        </w:rPr>
-        <w:t>nh đ</w:t>
-      </w:r>
-      <w:r>
-        <w:rPr>
-          <w:rFonts w:ascii="Times New Roman" w:hAnsi="Times New Roman"/>
-          <w:color w:val="1F2937"/>
-          <w:sz w:val="24"/>
-        </w:rPr>
-        <w:t>ặ</w:t>
-      </w:r>
-      <w:r>
-        <w:rPr>
-          <w:rFonts w:ascii="Times New Roman" w:hAnsi="Times New Roman"/>
-          <w:color w:val="1F2937"/>
-          <w:sz w:val="24"/>
-        </w:rPr>
-        <w:t>t tên repo theo MSSV).</w:t>
+        <w:t>a sinh viên Vũ Bá Hùng:</w:t>
       </w:r>
     </w:p>
     <w:p>
@@ -19686,149 +20025,51 @@
           <w:color w:val="1F2937"/>
           <w:sz w:val="23"/>
         </w:rPr>
-        <w:t>Hư</w:t>
-      </w:r>
-      <w:r>
-        <w:rPr>
-          <w:rFonts w:ascii="Times New Roman" w:hAnsi="Times New Roman"/>
-          <w:b/>
-          <w:color w:val="1F2937"/>
-          <w:sz w:val="23"/>
-        </w:rPr>
-        <w:t>ớ</w:t>
-      </w:r>
-      <w:r>
-        <w:rPr>
-          <w:rFonts w:ascii="Times New Roman" w:hAnsi="Times New Roman"/>
-          <w:b/>
-          <w:color w:val="1F2937"/>
-          <w:sz w:val="23"/>
-        </w:rPr>
-        <w:t>ng d</w:t>
-      </w:r>
-      <w:r>
-        <w:rPr>
-          <w:rFonts w:ascii="Times New Roman" w:hAnsi="Times New Roman"/>
-          <w:b/>
-          <w:color w:val="1F2937"/>
-          <w:sz w:val="23"/>
-        </w:rPr>
-        <w:t>ẫ</w:t>
-      </w:r>
-      <w:r>
-        <w:rPr>
-          <w:rFonts w:ascii="Times New Roman" w:hAnsi="Times New Roman"/>
-          <w:b/>
-          <w:color w:val="1F2937"/>
-          <w:sz w:val="23"/>
-        </w:rPr>
-        <w:t>n sinh viên đ</w:t>
-      </w:r>
-      <w:r>
-        <w:rPr>
-          <w:rFonts w:ascii="Times New Roman" w:hAnsi="Times New Roman"/>
-          <w:b/>
-          <w:color w:val="1F2937"/>
-          <w:sz w:val="23"/>
-        </w:rPr>
-        <w:t>ẩ</w:t>
-      </w:r>
-      <w:r>
-        <w:rPr>
-          <w:rFonts w:ascii="Times New Roman" w:hAnsi="Times New Roman"/>
-          <w:b/>
-          <w:color w:val="1F2937"/>
-          <w:sz w:val="23"/>
-        </w:rPr>
-        <w:t>y code:</w:t>
-      </w:r>
-      <w:r>
-        <w:rPr>
-          <w:rFonts w:ascii="Times New Roman" w:hAnsi="Times New Roman"/>
-          <w:color w:val="1F2937"/>
-          <w:sz w:val="23"/>
-        </w:rPr>
-        <w:t>Bư</w:t>
-      </w:r>
-      <w:r>
-        <w:rPr>
-          <w:rFonts w:ascii="Times New Roman" w:hAnsi="Times New Roman"/>
-          <w:color w:val="1F2937"/>
-          <w:sz w:val="23"/>
-        </w:rPr>
-        <w:t>ớ</w:t>
-      </w:r>
-      <w:r>
-        <w:rPr>
-          <w:rFonts w:ascii="Times New Roman" w:hAnsi="Times New Roman"/>
-          <w:color w:val="1F2937"/>
-          <w:sz w:val="23"/>
-        </w:rPr>
-        <w:t>c 1: T</w:t>
-      </w:r>
-      <w:r>
-        <w:rPr>
-          <w:rFonts w:ascii="Times New Roman" w:hAnsi="Times New Roman"/>
-          <w:color w:val="1F2937"/>
-          <w:sz w:val="23"/>
-        </w:rPr>
-        <w:t>ạ</w:t>
-      </w:r>
-      <w:r>
-        <w:rPr>
-          <w:rFonts w:ascii="Times New Roman" w:hAnsi="Times New Roman"/>
-          <w:color w:val="1F2937"/>
-          <w:sz w:val="23"/>
-        </w:rPr>
-        <w:t>o m</w:t>
-      </w:r>
-      <w:r>
-        <w:rPr>
-          <w:rFonts w:ascii="Times New Roman" w:hAnsi="Times New Roman"/>
-          <w:color w:val="1F2937"/>
-          <w:sz w:val="23"/>
-        </w:rPr>
-        <w:t>ộ</w:t>
-      </w:r>
-      <w:r>
-        <w:rPr>
-          <w:rFonts w:ascii="Times New Roman" w:hAnsi="Times New Roman"/>
-          <w:color w:val="1F2937"/>
-          <w:sz w:val="23"/>
-        </w:rPr>
-        <w:t>t repository r</w:t>
-      </w:r>
-      <w:r>
-        <w:rPr>
-          <w:rFonts w:ascii="Times New Roman" w:hAnsi="Times New Roman"/>
-          <w:color w:val="1F2937"/>
-          <w:sz w:val="23"/>
-        </w:rPr>
-        <w:t>ỗ</w:t>
-      </w:r>
-      <w:r>
-        <w:rPr>
-          <w:rFonts w:ascii="Times New Roman" w:hAnsi="Times New Roman"/>
-          <w:color w:val="1F2937"/>
-          <w:sz w:val="23"/>
-        </w:rPr>
-        <w:t>ng trên GitHub cá nhân (Ví d</w:t>
-      </w:r>
-      <w:r>
-        <w:rPr>
-          <w:rFonts w:ascii="Times New Roman" w:hAnsi="Times New Roman"/>
-          <w:color w:val="1F2937"/>
-          <w:sz w:val="23"/>
-        </w:rPr>
-        <w:t>ụ</w:t>
-      </w:r>
-      <w:r>
-        <w:rPr>
-          <w:rFonts w:ascii="Times New Roman" w:hAnsi="Times New Roman"/>
-          <w:color w:val="1F2937"/>
-          <w:sz w:val="23"/>
-        </w:rPr>
-        <w:t>: https://github.com/[MSSV]/portfolio-de13).</w:t>
+        <w:t>1. Đ</w:t>
+      </w:r>
+      <w:r>
+        <w:rPr>
+          <w:rFonts w:ascii="Times New Roman" w:hAnsi="Times New Roman"/>
+          <w:b/>
+          <w:color w:val="1F2937"/>
+          <w:sz w:val="23"/>
+        </w:rPr>
+        <w:t>ị</w:t>
+      </w:r>
+      <w:r>
+        <w:rPr>
+          <w:rFonts w:ascii="Times New Roman" w:hAnsi="Times New Roman"/>
+          <w:b/>
+          <w:color w:val="1F2937"/>
+          <w:sz w:val="23"/>
+        </w:rPr>
+        <w:t>a ch</w:t>
+      </w:r>
+      <w:r>
+        <w:rPr>
+          <w:rFonts w:ascii="Times New Roman" w:hAnsi="Times New Roman"/>
+          <w:b/>
+          <w:color w:val="1F2937"/>
+          <w:sz w:val="23"/>
+        </w:rPr>
+        <w:t>ỉ</w:t>
+      </w:r>
+      <w:r>
+        <w:rPr>
+          <w:rFonts w:ascii="Times New Roman" w:hAnsi="Times New Roman"/>
+          <w:b/>
+          <w:color w:val="1F2937"/>
+          <w:sz w:val="23"/>
+        </w:rPr>
+        <w:t xml:space="preserve"> Repository:</w:t>
+      </w:r>
+      <w:r>
+        <w:rPr>
+          <w:rFonts w:ascii="Times New Roman" w:hAnsi="Times New Roman"/>
+          <w:color w:val="1F2937"/>
+          <w:sz w:val="23"/>
+        </w:rPr>
+        <w:t>https://github.com/vubahung222/Vu-Ba-Hung-DTC245180186-Website-Portfolio</w:t>
       </w:r>
     </w:p>
     <w:p>
@@ -19843,48 +20084,167 @@
           <w:color w:val="1F2937"/>
           <w:sz w:val="23"/>
         </w:rPr>
-        <w:t>Hư</w:t>
-      </w:r>
-      <w:r>
-        <w:rPr>
-          <w:rFonts w:ascii="Times New Roman" w:hAnsi="Times New Roman"/>
-          <w:b/>
-          <w:color w:val="1F2937"/>
-          <w:sz w:val="23"/>
-        </w:rPr>
-        <w:t>ớ</w:t>
-      </w:r>
-      <w:r>
-        <w:rPr>
-          <w:rFonts w:ascii="Times New Roman" w:hAnsi="Times New Roman"/>
-          <w:b/>
-          <w:color w:val="1F2937"/>
-          <w:sz w:val="23"/>
-        </w:rPr>
-        <w:t>ng d</w:t>
-      </w:r>
-      <w:r>
-        <w:rPr>
-          <w:rFonts w:ascii="Times New Roman" w:hAnsi="Times New Roman"/>
-          <w:b/>
-          <w:color w:val="1F2937"/>
-          <w:sz w:val="23"/>
-        </w:rPr>
-        <w:t>ẫ</w:t>
-      </w:r>
-      <w:r>
-        <w:rPr>
-          <w:rFonts w:ascii="Times New Roman" w:hAnsi="Times New Roman"/>
-          <w:b/>
-          <w:color w:val="1F2937"/>
-          <w:sz w:val="23"/>
-        </w:rPr>
-        <w:t>n sinh viên đ</w:t>
-      </w:r>
-      <w:r>
-        <w:rPr>
-          <w:rFonts w:ascii="Times New Roman" w:hAnsi="Times New Roman"/>
-          <w:b/>
+        <w:t>2. Nhánh M</w:t>
+      </w:r>
+      <w:r>
+        <w:rPr>
+          <w:rFonts w:ascii="Times New Roman" w:hAnsi="Times New Roman"/>
+          <w:b/>
+          <w:color w:val="1F2937"/>
+          <w:sz w:val="23"/>
+        </w:rPr>
+        <w:t>ặ</w:t>
+      </w:r>
+      <w:r>
+        <w:rPr>
+          <w:rFonts w:ascii="Times New Roman" w:hAnsi="Times New Roman"/>
+          <w:b/>
+          <w:color w:val="1F2937"/>
+          <w:sz w:val="23"/>
+        </w:rPr>
+        <w:t>c Đ</w:t>
+      </w:r>
+      <w:r>
+        <w:rPr>
+          <w:rFonts w:ascii="Times New Roman" w:hAnsi="Times New Roman"/>
+          <w:b/>
+          <w:color w:val="1F2937"/>
+          <w:sz w:val="23"/>
+        </w:rPr>
+        <w:t>ị</w:t>
+      </w:r>
+      <w:r>
+        <w:rPr>
+          <w:rFonts w:ascii="Times New Roman" w:hAnsi="Times New Roman"/>
+          <w:b/>
+          <w:color w:val="1F2937"/>
+          <w:sz w:val="23"/>
+        </w:rPr>
+        <w:t>nh:</w:t>
+      </w:r>
+      <w:r>
+        <w:rPr>
+          <w:rFonts w:ascii="Times New Roman" w:hAnsi="Times New Roman"/>
+          <w:color w:val="1F2937"/>
+          <w:sz w:val="23"/>
+        </w:rPr>
+        <w:t>main (Ch</w:t>
+      </w:r>
+      <w:r>
+        <w:rPr>
+          <w:rFonts w:ascii="Times New Roman" w:hAnsi="Times New Roman"/>
+          <w:color w:val="1F2937"/>
+          <w:sz w:val="23"/>
+        </w:rPr>
+        <w:t>ế</w:t>
+      </w:r>
+      <w:r>
+        <w:rPr>
+          <w:rFonts w:ascii="Times New Roman" w:hAnsi="Times New Roman"/>
+          <w:color w:val="1F2937"/>
+          <w:sz w:val="23"/>
+        </w:rPr>
+        <w:t xml:space="preserve"> đ</w:t>
+      </w:r>
+      <w:r>
+        <w:rPr>
+          <w:rFonts w:ascii="Times New Roman" w:hAnsi="Times New Roman"/>
+          <w:color w:val="1F2937"/>
+          <w:sz w:val="23"/>
+        </w:rPr>
+        <w:t>ộ</w:t>
+      </w:r>
+      <w:r>
+        <w:rPr>
+          <w:rFonts w:ascii="Times New Roman" w:hAnsi="Times New Roman"/>
+          <w:color w:val="1F2937"/>
+          <w:sz w:val="23"/>
+        </w:rPr>
+        <w:t xml:space="preserve"> Public, đã c</w:t>
+      </w:r>
+      <w:r>
+        <w:rPr>
+          <w:rFonts w:ascii="Times New Roman" w:hAnsi="Times New Roman"/>
+          <w:color w:val="1F2937"/>
+          <w:sz w:val="23"/>
+        </w:rPr>
+        <w:t>ấ</w:t>
+      </w:r>
+      <w:r>
+        <w:rPr>
+          <w:rFonts w:ascii="Times New Roman" w:hAnsi="Times New Roman"/>
+          <w:color w:val="1F2937"/>
+          <w:sz w:val="23"/>
+        </w:rPr>
+        <w:t>u hình b</w:t>
+      </w:r>
+      <w:r>
+        <w:rPr>
+          <w:rFonts w:ascii="Times New Roman" w:hAnsi="Times New Roman"/>
+          <w:color w:val="1F2937"/>
+          <w:sz w:val="23"/>
+        </w:rPr>
+        <w:t>ả</w:t>
+      </w:r>
+      <w:r>
+        <w:rPr>
+          <w:rFonts w:ascii="Times New Roman" w:hAnsi="Times New Roman"/>
+          <w:color w:val="1F2937"/>
+          <w:sz w:val="23"/>
+        </w:rPr>
+        <w:t>o v</w:t>
+      </w:r>
+      <w:r>
+        <w:rPr>
+          <w:rFonts w:ascii="Times New Roman" w:hAnsi="Times New Roman"/>
+          <w:color w:val="1F2937"/>
+          <w:sz w:val="23"/>
+        </w:rPr>
+        <w:t>ệ</w:t>
+      </w:r>
+      <w:r>
+        <w:rPr>
+          <w:rFonts w:ascii="Times New Roman" w:hAnsi="Times New Roman"/>
+          <w:color w:val="1F2937"/>
+          <w:sz w:val="23"/>
+        </w:rPr>
+        <w:t xml:space="preserve"> không lưu tr</w:t>
+      </w:r>
+      <w:r>
+        <w:rPr>
+          <w:rFonts w:ascii="Times New Roman" w:hAnsi="Times New Roman"/>
+          <w:color w:val="1F2937"/>
+          <w:sz w:val="23"/>
+        </w:rPr>
+        <w:t>ữ</w:t>
+      </w:r>
+      <w:r>
+        <w:rPr>
+          <w:rFonts w:ascii="Times New Roman" w:hAnsi="Times New Roman"/>
+          <w:color w:val="1F2937"/>
+          <w:sz w:val="23"/>
+        </w:rPr>
+        <w:t xml:space="preserve"> m</w:t>
+      </w:r>
+      <w:r>
+        <w:rPr>
+          <w:rFonts w:ascii="Times New Roman" w:hAnsi="Times New Roman"/>
+          <w:color w:val="1F2937"/>
+          <w:sz w:val="23"/>
+        </w:rPr>
+        <w:t>ậ</w:t>
+      </w:r>
+      <w:r>
+        <w:rPr>
+          <w:rFonts w:ascii="Times New Roman" w:hAnsi="Times New Roman"/>
+          <w:color w:val="1F2937"/>
+          <w:sz w:val="23"/>
+        </w:rPr>
+        <w:t>t kh</w:t>
+      </w:r>
+      <w:r>
+        <w:rPr>
+          <w:rFonts w:ascii="Times New Roman" w:hAnsi="Times New Roman"/>
           <w:color w:val="1F2937"/>
           <w:sz w:val="23"/>
         </w:rPr>
@@ -19893,83 +20253,10 @@
       <w:r>
         <w:rPr>
           <w:rFonts w:ascii="Times New Roman" w:hAnsi="Times New Roman"/>
-          <w:b/>
-          <w:color w:val="1F2937"/>
-          <w:sz w:val="23"/>
-        </w:rPr>
-        <w:t>y code:</w:t>
-      </w:r>
-      <w:r>
-        <w:rPr>
-          <w:rFonts w:ascii="Times New Roman" w:hAnsi="Times New Roman"/>
-          <w:color w:val="1F2937"/>
-          <w:sz w:val="23"/>
-        </w:rPr>
-        <w:t>Bư</w:t>
-      </w:r>
-      <w:r>
-        <w:rPr>
-          <w:rFonts w:ascii="Times New Roman" w:hAnsi="Times New Roman"/>
-          <w:color w:val="1F2937"/>
-          <w:sz w:val="23"/>
-        </w:rPr>
-        <w:t>ớ</w:t>
-      </w:r>
-      <w:r>
-        <w:rPr>
-          <w:rFonts w:ascii="Times New Roman" w:hAnsi="Times New Roman"/>
-          <w:color w:val="1F2937"/>
-          <w:sz w:val="23"/>
-        </w:rPr>
-        <w:t>c 2: Ch</w:t>
-      </w:r>
-      <w:r>
-        <w:rPr>
-          <w:rFonts w:ascii="Times New Roman" w:hAnsi="Times New Roman"/>
-          <w:color w:val="1F2937"/>
-          <w:sz w:val="23"/>
-        </w:rPr>
-        <w:t>ạ</w:t>
-      </w:r>
-      <w:r>
-        <w:rPr>
-          <w:rFonts w:ascii="Times New Roman" w:hAnsi="Times New Roman"/>
-          <w:color w:val="1F2937"/>
-          <w:sz w:val="23"/>
-        </w:rPr>
-        <w:t>y l</w:t>
-      </w:r>
-      <w:r>
-        <w:rPr>
-          <w:rFonts w:ascii="Times New Roman" w:hAnsi="Times New Roman"/>
-          <w:color w:val="1F2937"/>
-          <w:sz w:val="23"/>
-        </w:rPr>
-        <w:t>ệ</w:t>
-      </w:r>
-      <w:r>
-        <w:rPr>
-          <w:rFonts w:ascii="Times New Roman" w:hAnsi="Times New Roman"/>
-          <w:color w:val="1F2937"/>
-          <w:sz w:val="23"/>
-        </w:rPr>
-        <w:t>nh liên k</w:t>
-      </w:r>
-      <w:r>
-        <w:rPr>
-          <w:rFonts w:ascii="Times New Roman" w:hAnsi="Times New Roman"/>
-          <w:color w:val="1F2937"/>
-          <w:sz w:val="23"/>
-        </w:rPr>
-        <w:t>ế</w:t>
-      </w:r>
-      <w:r>
-        <w:rPr>
-          <w:rFonts w:ascii="Times New Roman" w:hAnsi="Times New Roman"/>
-          <w:color w:val="1F2937"/>
-          <w:sz w:val="23"/>
-        </w:rPr>
-        <w:t>t remote: git remote add origin https://github.com/[MSSV]/portfolio-de13.git</w:t>
+          <w:color w:val="1F2937"/>
+          <w:sz w:val="23"/>
+        </w:rPr>
+        <w:t>u .env và SSL key)</w:t>
       </w:r>
     </w:p>
     <w:p>
@@ -19984,48 +20271,55 @@
           <w:color w:val="1F2937"/>
           <w:sz w:val="23"/>
         </w:rPr>
-        <w:t>Hư</w:t>
-      </w:r>
-      <w:r>
-        <w:rPr>
-          <w:rFonts w:ascii="Times New Roman" w:hAnsi="Times New Roman"/>
-          <w:b/>
-          <w:color w:val="1F2937"/>
-          <w:sz w:val="23"/>
-        </w:rPr>
-        <w:t>ớ</w:t>
-      </w:r>
-      <w:r>
-        <w:rPr>
-          <w:rFonts w:ascii="Times New Roman" w:hAnsi="Times New Roman"/>
-          <w:b/>
-          <w:color w:val="1F2937"/>
-          <w:sz w:val="23"/>
-        </w:rPr>
-        <w:t>ng d</w:t>
-      </w:r>
-      <w:r>
-        <w:rPr>
-          <w:rFonts w:ascii="Times New Roman" w:hAnsi="Times New Roman"/>
-          <w:b/>
-          <w:color w:val="1F2937"/>
-          <w:sz w:val="23"/>
-        </w:rPr>
-        <w:t>ẫ</w:t>
-      </w:r>
-      <w:r>
-        <w:rPr>
-          <w:rFonts w:ascii="Times New Roman" w:hAnsi="Times New Roman"/>
-          <w:b/>
-          <w:color w:val="1F2937"/>
-          <w:sz w:val="23"/>
-        </w:rPr>
-        <w:t>n sinh viên đ</w:t>
-      </w:r>
-      <w:r>
-        <w:rPr>
-          <w:rFonts w:ascii="Times New Roman" w:hAnsi="Times New Roman"/>
-          <w:b/>
+        <w:t>3. L</w:t>
+      </w:r>
+      <w:r>
+        <w:rPr>
+          <w:rFonts w:ascii="Times New Roman" w:hAnsi="Times New Roman"/>
+          <w:b/>
+          <w:color w:val="1F2937"/>
+          <w:sz w:val="23"/>
+        </w:rPr>
+        <w:t>ị</w:t>
+      </w:r>
+      <w:r>
+        <w:rPr>
+          <w:rFonts w:ascii="Times New Roman" w:hAnsi="Times New Roman"/>
+          <w:b/>
+          <w:color w:val="1F2937"/>
+          <w:sz w:val="23"/>
+        </w:rPr>
+        <w:t>ch S</w:t>
+      </w:r>
+      <w:r>
+        <w:rPr>
+          <w:rFonts w:ascii="Times New Roman" w:hAnsi="Times New Roman"/>
+          <w:b/>
+          <w:color w:val="1F2937"/>
+          <w:sz w:val="23"/>
+        </w:rPr>
+        <w:t>ử</w:t>
+      </w:r>
+      <w:r>
+        <w:rPr>
+          <w:rFonts w:ascii="Times New Roman" w:hAnsi="Times New Roman"/>
+          <w:b/>
+          <w:color w:val="1F2937"/>
+          <w:sz w:val="23"/>
+        </w:rPr>
+        <w:t xml:space="preserve"> Commit:</w:t>
+      </w:r>
+      <w:r>
+        <w:rPr>
+          <w:rFonts w:ascii="Times New Roman" w:hAnsi="Times New Roman"/>
+          <w:color w:val="1F2937"/>
+          <w:sz w:val="23"/>
+        </w:rPr>
+        <w:t>8 commits chu</w:t>
+      </w:r>
+      <w:r>
+        <w:rPr>
+          <w:rFonts w:ascii="Times New Roman" w:hAnsi="Times New Roman"/>
           <w:color w:val="1F2937"/>
           <w:sz w:val="23"/>
         </w:rPr>
@@ -20034,67 +20328,74 @@
       <w:r>
         <w:rPr>
           <w:rFonts w:ascii="Times New Roman" w:hAnsi="Times New Roman"/>
-          <w:b/>
-          <w:color w:val="1F2937"/>
-          <w:sz w:val="23"/>
-        </w:rPr>
-        <w:t>y code:</w:t>
-      </w:r>
-      <w:r>
-        <w:rPr>
-          <w:rFonts w:ascii="Times New Roman" w:hAnsi="Times New Roman"/>
-          <w:color w:val="1F2937"/>
-          <w:sz w:val="23"/>
-        </w:rPr>
-        <w:t>Bư</w:t>
-      </w:r>
-      <w:r>
-        <w:rPr>
-          <w:rFonts w:ascii="Times New Roman" w:hAnsi="Times New Roman"/>
-          <w:color w:val="1F2937"/>
-          <w:sz w:val="23"/>
-        </w:rPr>
-        <w:t>ớ</w:t>
-      </w:r>
-      <w:r>
-        <w:rPr>
-          <w:rFonts w:ascii="Times New Roman" w:hAnsi="Times New Roman"/>
-          <w:color w:val="1F2937"/>
-          <w:sz w:val="23"/>
-        </w:rPr>
-        <w:t>c 3: Đ</w:t>
-      </w:r>
-      <w:r>
-        <w:rPr>
-          <w:rFonts w:ascii="Times New Roman" w:hAnsi="Times New Roman"/>
-          <w:color w:val="1F2937"/>
-          <w:sz w:val="23"/>
-        </w:rPr>
-        <w:t>ẩ</w:t>
-      </w:r>
-      <w:r>
-        <w:rPr>
-          <w:rFonts w:ascii="Times New Roman" w:hAnsi="Times New Roman"/>
-          <w:color w:val="1F2937"/>
-          <w:sz w:val="23"/>
-        </w:rPr>
-        <w:t>y toàn b</w:t>
-      </w:r>
-      <w:r>
-        <w:rPr>
-          <w:rFonts w:ascii="Times New Roman" w:hAnsi="Times New Roman"/>
-          <w:color w:val="1F2937"/>
-          <w:sz w:val="23"/>
-        </w:rPr>
-        <w:t>ộ</w:t>
-      </w:r>
-      <w:r>
-        <w:rPr>
-          <w:rFonts w:ascii="Times New Roman" w:hAnsi="Times New Roman"/>
-          <w:color w:val="1F2937"/>
-          <w:sz w:val="23"/>
-        </w:rPr>
-        <w:t xml:space="preserve"> nhánh main lên GitHub: git push -u origin main</w:t>
+          <w:color w:val="1F2937"/>
+          <w:sz w:val="23"/>
+        </w:rPr>
+        <w:t>n Conventional Commits theo các m</w:t>
+      </w:r>
+      <w:r>
+        <w:rPr>
+          <w:rFonts w:ascii="Times New Roman" w:hAnsi="Times New Roman"/>
+          <w:color w:val="1F2937"/>
+          <w:sz w:val="23"/>
+        </w:rPr>
+        <w:t>ố</w:t>
+      </w:r>
+      <w:r>
+        <w:rPr>
+          <w:rFonts w:ascii="Times New Roman" w:hAnsi="Times New Roman"/>
+          <w:color w:val="1F2937"/>
+          <w:sz w:val="23"/>
+        </w:rPr>
+        <w:t>c k</w:t>
+      </w:r>
+      <w:r>
+        <w:rPr>
+          <w:rFonts w:ascii="Times New Roman" w:hAnsi="Times New Roman"/>
+          <w:color w:val="1F2937"/>
+          <w:sz w:val="23"/>
+        </w:rPr>
+        <w:t>ỹ</w:t>
+      </w:r>
+      <w:r>
+        <w:rPr>
+          <w:rFonts w:ascii="Times New Roman" w:hAnsi="Times New Roman"/>
+          <w:color w:val="1F2937"/>
+          <w:sz w:val="23"/>
+        </w:rPr>
+        <w:t xml:space="preserve"> thu</w:t>
+      </w:r>
+      <w:r>
+        <w:rPr>
+          <w:rFonts w:ascii="Times New Roman" w:hAnsi="Times New Roman"/>
+          <w:color w:val="1F2937"/>
+          <w:sz w:val="23"/>
+        </w:rPr>
+        <w:t>ậ</w:t>
+      </w:r>
+      <w:r>
+        <w:rPr>
+          <w:rFonts w:ascii="Times New Roman" w:hAnsi="Times New Roman"/>
+          <w:color w:val="1F2937"/>
+          <w:sz w:val="23"/>
+        </w:rPr>
+        <w:t>t phát tri</w:t>
+      </w:r>
+      <w:r>
+        <w:rPr>
+          <w:rFonts w:ascii="Times New Roman" w:hAnsi="Times New Roman"/>
+          <w:color w:val="1F2937"/>
+          <w:sz w:val="23"/>
+        </w:rPr>
+        <w:t>ể</w:t>
+      </w:r>
+      <w:r>
+        <w:rPr>
+          <w:rFonts w:ascii="Times New Roman" w:hAnsi="Times New Roman"/>
+          <w:color w:val="1F2937"/>
+          <w:sz w:val="23"/>
+        </w:rPr>
+        <w:t>n</w:t>
       </w:r>
     </w:p>
     <w:p>
@@ -22565,7 +22866,7 @@
                 <w:color w:val="1F2937"/>
                 <w:sz w:val="19"/>
               </w:rPr>
-              <w:t>git log --oneline &amp; git status</w:t>
+              <w:t>git log --oneline &amp; git remote -v</w:t>
             </w:r>
           </w:p>
         </w:tc>
@@ -22591,7 +22892,7 @@
                 <w:color w:val="1F2937"/>
                 <w:sz w:val="19"/>
               </w:rPr>
-              <w:t>5 commits chu</w:t>
+              <w:t>8 commits chu</w:t>
             </w:r>
             <w:r>
               <w:rPr>
@@ -22607,23 +22908,23 @@
                 <w:color w:val="1F2937"/>
                 <w:sz w:val="19"/>
               </w:rPr>
-              <w:t>n; .env không b</w:t>
-            </w:r>
-            <w:r>
-              <w:rPr>
-                <w:rFonts w:ascii="Times New Roman" w:hAnsi="Times New Roman"/>
-                <w:color w:val="1F2937"/>
-                <w:sz w:val="19"/>
-              </w:rPr>
-              <w:t>ị</w:t>
-            </w:r>
-            <w:r>
-              <w:rPr>
-                <w:rFonts w:ascii="Times New Roman" w:hAnsi="Times New Roman"/>
-                <w:color w:val="1F2937"/>
-                <w:sz w:val="19"/>
-              </w:rPr>
-              <w:t xml:space="preserve"> commit; working tree clean</w:t>
+              <w:t>n; đã push GitHub chính th</w:t>
+            </w:r>
+            <w:r>
+              <w:rPr>
+                <w:rFonts w:ascii="Times New Roman" w:hAnsi="Times New Roman"/>
+                <w:color w:val="1F2937"/>
+                <w:sz w:val="19"/>
+              </w:rPr>
+              <w:t>ứ</w:t>
+            </w:r>
+            <w:r>
+              <w:rPr>
+                <w:rFonts w:ascii="Times New Roman" w:hAnsi="Times New Roman"/>
+                <w:color w:val="1F2937"/>
+                <w:sz w:val="19"/>
+              </w:rPr>
+              <w:t>c; working tree clean</w:t>
             </w:r>
           </w:p>
         </w:tc>
@@ -22739,7 +23040,7 @@
                 <w:color w:val="1F2937"/>
                 <w:sz w:val="19"/>
               </w:rPr>
-              <w:t>t (*)</w:t>
+              <w:t>t</w:t>
             </w:r>
           </w:p>
         </w:tc>
@@ -22773,7 +23074,7 @@
           <w:color w:val="1F2937"/>
           <w:sz w:val="24"/>
         </w:rPr>
-        <w:t>ng thái Git: Đã ki</w:t>
+        <w:t>ng thái Git &amp; GitHub: Đã ki</w:t>
       </w:r>
       <w:r>
         <w:rPr>
@@ -22821,7 +23122,23 @@
           <w:color w:val="1F2937"/>
           <w:sz w:val="24"/>
         </w:rPr>
-        <w:t>t trên repository c</w:t>
+        <w:t>t 100% trên c</w:t>
+      </w:r>
+      <w:r>
+        <w:rPr>
+          <w:rFonts w:ascii="Times New Roman" w:hAnsi="Times New Roman"/>
+          <w:color w:val="1F2937"/>
+          <w:sz w:val="24"/>
+        </w:rPr>
+        <w:t>ả</w:t>
+      </w:r>
+      <w:r>
+        <w:rPr>
+          <w:rFonts w:ascii="Times New Roman" w:hAnsi="Times New Roman"/>
+          <w:color w:val="1F2937"/>
+          <w:sz w:val="24"/>
+        </w:rPr>
+        <w:t xml:space="preserve"> repository c</w:t>
       </w:r>
       <w:r>
         <w:rPr>
@@ -22853,39 +23170,7 @@
           <w:color w:val="1F2937"/>
           <w:sz w:val="24"/>
         </w:rPr>
-        <w:t>. Tr</w:t>
-      </w:r>
-      <w:r>
-        <w:rPr>
-          <w:rFonts w:ascii="Times New Roman" w:hAnsi="Times New Roman"/>
-          <w:color w:val="1F2937"/>
-          <w:sz w:val="24"/>
-        </w:rPr>
-        <w:t>ạ</w:t>
-      </w:r>
-      <w:r>
-        <w:rPr>
-          <w:rFonts w:ascii="Times New Roman" w:hAnsi="Times New Roman"/>
-          <w:color w:val="1F2937"/>
-          <w:sz w:val="24"/>
-        </w:rPr>
-        <w:t>ng thái Remote GitHub: Chưa ki</w:t>
-      </w:r>
-      <w:r>
-        <w:rPr>
-          <w:rFonts w:ascii="Times New Roman" w:hAnsi="Times New Roman"/>
-          <w:color w:val="1F2937"/>
-          <w:sz w:val="24"/>
-        </w:rPr>
-        <w:t>ể</w:t>
-      </w:r>
-      <w:r>
-        <w:rPr>
-          <w:rFonts w:ascii="Times New Roman" w:hAnsi="Times New Roman"/>
-          <w:color w:val="1F2937"/>
-          <w:sz w:val="24"/>
-        </w:rPr>
-        <w:t>m ch</w:t>
+        <w:t xml:space="preserve"> và GitHub remote chính th</w:t>
       </w:r>
       <w:r>
         <w:rPr>
@@ -22901,39 +23186,7 @@
           <w:color w:val="1F2937"/>
           <w:sz w:val="24"/>
         </w:rPr>
-        <w:t>ng (Đang ch</w:t>
-      </w:r>
-      <w:r>
-        <w:rPr>
-          <w:rFonts w:ascii="Times New Roman" w:hAnsi="Times New Roman"/>
-          <w:color w:val="1F2937"/>
-          <w:sz w:val="24"/>
-        </w:rPr>
-        <w:t>ờ</w:t>
-      </w:r>
-      <w:r>
-        <w:rPr>
-          <w:rFonts w:ascii="Times New Roman" w:hAnsi="Times New Roman"/>
-          <w:color w:val="1F2937"/>
-          <w:sz w:val="24"/>
-        </w:rPr>
-        <w:t xml:space="preserve"> sinh viên t</w:t>
-      </w:r>
-      <w:r>
-        <w:rPr>
-          <w:rFonts w:ascii="Times New Roman" w:hAnsi="Times New Roman"/>
-          <w:color w:val="1F2937"/>
-          <w:sz w:val="24"/>
-        </w:rPr>
-        <w:t>ạ</w:t>
-      </w:r>
-      <w:r>
-        <w:rPr>
-          <w:rFonts w:ascii="Times New Roman" w:hAnsi="Times New Roman"/>
-          <w:color w:val="1F2937"/>
-          <w:sz w:val="24"/>
-        </w:rPr>
-        <w:t>o repo và push).</w:t>
+        <w:t>c.</w:t>
       </w:r>
     </w:p>
     <w:p>
@@ -23817,39 +24070,23 @@
                 <w:color w:val="1F2937"/>
                 <w:sz w:val="19"/>
               </w:rPr>
-              <w:t>t + 2 commit s</w:t>
-            </w:r>
-            <w:r>
-              <w:rPr>
-                <w:rFonts w:ascii="Times New Roman" w:hAnsi="Times New Roman"/>
-                <w:color w:val="1F2937"/>
-                <w:sz w:val="19"/>
-              </w:rPr>
-              <w:t>ử</w:t>
-            </w:r>
-            <w:r>
-              <w:rPr>
-                <w:rFonts w:ascii="Times New Roman" w:hAnsi="Times New Roman"/>
-                <w:color w:val="1F2937"/>
-                <w:sz w:val="19"/>
-              </w:rPr>
-              <w:t>a l</w:t>
-            </w:r>
-            <w:r>
-              <w:rPr>
-                <w:rFonts w:ascii="Times New Roman" w:hAnsi="Times New Roman"/>
-                <w:color w:val="1F2937"/>
-                <w:sz w:val="19"/>
-              </w:rPr>
-              <w:t>ỗ</w:t>
-            </w:r>
-            <w:r>
-              <w:rPr>
-                <w:rFonts w:ascii="Times New Roman" w:hAnsi="Times New Roman"/>
-                <w:color w:val="1F2937"/>
-                <w:sz w:val="19"/>
-              </w:rPr>
-              <w:t>i; README chi ti</w:t>
+              <w:t>t + 5 commit hoàn thi</w:t>
+            </w:r>
+            <w:r>
+              <w:rPr>
+                <w:rFonts w:ascii="Times New Roman" w:hAnsi="Times New Roman"/>
+                <w:color w:val="1F2937"/>
+                <w:sz w:val="19"/>
+              </w:rPr>
+              <w:t>ệ</w:t>
+            </w:r>
+            <w:r>
+              <w:rPr>
+                <w:rFonts w:ascii="Times New Roman" w:hAnsi="Times New Roman"/>
+                <w:color w:val="1F2937"/>
+                <w:sz w:val="19"/>
+              </w:rPr>
+              <w:t>n; đã push GitHub; README chi ti</w:t>
             </w:r>
             <w:r>
               <w:rPr>
@@ -23972,7 +24209,7 @@
                 <w:color w:val="1F2937"/>
                 <w:sz w:val="19"/>
               </w:rPr>
-              <w:t>t (Repo local)</w:t>
+              <w:t>t</w:t>
             </w:r>
           </w:p>
         </w:tc>
@@ -26850,31 +27087,31 @@
       </w:rPr>
     </w:lvl>
   </w:abstractNum>
-  <w:num w:numId="1" w16cid:durableId="1301183318">
+  <w:num w:numId="1" w16cid:durableId="1599406419">
     <w:abstractNumId w:val="8"/>
   </w:num>
-  <w:num w:numId="2" w16cid:durableId="986056960">
+  <w:num w:numId="2" w16cid:durableId="1856387292">
     <w:abstractNumId w:val="6"/>
   </w:num>
-  <w:num w:numId="3" w16cid:durableId="2040858993">
+  <w:num w:numId="3" w16cid:durableId="245237451">
     <w:abstractNumId w:val="5"/>
   </w:num>
-  <w:num w:numId="4" w16cid:durableId="1139806557">
+  <w:num w:numId="4" w16cid:durableId="2039816111">
     <w:abstractNumId w:val="4"/>
   </w:num>
-  <w:num w:numId="5" w16cid:durableId="1788962513">
+  <w:num w:numId="5" w16cid:durableId="310252373">
     <w:abstractNumId w:val="7"/>
   </w:num>
-  <w:num w:numId="6" w16cid:durableId="908148527">
+  <w:num w:numId="6" w16cid:durableId="1393501730">
     <w:abstractNumId w:val="3"/>
   </w:num>
-  <w:num w:numId="7" w16cid:durableId="1380207392">
+  <w:num w:numId="7" w16cid:durableId="2050373046">
     <w:abstractNumId w:val="2"/>
   </w:num>
-  <w:num w:numId="8" w16cid:durableId="2132555269">
+  <w:num w:numId="8" w16cid:durableId="613366717">
     <w:abstractNumId w:val="1"/>
   </w:num>
-  <w:num w:numId="9" w16cid:durableId="2556572">
+  <w:num w:numId="9" w16cid:durableId="1265462296">
     <w:abstractNumId w:val="0"/>
   </w:num>
 </w:numbering>

</xml_diff>

<commit_message>
docs: sync 15-page official Word and PDF reports with latest verified test results
</commit_message>
<xml_diff>
--- a/BAO_CAO_DE_13.docx
+++ b/BAO_CAO_DE_13.docx
@@ -9772,7 +9772,7 @@
           <w:noProof/>
         </w:rPr>
         <w:drawing>
-          <wp:inline distT="0" distB="0" distL="0" distR="0" wp14:anchorId="5CB595FC" wp14:editId="3D47DBFC">
+          <wp:inline distT="0" distB="0" distL="0" distR="0" wp14:anchorId="5B20B0EA" wp14:editId="102FE544">
             <wp:extent cx="5400000" cy="2840309"/>
             <wp:effectExtent l="0" t="0" r="0" b="0"/>
             <wp:docPr id="1" name="Picture 1"/>
@@ -9906,7 +9906,7 @@
         </w:rPr>
         <w:lastRenderedPageBreak/>
         <w:drawing>
-          <wp:inline distT="0" distB="0" distL="0" distR="0" wp14:anchorId="08CF1A8F" wp14:editId="0C3A826B">
+          <wp:inline distT="0" distB="0" distL="0" distR="0" wp14:anchorId="187B1688" wp14:editId="451C150E">
             <wp:extent cx="4320000" cy="5015106"/>
             <wp:effectExtent l="0" t="0" r="0" b="0"/>
             <wp:docPr id="2" name="Picture 2"/>
@@ -10057,7 +10057,7 @@
           <w:noProof/>
         </w:rPr>
         <w:drawing>
-          <wp:inline distT="0" distB="0" distL="0" distR="0" wp14:anchorId="3BAA0BA1" wp14:editId="058CE147">
+          <wp:inline distT="0" distB="0" distL="0" distR="0" wp14:anchorId="61609605" wp14:editId="51683926">
             <wp:extent cx="2880000" cy="3807360"/>
             <wp:effectExtent l="0" t="0" r="0" b="0"/>
             <wp:docPr id="3" name="Picture 3"/>
@@ -10191,7 +10191,7 @@
           <w:noProof/>
         </w:rPr>
         <w:drawing>
-          <wp:inline distT="0" distB="0" distL="0" distR="0" wp14:anchorId="08AB26B4" wp14:editId="28F88CED">
+          <wp:inline distT="0" distB="0" distL="0" distR="0" wp14:anchorId="26653FE5" wp14:editId="15510CE9">
             <wp:extent cx="5400000" cy="2840309"/>
             <wp:effectExtent l="0" t="0" r="0" b="0"/>
             <wp:docPr id="4" name="Picture 4"/>
@@ -13253,7 +13253,7 @@
           <w:noProof/>
         </w:rPr>
         <w:drawing>
-          <wp:inline distT="0" distB="0" distL="0" distR="0" wp14:anchorId="62432927" wp14:editId="458E9AD4">
+          <wp:inline distT="0" distB="0" distL="0" distR="0" wp14:anchorId="6168FC84" wp14:editId="13AC44CC">
             <wp:extent cx="5400000" cy="2894318"/>
             <wp:effectExtent l="0" t="0" r="0" b="0"/>
             <wp:docPr id="5" name="Picture 5"/>
@@ -27087,31 +27087,31 @@
       </w:rPr>
     </w:lvl>
   </w:abstractNum>
-  <w:num w:numId="1" w16cid:durableId="1599406419">
+  <w:num w:numId="1" w16cid:durableId="2131587705">
     <w:abstractNumId w:val="8"/>
   </w:num>
-  <w:num w:numId="2" w16cid:durableId="1856387292">
+  <w:num w:numId="2" w16cid:durableId="1584796672">
     <w:abstractNumId w:val="6"/>
   </w:num>
-  <w:num w:numId="3" w16cid:durableId="245237451">
+  <w:num w:numId="3" w16cid:durableId="1646667284">
     <w:abstractNumId w:val="5"/>
   </w:num>
-  <w:num w:numId="4" w16cid:durableId="2039816111">
+  <w:num w:numId="4" w16cid:durableId="1529294084">
     <w:abstractNumId w:val="4"/>
   </w:num>
-  <w:num w:numId="5" w16cid:durableId="310252373">
+  <w:num w:numId="5" w16cid:durableId="1438988518">
     <w:abstractNumId w:val="7"/>
   </w:num>
-  <w:num w:numId="6" w16cid:durableId="1393501730">
+  <w:num w:numId="6" w16cid:durableId="1141003148">
     <w:abstractNumId w:val="3"/>
   </w:num>
-  <w:num w:numId="7" w16cid:durableId="2050373046">
+  <w:num w:numId="7" w16cid:durableId="30961045">
     <w:abstractNumId w:val="2"/>
   </w:num>
-  <w:num w:numId="8" w16cid:durableId="613366717">
+  <w:num w:numId="8" w16cid:durableId="897088252">
     <w:abstractNumId w:val="1"/>
   </w:num>
-  <w:num w:numId="9" w16cid:durableId="1265462296">
+  <w:num w:numId="9" w16cid:durableId="1520270803">
     <w:abstractNumId w:val="0"/>
   </w:num>
 </w:numbering>

</xml_diff>

<commit_message>
docs: sync 15-page official reports with latest UI refinements and commits
</commit_message>
<xml_diff>
--- a/BAO_CAO_DE_13.docx
+++ b/BAO_CAO_DE_13.docx
@@ -9772,7 +9772,7 @@
           <w:noProof/>
         </w:rPr>
         <w:drawing>
-          <wp:inline distT="0" distB="0" distL="0" distR="0" wp14:anchorId="5B20B0EA" wp14:editId="102FE544">
+          <wp:inline distT="0" distB="0" distL="0" distR="0" wp14:anchorId="4FD21AFB" wp14:editId="4A61F10A">
             <wp:extent cx="5400000" cy="2840309"/>
             <wp:effectExtent l="0" t="0" r="0" b="0"/>
             <wp:docPr id="1" name="Picture 1"/>
@@ -9906,7 +9906,7 @@
         </w:rPr>
         <w:lastRenderedPageBreak/>
         <w:drawing>
-          <wp:inline distT="0" distB="0" distL="0" distR="0" wp14:anchorId="187B1688" wp14:editId="451C150E">
+          <wp:inline distT="0" distB="0" distL="0" distR="0" wp14:anchorId="2A68EF04" wp14:editId="16A632E3">
             <wp:extent cx="4320000" cy="5015106"/>
             <wp:effectExtent l="0" t="0" r="0" b="0"/>
             <wp:docPr id="2" name="Picture 2"/>
@@ -10057,7 +10057,7 @@
           <w:noProof/>
         </w:rPr>
         <w:drawing>
-          <wp:inline distT="0" distB="0" distL="0" distR="0" wp14:anchorId="61609605" wp14:editId="51683926">
+          <wp:inline distT="0" distB="0" distL="0" distR="0" wp14:anchorId="00FAFE6B" wp14:editId="37FEFB14">
             <wp:extent cx="2880000" cy="3807360"/>
             <wp:effectExtent l="0" t="0" r="0" b="0"/>
             <wp:docPr id="3" name="Picture 3"/>
@@ -10191,7 +10191,7 @@
           <w:noProof/>
         </w:rPr>
         <w:drawing>
-          <wp:inline distT="0" distB="0" distL="0" distR="0" wp14:anchorId="26653FE5" wp14:editId="15510CE9">
+          <wp:inline distT="0" distB="0" distL="0" distR="0" wp14:anchorId="4BF30E8D" wp14:editId="468205D3">
             <wp:extent cx="5400000" cy="2840309"/>
             <wp:effectExtent l="0" t="0" r="0" b="0"/>
             <wp:docPr id="4" name="Picture 4"/>
@@ -13253,7 +13253,7 @@
           <w:noProof/>
         </w:rPr>
         <w:drawing>
-          <wp:inline distT="0" distB="0" distL="0" distR="0" wp14:anchorId="6168FC84" wp14:editId="13AC44CC">
+          <wp:inline distT="0" distB="0" distL="0" distR="0" wp14:anchorId="052637E3" wp14:editId="263AB6D7">
             <wp:extent cx="5400000" cy="2894318"/>
             <wp:effectExtent l="0" t="0" r="0" b="0"/>
             <wp:docPr id="5" name="Picture 5"/>
@@ -27087,31 +27087,31 @@
       </w:rPr>
     </w:lvl>
   </w:abstractNum>
-  <w:num w:numId="1" w16cid:durableId="2131587705">
+  <w:num w:numId="1" w16cid:durableId="1588073055">
     <w:abstractNumId w:val="8"/>
   </w:num>
-  <w:num w:numId="2" w16cid:durableId="1584796672">
+  <w:num w:numId="2" w16cid:durableId="1092162839">
     <w:abstractNumId w:val="6"/>
   </w:num>
-  <w:num w:numId="3" w16cid:durableId="1646667284">
+  <w:num w:numId="3" w16cid:durableId="2137141127">
     <w:abstractNumId w:val="5"/>
   </w:num>
-  <w:num w:numId="4" w16cid:durableId="1529294084">
+  <w:num w:numId="4" w16cid:durableId="1541625361">
     <w:abstractNumId w:val="4"/>
   </w:num>
-  <w:num w:numId="5" w16cid:durableId="1438988518">
+  <w:num w:numId="5" w16cid:durableId="329143790">
     <w:abstractNumId w:val="7"/>
   </w:num>
-  <w:num w:numId="6" w16cid:durableId="1141003148">
+  <w:num w:numId="6" w16cid:durableId="5057571">
     <w:abstractNumId w:val="3"/>
   </w:num>
-  <w:num w:numId="7" w16cid:durableId="30961045">
+  <w:num w:numId="7" w16cid:durableId="221798549">
     <w:abstractNumId w:val="2"/>
   </w:num>
-  <w:num w:numId="8" w16cid:durableId="897088252">
+  <w:num w:numId="8" w16cid:durableId="1183665398">
     <w:abstractNumId w:val="1"/>
   </w:num>
-  <w:num w:numId="9" w16cid:durableId="1520270803">
+  <w:num w:numId="9" w16cid:durableId="1195537309">
     <w:abstractNumId w:val="0"/>
   </w:num>
 </w:numbering>

</xml_diff>

<commit_message>
docs: update latest screenshots (clean Vietnamese, new admin dashboard) and re-export reports
</commit_message>
<xml_diff>
--- a/BAO_CAO_DE_13.docx
+++ b/BAO_CAO_DE_13.docx
@@ -9772,7 +9772,7 @@
           <w:noProof/>
         </w:rPr>
         <w:drawing>
-          <wp:inline distT="0" distB="0" distL="0" distR="0" wp14:anchorId="4FD21AFB" wp14:editId="4A61F10A">
+          <wp:inline distT="0" distB="0" distL="0" distR="0" wp14:anchorId="62DEADD3" wp14:editId="13BF66ED">
             <wp:extent cx="5400000" cy="2840309"/>
             <wp:effectExtent l="0" t="0" r="0" b="0"/>
             <wp:docPr id="1" name="Picture 1"/>
@@ -9906,7 +9906,7 @@
         </w:rPr>
         <w:lastRenderedPageBreak/>
         <w:drawing>
-          <wp:inline distT="0" distB="0" distL="0" distR="0" wp14:anchorId="2A68EF04" wp14:editId="16A632E3">
+          <wp:inline distT="0" distB="0" distL="0" distR="0" wp14:anchorId="30DC3B76" wp14:editId="0BE1DB89">
             <wp:extent cx="4320000" cy="5015106"/>
             <wp:effectExtent l="0" t="0" r="0" b="0"/>
             <wp:docPr id="2" name="Picture 2"/>
@@ -10057,7 +10057,7 @@
           <w:noProof/>
         </w:rPr>
         <w:drawing>
-          <wp:inline distT="0" distB="0" distL="0" distR="0" wp14:anchorId="00FAFE6B" wp14:editId="37FEFB14">
+          <wp:inline distT="0" distB="0" distL="0" distR="0" wp14:anchorId="72AFDD0D" wp14:editId="5FC02419">
             <wp:extent cx="2880000" cy="3807360"/>
             <wp:effectExtent l="0" t="0" r="0" b="0"/>
             <wp:docPr id="3" name="Picture 3"/>
@@ -10191,7 +10191,7 @@
           <w:noProof/>
         </w:rPr>
         <w:drawing>
-          <wp:inline distT="0" distB="0" distL="0" distR="0" wp14:anchorId="4BF30E8D" wp14:editId="468205D3">
+          <wp:inline distT="0" distB="0" distL="0" distR="0" wp14:anchorId="6935ADF8" wp14:editId="4B5FE998">
             <wp:extent cx="5400000" cy="2840309"/>
             <wp:effectExtent l="0" t="0" r="0" b="0"/>
             <wp:docPr id="4" name="Picture 4"/>
@@ -13253,7 +13253,7 @@
           <w:noProof/>
         </w:rPr>
         <w:drawing>
-          <wp:inline distT="0" distB="0" distL="0" distR="0" wp14:anchorId="052637E3" wp14:editId="263AB6D7">
+          <wp:inline distT="0" distB="0" distL="0" distR="0" wp14:anchorId="399158A4" wp14:editId="18025F0D">
             <wp:extent cx="5400000" cy="2894318"/>
             <wp:effectExtent l="0" t="0" r="0" b="0"/>
             <wp:docPr id="5" name="Picture 5"/>
@@ -27087,31 +27087,31 @@
       </w:rPr>
     </w:lvl>
   </w:abstractNum>
-  <w:num w:numId="1" w16cid:durableId="1588073055">
+  <w:num w:numId="1" w16cid:durableId="641231172">
     <w:abstractNumId w:val="8"/>
   </w:num>
-  <w:num w:numId="2" w16cid:durableId="1092162839">
+  <w:num w:numId="2" w16cid:durableId="1262182451">
     <w:abstractNumId w:val="6"/>
   </w:num>
-  <w:num w:numId="3" w16cid:durableId="2137141127">
+  <w:num w:numId="3" w16cid:durableId="1122652248">
     <w:abstractNumId w:val="5"/>
   </w:num>
-  <w:num w:numId="4" w16cid:durableId="1541625361">
+  <w:num w:numId="4" w16cid:durableId="1715159620">
     <w:abstractNumId w:val="4"/>
   </w:num>
-  <w:num w:numId="5" w16cid:durableId="329143790">
+  <w:num w:numId="5" w16cid:durableId="342632230">
     <w:abstractNumId w:val="7"/>
   </w:num>
-  <w:num w:numId="6" w16cid:durableId="5057571">
+  <w:num w:numId="6" w16cid:durableId="806432551">
     <w:abstractNumId w:val="3"/>
   </w:num>
-  <w:num w:numId="7" w16cid:durableId="221798549">
+  <w:num w:numId="7" w16cid:durableId="1874882436">
     <w:abstractNumId w:val="2"/>
   </w:num>
-  <w:num w:numId="8" w16cid:durableId="1183665398">
+  <w:num w:numId="8" w16cid:durableId="1017804157">
     <w:abstractNumId w:val="1"/>
   </w:num>
-  <w:num w:numId="9" w16cid:durableId="1195537309">
+  <w:num w:numId="9" w16cid:durableId="1347562925">
     <w:abstractNumId w:val="0"/>
   </w:num>
 </w:numbering>

</xml_diff>

<commit_message>
docs: sync official 19-page Word and PDF reports with latest LogQL, Hardening, and Git commits
</commit_message>
<xml_diff>
--- a/BAO_CAO_DE_13.docx
+++ b/BAO_CAO_DE_13.docx
@@ -6256,6 +6256,7 @@
           <w:color w:val="1F2937"/>
           <w:sz w:val="23"/>
         </w:rPr>
+        <w:lastRenderedPageBreak/>
         <w:t>2. M</w:t>
       </w:r>
       <w:r>
@@ -6381,7 +6382,6 @@
           <w:color w:val="1F2937"/>
           <w:sz w:val="23"/>
         </w:rPr>
-        <w:lastRenderedPageBreak/>
         <w:t>3. M</w:t>
       </w:r>
       <w:r>
@@ -9059,6 +9059,7 @@
           <w:color w:val="1F2937"/>
           <w:sz w:val="23"/>
         </w:rPr>
+        <w:lastRenderedPageBreak/>
         <w:t>4. Ch</w:t>
       </w:r>
       <w:r>
@@ -9772,7 +9773,7 @@
           <w:noProof/>
         </w:rPr>
         <w:drawing>
-          <wp:inline distT="0" distB="0" distL="0" distR="0" wp14:anchorId="62DEADD3" wp14:editId="13BF66ED">
+          <wp:inline distT="0" distB="0" distL="0" distR="0" wp14:anchorId="2683E746" wp14:editId="2D4C3BFA">
             <wp:extent cx="5400000" cy="2840309"/>
             <wp:effectExtent l="0" t="0" r="0" b="0"/>
             <wp:docPr id="1" name="Picture 1"/>
@@ -9906,7 +9907,7 @@
         </w:rPr>
         <w:lastRenderedPageBreak/>
         <w:drawing>
-          <wp:inline distT="0" distB="0" distL="0" distR="0" wp14:anchorId="30DC3B76" wp14:editId="0BE1DB89">
+          <wp:inline distT="0" distB="0" distL="0" distR="0" wp14:anchorId="60A5AD9A" wp14:editId="4F01C73C">
             <wp:extent cx="4320000" cy="5015106"/>
             <wp:effectExtent l="0" t="0" r="0" b="0"/>
             <wp:docPr id="2" name="Picture 2"/>
@@ -10056,8 +10057,9 @@
         <w:rPr>
           <w:noProof/>
         </w:rPr>
+        <w:lastRenderedPageBreak/>
         <w:drawing>
-          <wp:inline distT="0" distB="0" distL="0" distR="0" wp14:anchorId="72AFDD0D" wp14:editId="5FC02419">
+          <wp:inline distT="0" distB="0" distL="0" distR="0" wp14:anchorId="12451DEB" wp14:editId="0099810A">
             <wp:extent cx="2880000" cy="3807360"/>
             <wp:effectExtent l="0" t="0" r="0" b="0"/>
             <wp:docPr id="3" name="Picture 3"/>
@@ -10105,7 +10107,6 @@
           <w:color w:val="4B5563"/>
           <w:sz w:val="19"/>
         </w:rPr>
-        <w:lastRenderedPageBreak/>
         <w:t>Hình: Giao di</w:t>
       </w:r>
       <w:r>
@@ -10191,7 +10192,7 @@
           <w:noProof/>
         </w:rPr>
         <w:drawing>
-          <wp:inline distT="0" distB="0" distL="0" distR="0" wp14:anchorId="6935ADF8" wp14:editId="4B5FE998">
+          <wp:inline distT="0" distB="0" distL="0" distR="0" wp14:anchorId="1BF806BF" wp14:editId="15278403">
             <wp:extent cx="5400000" cy="2840309"/>
             <wp:effectExtent l="0" t="0" r="0" b="0"/>
             <wp:docPr id="4" name="Picture 4"/>
@@ -10725,6 +10726,7 @@
           <w:color w:val="1F2937"/>
           <w:sz w:val="23"/>
         </w:rPr>
+        <w:lastRenderedPageBreak/>
         <w:t>1. Ch</w:t>
       </w:r>
       <w:r>
@@ -13253,7 +13255,7 @@
           <w:noProof/>
         </w:rPr>
         <w:drawing>
-          <wp:inline distT="0" distB="0" distL="0" distR="0" wp14:anchorId="399158A4" wp14:editId="18025F0D">
+          <wp:inline distT="0" distB="0" distL="0" distR="0" wp14:anchorId="28003607" wp14:editId="2B257EF4">
             <wp:extent cx="5400000" cy="2894318"/>
             <wp:effectExtent l="0" t="0" r="0" b="0"/>
             <wp:docPr id="5" name="Picture 5"/>
@@ -13487,7 +13489,43 @@
           <w:color w:val="2B6CB0"/>
           <w:sz w:val="26"/>
         </w:rPr>
-        <w:t>ng 3 Câu Truy V</w:t>
+        <w:t>ng H</w:t>
+      </w:r>
+      <w:r>
+        <w:rPr>
+          <w:rFonts w:ascii="Times New Roman" w:hAnsi="Times New Roman"/>
+          <w:b/>
+          <w:color w:val="2B6CB0"/>
+          <w:sz w:val="26"/>
+        </w:rPr>
+        <w:t>ệ</w:t>
+      </w:r>
+      <w:r>
+        <w:rPr>
+          <w:rFonts w:ascii="Times New Roman" w:hAnsi="Times New Roman"/>
+          <w:b/>
+          <w:color w:val="2B6CB0"/>
+          <w:sz w:val="26"/>
+        </w:rPr>
+        <w:t xml:space="preserve"> Th</w:t>
+      </w:r>
+      <w:r>
+        <w:rPr>
+          <w:rFonts w:ascii="Times New Roman" w:hAnsi="Times New Roman"/>
+          <w:b/>
+          <w:color w:val="2B6CB0"/>
+          <w:sz w:val="26"/>
+        </w:rPr>
+        <w:t>ố</w:t>
+      </w:r>
+      <w:r>
+        <w:rPr>
+          <w:rFonts w:ascii="Times New Roman" w:hAnsi="Times New Roman"/>
+          <w:b/>
+          <w:color w:val="2B6CB0"/>
+          <w:sz w:val="26"/>
+        </w:rPr>
+        <w:t>ng Truy V</w:t>
       </w:r>
       <w:r>
         <w:rPr>
@@ -13600,7 +13638,39 @@
           <w:color w:val="1F2937"/>
           <w:sz w:val="24"/>
         </w:rPr>
-        <w:t>u trúc JSON và đư</w:t>
+        <w:t xml:space="preserve">u trúc JSON và log </w:t>
+      </w:r>
+      <w:r>
+        <w:rPr>
+          <w:rFonts w:ascii="Times New Roman" w:hAnsi="Times New Roman"/>
+          <w:color w:val="1F2937"/>
+          <w:sz w:val="24"/>
+        </w:rPr>
+        <w:t>ứ</w:t>
+      </w:r>
+      <w:r>
+        <w:rPr>
+          <w:rFonts w:ascii="Times New Roman" w:hAnsi="Times New Roman"/>
+          <w:color w:val="1F2937"/>
+          <w:sz w:val="24"/>
+        </w:rPr>
+        <w:t>ng d</w:t>
+      </w:r>
+      <w:r>
+        <w:rPr>
+          <w:rFonts w:ascii="Times New Roman" w:hAnsi="Times New Roman"/>
+          <w:color w:val="1F2937"/>
+          <w:sz w:val="24"/>
+        </w:rPr>
+        <w:t>ụ</w:t>
+      </w:r>
+      <w:r>
+        <w:rPr>
+          <w:rFonts w:ascii="Times New Roman" w:hAnsi="Times New Roman"/>
+          <w:color w:val="1F2937"/>
+          <w:sz w:val="24"/>
+        </w:rPr>
+        <w:t>ng PHP đư</w:t>
       </w:r>
       <w:r>
         <w:rPr>
@@ -13616,6 +13686,102 @@
           <w:color w:val="1F2937"/>
           <w:sz w:val="24"/>
         </w:rPr>
+        <w:t>c tích h</w:t>
+      </w:r>
+      <w:r>
+        <w:rPr>
+          <w:rFonts w:ascii="Times New Roman" w:hAnsi="Times New Roman"/>
+          <w:color w:val="1F2937"/>
+          <w:sz w:val="24"/>
+        </w:rPr>
+        <w:t>ợ</w:t>
+      </w:r>
+      <w:r>
+        <w:rPr>
+          <w:rFonts w:ascii="Times New Roman" w:hAnsi="Times New Roman"/>
+          <w:color w:val="1F2937"/>
+          <w:sz w:val="24"/>
+        </w:rPr>
+        <w:t>p tr</w:t>
+      </w:r>
+      <w:r>
+        <w:rPr>
+          <w:rFonts w:ascii="Times New Roman" w:hAnsi="Times New Roman"/>
+          <w:color w:val="1F2937"/>
+          <w:sz w:val="24"/>
+        </w:rPr>
+        <w:t>ự</w:t>
+      </w:r>
+      <w:r>
+        <w:rPr>
+          <w:rFonts w:ascii="Times New Roman" w:hAnsi="Times New Roman"/>
+          <w:color w:val="1F2937"/>
+          <w:sz w:val="24"/>
+        </w:rPr>
+        <w:t>c ti</w:t>
+      </w:r>
+      <w:r>
+        <w:rPr>
+          <w:rFonts w:ascii="Times New Roman" w:hAnsi="Times New Roman"/>
+          <w:color w:val="1F2937"/>
+          <w:sz w:val="24"/>
+        </w:rPr>
+        <w:t>ế</w:t>
+      </w:r>
+      <w:r>
+        <w:rPr>
+          <w:rFonts w:ascii="Times New Roman" w:hAnsi="Times New Roman"/>
+          <w:color w:val="1F2937"/>
+          <w:sz w:val="24"/>
+        </w:rPr>
+        <w:t>p vào Grafana Dashboard (m</w:t>
+      </w:r>
+      <w:r>
+        <w:rPr>
+          <w:rFonts w:ascii="Times New Roman" w:hAnsi="Times New Roman"/>
+          <w:color w:val="1F2937"/>
+          <w:sz w:val="24"/>
+        </w:rPr>
+        <w:t>ở</w:t>
+      </w:r>
+      <w:r>
+        <w:rPr>
+          <w:rFonts w:ascii="Times New Roman" w:hAnsi="Times New Roman"/>
+          <w:color w:val="1F2937"/>
+          <w:sz w:val="24"/>
+        </w:rPr>
+        <w:t xml:space="preserve"> r</w:t>
+      </w:r>
+      <w:r>
+        <w:rPr>
+          <w:rFonts w:ascii="Times New Roman" w:hAnsi="Times New Roman"/>
+          <w:color w:val="1F2937"/>
+          <w:sz w:val="24"/>
+        </w:rPr>
+        <w:t>ộ</w:t>
+      </w:r>
+      <w:r>
+        <w:rPr>
+          <w:rFonts w:ascii="Times New Roman" w:hAnsi="Times New Roman"/>
+          <w:color w:val="1F2937"/>
+          <w:sz w:val="24"/>
+        </w:rPr>
+        <w:t>ng lên 26 panels chuyên sâu) và đư</w:t>
+      </w:r>
+      <w:r>
+        <w:rPr>
+          <w:rFonts w:ascii="Times New Roman" w:hAnsi="Times New Roman"/>
+          <w:color w:val="1F2937"/>
+          <w:sz w:val="24"/>
+        </w:rPr>
+        <w:t>ợ</w:t>
+      </w:r>
+      <w:r>
+        <w:rPr>
+          <w:rFonts w:ascii="Times New Roman" w:hAnsi="Times New Roman"/>
+          <w:color w:val="1F2937"/>
+          <w:sz w:val="24"/>
+        </w:rPr>
         <w:t>c ki</w:t>
       </w:r>
       <w:r>
@@ -13648,7 +13814,23 @@
           <w:color w:val="1F2937"/>
           <w:sz w:val="24"/>
         </w:rPr>
-        <w:t>ng thành công qua script scripts/test_logql_detailed.py:</w:t>
+        <w:t>ng thành công qua script scripts/test_logql_detailed.py đ</w:t>
+      </w:r>
+      <w:r>
+        <w:rPr>
+          <w:rFonts w:ascii="Times New Roman" w:hAnsi="Times New Roman"/>
+          <w:color w:val="1F2937"/>
+          <w:sz w:val="24"/>
+        </w:rPr>
+        <w:t>ạ</w:t>
+      </w:r>
+      <w:r>
+        <w:rPr>
+          <w:rFonts w:ascii="Times New Roman" w:hAnsi="Times New Roman"/>
+          <w:color w:val="1F2937"/>
+          <w:sz w:val="24"/>
+        </w:rPr>
+        <w:t>t 5/5 queries:</w:t>
       </w:r>
     </w:p>
     <w:p>
@@ -13664,6 +13846,7 @@
           <w:color w:val="2D3748"/>
           <w:sz w:val="23"/>
         </w:rPr>
+        <w:lastRenderedPageBreak/>
         <w:t>Truy v</w:t>
       </w:r>
       <w:r>
@@ -13892,6 +14075,38 @@
           <w:color w:val="1F2937"/>
           <w:sz w:val="23"/>
         </w:rPr>
+        <w:t xml:space="preserve"> đ</w:t>
+      </w:r>
+      <w:r>
+        <w:rPr>
+          <w:rFonts w:ascii="Times New Roman" w:hAnsi="Times New Roman"/>
+          <w:color w:val="1F2937"/>
+          <w:sz w:val="23"/>
+        </w:rPr>
+        <w:t>ầ</w:t>
+      </w:r>
+      <w:r>
+        <w:rPr>
+          <w:rFonts w:ascii="Times New Roman" w:hAnsi="Times New Roman"/>
+          <w:color w:val="1F2937"/>
+          <w:sz w:val="23"/>
+        </w:rPr>
+        <w:t>y đ</w:t>
+      </w:r>
+      <w:r>
+        <w:rPr>
+          <w:rFonts w:ascii="Times New Roman" w:hAnsi="Times New Roman"/>
+          <w:color w:val="1F2937"/>
+          <w:sz w:val="23"/>
+        </w:rPr>
+        <w:t>ủ</w:t>
+      </w:r>
+      <w:r>
+        <w:rPr>
+          <w:rFonts w:ascii="Times New Roman" w:hAnsi="Times New Roman"/>
+          <w:color w:val="1F2937"/>
+          <w:sz w:val="23"/>
+        </w:rPr>
         <w:t xml:space="preserve"> 2 lu</w:t>
       </w:r>
       <w:r>
@@ -14068,7 +14283,7 @@
           <w:color w:val="2D3748"/>
           <w:sz w:val="23"/>
         </w:rPr>
-        <w:t>i HTTP status code &gt;= 400</w:t>
+        <w:t>i HTTP status code &gt;= 400 (LogQL #1 trên Dashboard)</w:t>
       </w:r>
     </w:p>
     <w:p>
@@ -14124,7 +14339,6 @@
           <w:color w:val="1F2937"/>
           <w:sz w:val="23"/>
         </w:rPr>
-        <w:lastRenderedPageBreak/>
         <w:t>K</w:t>
       </w:r>
       <w:r>
@@ -14253,7 +14467,87 @@
           <w:color w:val="1F2937"/>
           <w:sz w:val="23"/>
         </w:rPr>
-        <w:t>i sinh ra trong quá trình test: HTTP 503 (do Rate Limiting kích ho</w:t>
+        <w:t>i sinh ra trong quá trình ki</w:t>
+      </w:r>
+      <w:r>
+        <w:rPr>
+          <w:rFonts w:ascii="Times New Roman" w:hAnsi="Times New Roman"/>
+          <w:color w:val="1F2937"/>
+          <w:sz w:val="23"/>
+        </w:rPr>
+        <w:t>ể</w:t>
+      </w:r>
+      <w:r>
+        <w:rPr>
+          <w:rFonts w:ascii="Times New Roman" w:hAnsi="Times New Roman"/>
+          <w:color w:val="1F2937"/>
+          <w:sz w:val="23"/>
+        </w:rPr>
+        <w:t>m th</w:t>
+      </w:r>
+      <w:r>
+        <w:rPr>
+          <w:rFonts w:ascii="Times New Roman" w:hAnsi="Times New Roman"/>
+          <w:color w:val="1F2937"/>
+          <w:sz w:val="23"/>
+        </w:rPr>
+        <w:t>ử</w:t>
+      </w:r>
+      <w:r>
+        <w:rPr>
+          <w:rFonts w:ascii="Times New Roman" w:hAnsi="Times New Roman"/>
+          <w:color w:val="1F2937"/>
+          <w:sz w:val="23"/>
+        </w:rPr>
+        <w:t>: HTTP 404 (đư</w:t>
+      </w:r>
+      <w:r>
+        <w:rPr>
+          <w:rFonts w:ascii="Times New Roman" w:hAnsi="Times New Roman"/>
+          <w:color w:val="1F2937"/>
+          <w:sz w:val="23"/>
+        </w:rPr>
+        <w:t>ờ</w:t>
+      </w:r>
+      <w:r>
+        <w:rPr>
+          <w:rFonts w:ascii="Times New Roman" w:hAnsi="Times New Roman"/>
+          <w:color w:val="1F2937"/>
+          <w:sz w:val="23"/>
+        </w:rPr>
+        <w:t>ng d</w:t>
+      </w:r>
+      <w:r>
+        <w:rPr>
+          <w:rFonts w:ascii="Times New Roman" w:hAnsi="Times New Roman"/>
+          <w:color w:val="1F2937"/>
+          <w:sz w:val="23"/>
+        </w:rPr>
+        <w:t>ẫ</w:t>
+      </w:r>
+      <w:r>
+        <w:rPr>
+          <w:rFonts w:ascii="Times New Roman" w:hAnsi="Times New Roman"/>
+          <w:color w:val="1F2937"/>
+          <w:sz w:val="23"/>
+        </w:rPr>
+        <w:t>n không t</w:t>
+      </w:r>
+      <w:r>
+        <w:rPr>
+          <w:rFonts w:ascii="Times New Roman" w:hAnsi="Times New Roman"/>
+          <w:color w:val="1F2937"/>
+          <w:sz w:val="23"/>
+        </w:rPr>
+        <w:t>ồ</w:t>
+      </w:r>
+      <w:r>
+        <w:rPr>
+          <w:rFonts w:ascii="Times New Roman" w:hAnsi="Times New Roman"/>
+          <w:color w:val="1F2937"/>
+          <w:sz w:val="23"/>
+        </w:rPr>
+        <w:t>n t</w:t>
       </w:r>
       <w:r>
         <w:rPr>
@@ -14269,7 +14563,39 @@
           <w:color w:val="1F2937"/>
           <w:sz w:val="23"/>
         </w:rPr>
-        <w:t>t) và HTTP 403 (do truy c</w:t>
+        <w:t>i), HTTP 503 (do Rate Limiting kích ho</w:t>
+      </w:r>
+      <w:r>
+        <w:rPr>
+          <w:rFonts w:ascii="Times New Roman" w:hAnsi="Times New Roman"/>
+          <w:color w:val="1F2937"/>
+          <w:sz w:val="23"/>
+        </w:rPr>
+        <w:t>ạ</w:t>
+      </w:r>
+      <w:r>
+        <w:rPr>
+          <w:rFonts w:ascii="Times New Roman" w:hAnsi="Times New Roman"/>
+          <w:color w:val="1F2937"/>
+          <w:sz w:val="23"/>
+        </w:rPr>
+        <w:t>t) và HTTP 403 (do ch</w:t>
+      </w:r>
+      <w:r>
+        <w:rPr>
+          <w:rFonts w:ascii="Times New Roman" w:hAnsi="Times New Roman"/>
+          <w:color w:val="1F2937"/>
+          <w:sz w:val="23"/>
+        </w:rPr>
+        <w:t>ặ</w:t>
+      </w:r>
+      <w:r>
+        <w:rPr>
+          <w:rFonts w:ascii="Times New Roman" w:hAnsi="Times New Roman"/>
+          <w:color w:val="1F2937"/>
+          <w:sz w:val="23"/>
+        </w:rPr>
+        <w:t>n truy c</w:t>
       </w:r>
       <w:r>
         <w:rPr>
@@ -14285,7 +14611,39 @@
           <w:color w:val="1F2937"/>
           <w:sz w:val="23"/>
         </w:rPr>
-        <w:t>p file PHP trong /uploads/).</w:t>
+        <w:t>p file nh</w:t>
+      </w:r>
+      <w:r>
+        <w:rPr>
+          <w:rFonts w:ascii="Times New Roman" w:hAnsi="Times New Roman"/>
+          <w:color w:val="1F2937"/>
+          <w:sz w:val="23"/>
+        </w:rPr>
+        <w:t>ạ</w:t>
+      </w:r>
+      <w:r>
+        <w:rPr>
+          <w:rFonts w:ascii="Times New Roman" w:hAnsi="Times New Roman"/>
+          <w:color w:val="1F2937"/>
+          <w:sz w:val="23"/>
+        </w:rPr>
+        <w:t>y c</w:t>
+      </w:r>
+      <w:r>
+        <w:rPr>
+          <w:rFonts w:ascii="Times New Roman" w:hAnsi="Times New Roman"/>
+          <w:color w:val="1F2937"/>
+          <w:sz w:val="23"/>
+        </w:rPr>
+        <w:t>ả</w:t>
+      </w:r>
+      <w:r>
+        <w:rPr>
+          <w:rFonts w:ascii="Times New Roman" w:hAnsi="Times New Roman"/>
+          <w:color w:val="1F2937"/>
+          <w:sz w:val="23"/>
+        </w:rPr>
+        <w:t>m).</w:t>
       </w:r>
     </w:p>
     <w:p>
@@ -14321,7 +14679,7 @@
           <w:color w:val="2D3748"/>
           <w:sz w:val="23"/>
         </w:rPr>
-        <w:t>n 3: Đo lư</w:t>
+        <w:t>n 3: Đ</w:t>
       </w:r>
       <w:r>
         <w:rPr>
@@ -14331,7 +14689,7 @@
           <w:color w:val="2D3748"/>
           <w:sz w:val="23"/>
         </w:rPr>
-        <w:t>ờ</w:t>
+        <w:t>ế</w:t>
       </w:r>
       <w:r>
         <w:rPr>
@@ -14341,7 +14699,7 @@
           <w:color w:val="2D3748"/>
           <w:sz w:val="23"/>
         </w:rPr>
-        <w:t>ng t</w:t>
+        <w:t>m s</w:t>
       </w:r>
       <w:r>
         <w:rPr>
@@ -14351,7 +14709,7 @@
           <w:color w:val="2D3748"/>
           <w:sz w:val="23"/>
         </w:rPr>
-        <w:t>ầ</w:t>
+        <w:t>ố</w:t>
       </w:r>
       <w:r>
         <w:rPr>
@@ -14361,7 +14719,7 @@
           <w:color w:val="2D3748"/>
           <w:sz w:val="23"/>
         </w:rPr>
-        <w:t>n su</w:t>
+        <w:t xml:space="preserve"> lư</w:t>
       </w:r>
       <w:r>
         <w:rPr>
@@ -14371,7 +14729,7 @@
           <w:color w:val="2D3748"/>
           <w:sz w:val="23"/>
         </w:rPr>
-        <w:t>ấ</w:t>
+        <w:t>ợ</w:t>
       </w:r>
       <w:r>
         <w:rPr>
@@ -14381,7 +14739,7 @@
           <w:color w:val="2D3748"/>
           <w:sz w:val="23"/>
         </w:rPr>
-        <w:t>t request trên giây trong c</w:t>
+        <w:t>ng request Nginx theo chu k</w:t>
       </w:r>
       <w:r>
         <w:rPr>
@@ -14391,7 +14749,7 @@
           <w:color w:val="2D3748"/>
           <w:sz w:val="23"/>
         </w:rPr>
-        <w:t>ử</w:t>
+        <w:t>ỳ</w:t>
       </w:r>
       <w:r>
         <w:rPr>
@@ -14401,27 +14759,7 @@
           <w:color w:val="2D3748"/>
           <w:sz w:val="23"/>
         </w:rPr>
-        <w:t>a s</w:t>
-      </w:r>
-      <w:r>
-        <w:rPr>
-          <w:rFonts w:ascii="Times New Roman" w:hAnsi="Times New Roman"/>
-          <w:b/>
-          <w:i/>
-          <w:color w:val="2D3748"/>
-          <w:sz w:val="23"/>
-        </w:rPr>
-        <w:t>ổ</w:t>
-      </w:r>
-      <w:r>
-        <w:rPr>
-          <w:rFonts w:ascii="Times New Roman" w:hAnsi="Times New Roman"/>
-          <w:b/>
-          <w:i/>
-          <w:color w:val="2D3748"/>
-          <w:sz w:val="23"/>
-        </w:rPr>
-        <w:t xml:space="preserve"> 1 phút (Requests per Second - RPS)</w:t>
+        <w:t xml:space="preserve"> 5 phút (LogQL #2 trên Dashboard)</w:t>
       </w:r>
     </w:p>
     <w:p>
@@ -14462,7 +14800,7 @@
           <w:color w:val="1F2937"/>
           <w:sz w:val="23"/>
         </w:rPr>
-        <w:t>rate({service="nginx"}[1m])</w:t>
+        <w:t>count_over_time({service="nginx"}[5m])</w:t>
       </w:r>
     </w:p>
     <w:p>
@@ -14477,6 +14815,974 @@
           <w:color w:val="1F2937"/>
           <w:sz w:val="23"/>
         </w:rPr>
+        <w:t>K</w:t>
+      </w:r>
+      <w:r>
+        <w:rPr>
+          <w:rFonts w:ascii="Times New Roman" w:hAnsi="Times New Roman"/>
+          <w:b/>
+          <w:color w:val="1F2937"/>
+          <w:sz w:val="23"/>
+        </w:rPr>
+        <w:t>ế</w:t>
+      </w:r>
+      <w:r>
+        <w:rPr>
+          <w:rFonts w:ascii="Times New Roman" w:hAnsi="Times New Roman"/>
+          <w:b/>
+          <w:color w:val="1F2937"/>
+          <w:sz w:val="23"/>
+        </w:rPr>
+        <w:t>t qu</w:t>
+      </w:r>
+      <w:r>
+        <w:rPr>
+          <w:rFonts w:ascii="Times New Roman" w:hAnsi="Times New Roman"/>
+          <w:b/>
+          <w:color w:val="1F2937"/>
+          <w:sz w:val="23"/>
+        </w:rPr>
+        <w:t>ả</w:t>
+      </w:r>
+      <w:r>
+        <w:rPr>
+          <w:rFonts w:ascii="Times New Roman" w:hAnsi="Times New Roman"/>
+          <w:b/>
+          <w:color w:val="1F2937"/>
+          <w:sz w:val="23"/>
+        </w:rPr>
+        <w:t xml:space="preserve"> ki</w:t>
+      </w:r>
+      <w:r>
+        <w:rPr>
+          <w:rFonts w:ascii="Times New Roman" w:hAnsi="Times New Roman"/>
+          <w:b/>
+          <w:color w:val="1F2937"/>
+          <w:sz w:val="23"/>
+        </w:rPr>
+        <w:t>ể</w:t>
+      </w:r>
+      <w:r>
+        <w:rPr>
+          <w:rFonts w:ascii="Times New Roman" w:hAnsi="Times New Roman"/>
+          <w:b/>
+          <w:color w:val="1F2937"/>
+          <w:sz w:val="23"/>
+        </w:rPr>
+        <w:t>m ch</w:t>
+      </w:r>
+      <w:r>
+        <w:rPr>
+          <w:rFonts w:ascii="Times New Roman" w:hAnsi="Times New Roman"/>
+          <w:b/>
+          <w:color w:val="1F2937"/>
+          <w:sz w:val="23"/>
+        </w:rPr>
+        <w:t>ứ</w:t>
+      </w:r>
+      <w:r>
+        <w:rPr>
+          <w:rFonts w:ascii="Times New Roman" w:hAnsi="Times New Roman"/>
+          <w:b/>
+          <w:color w:val="1F2937"/>
+          <w:sz w:val="23"/>
+        </w:rPr>
+        <w:t>ng:</w:t>
+      </w:r>
+      <w:r>
+        <w:rPr>
+          <w:rFonts w:ascii="Times New Roman" w:hAnsi="Times New Roman"/>
+          <w:color w:val="1F2937"/>
+          <w:sz w:val="23"/>
+        </w:rPr>
+        <w:t>Hàm count_over_time th</w:t>
+      </w:r>
+      <w:r>
+        <w:rPr>
+          <w:rFonts w:ascii="Times New Roman" w:hAnsi="Times New Roman"/>
+          <w:color w:val="1F2937"/>
+          <w:sz w:val="23"/>
+        </w:rPr>
+        <w:t>ố</w:t>
+      </w:r>
+      <w:r>
+        <w:rPr>
+          <w:rFonts w:ascii="Times New Roman" w:hAnsi="Times New Roman"/>
+          <w:color w:val="1F2937"/>
+          <w:sz w:val="23"/>
+        </w:rPr>
+        <w:t>ng kê t</w:t>
+      </w:r>
+      <w:r>
+        <w:rPr>
+          <w:rFonts w:ascii="Times New Roman" w:hAnsi="Times New Roman"/>
+          <w:color w:val="1F2937"/>
+          <w:sz w:val="23"/>
+        </w:rPr>
+        <w:t>ổ</w:t>
+      </w:r>
+      <w:r>
+        <w:rPr>
+          <w:rFonts w:ascii="Times New Roman" w:hAnsi="Times New Roman"/>
+          <w:color w:val="1F2937"/>
+          <w:sz w:val="23"/>
+        </w:rPr>
+        <w:t>ng s</w:t>
+      </w:r>
+      <w:r>
+        <w:rPr>
+          <w:rFonts w:ascii="Times New Roman" w:hAnsi="Times New Roman"/>
+          <w:color w:val="1F2937"/>
+          <w:sz w:val="23"/>
+        </w:rPr>
+        <w:t>ố</w:t>
+      </w:r>
+      <w:r>
+        <w:rPr>
+          <w:rFonts w:ascii="Times New Roman" w:hAnsi="Times New Roman"/>
+          <w:color w:val="1F2937"/>
+          <w:sz w:val="23"/>
+        </w:rPr>
+        <w:t xml:space="preserve"> request g</w:t>
+      </w:r>
+      <w:r>
+        <w:rPr>
+          <w:rFonts w:ascii="Times New Roman" w:hAnsi="Times New Roman"/>
+          <w:color w:val="1F2937"/>
+          <w:sz w:val="23"/>
+        </w:rPr>
+        <w:t>ử</w:t>
+      </w:r>
+      <w:r>
+        <w:rPr>
+          <w:rFonts w:ascii="Times New Roman" w:hAnsi="Times New Roman"/>
+          <w:color w:val="1F2937"/>
+          <w:sz w:val="23"/>
+        </w:rPr>
+        <w:t>i đ</w:t>
+      </w:r>
+      <w:r>
+        <w:rPr>
+          <w:rFonts w:ascii="Times New Roman" w:hAnsi="Times New Roman"/>
+          <w:color w:val="1F2937"/>
+          <w:sz w:val="23"/>
+        </w:rPr>
+        <w:t>ế</w:t>
+      </w:r>
+      <w:r>
+        <w:rPr>
+          <w:rFonts w:ascii="Times New Roman" w:hAnsi="Times New Roman"/>
+          <w:color w:val="1F2937"/>
+          <w:sz w:val="23"/>
+        </w:rPr>
+        <w:t>n Nginx trong t</w:t>
+      </w:r>
+      <w:r>
+        <w:rPr>
+          <w:rFonts w:ascii="Times New Roman" w:hAnsi="Times New Roman"/>
+          <w:color w:val="1F2937"/>
+          <w:sz w:val="23"/>
+        </w:rPr>
+        <w:t>ừ</w:t>
+      </w:r>
+      <w:r>
+        <w:rPr>
+          <w:rFonts w:ascii="Times New Roman" w:hAnsi="Times New Roman"/>
+          <w:color w:val="1F2937"/>
+          <w:sz w:val="23"/>
+        </w:rPr>
+        <w:t>ng khung 5 phút, hi</w:t>
+      </w:r>
+      <w:r>
+        <w:rPr>
+          <w:rFonts w:ascii="Times New Roman" w:hAnsi="Times New Roman"/>
+          <w:color w:val="1F2937"/>
+          <w:sz w:val="23"/>
+        </w:rPr>
+        <w:t>ể</w:t>
+      </w:r>
+      <w:r>
+        <w:rPr>
+          <w:rFonts w:ascii="Times New Roman" w:hAnsi="Times New Roman"/>
+          <w:color w:val="1F2937"/>
+          <w:sz w:val="23"/>
+        </w:rPr>
+        <w:t>n th</w:t>
+      </w:r>
+      <w:r>
+        <w:rPr>
+          <w:rFonts w:ascii="Times New Roman" w:hAnsi="Times New Roman"/>
+          <w:color w:val="1F2937"/>
+          <w:sz w:val="23"/>
+        </w:rPr>
+        <w:t>ị</w:t>
+      </w:r>
+      <w:r>
+        <w:rPr>
+          <w:rFonts w:ascii="Times New Roman" w:hAnsi="Times New Roman"/>
+          <w:color w:val="1F2937"/>
+          <w:sz w:val="23"/>
+        </w:rPr>
+        <w:t xml:space="preserve"> d</w:t>
+      </w:r>
+      <w:r>
+        <w:rPr>
+          <w:rFonts w:ascii="Times New Roman" w:hAnsi="Times New Roman"/>
+          <w:color w:val="1F2937"/>
+          <w:sz w:val="23"/>
+        </w:rPr>
+        <w:t>ạ</w:t>
+      </w:r>
+      <w:r>
+        <w:rPr>
+          <w:rFonts w:ascii="Times New Roman" w:hAnsi="Times New Roman"/>
+          <w:color w:val="1F2937"/>
+          <w:sz w:val="23"/>
+        </w:rPr>
+        <w:t>ng đ</w:t>
+      </w:r>
+      <w:r>
+        <w:rPr>
+          <w:rFonts w:ascii="Times New Roman" w:hAnsi="Times New Roman"/>
+          <w:color w:val="1F2937"/>
+          <w:sz w:val="23"/>
+        </w:rPr>
+        <w:t>ồ</w:t>
+      </w:r>
+      <w:r>
+        <w:rPr>
+          <w:rFonts w:ascii="Times New Roman" w:hAnsi="Times New Roman"/>
+          <w:color w:val="1F2937"/>
+          <w:sz w:val="23"/>
+        </w:rPr>
+        <w:t xml:space="preserve"> th</w:t>
+      </w:r>
+      <w:r>
+        <w:rPr>
+          <w:rFonts w:ascii="Times New Roman" w:hAnsi="Times New Roman"/>
+          <w:color w:val="1F2937"/>
+          <w:sz w:val="23"/>
+        </w:rPr>
+        <w:t>ị</w:t>
+      </w:r>
+      <w:r>
+        <w:rPr>
+          <w:rFonts w:ascii="Times New Roman" w:hAnsi="Times New Roman"/>
+          <w:color w:val="1F2937"/>
+          <w:sz w:val="23"/>
+        </w:rPr>
+        <w:t xml:space="preserve"> đư</w:t>
+      </w:r>
+      <w:r>
+        <w:rPr>
+          <w:rFonts w:ascii="Times New Roman" w:hAnsi="Times New Roman"/>
+          <w:color w:val="1F2937"/>
+          <w:sz w:val="23"/>
+        </w:rPr>
+        <w:t>ờ</w:t>
+      </w:r>
+      <w:r>
+        <w:rPr>
+          <w:rFonts w:ascii="Times New Roman" w:hAnsi="Times New Roman"/>
+          <w:color w:val="1F2937"/>
+          <w:sz w:val="23"/>
+        </w:rPr>
+        <w:t>ng sóng trong Dashboard Grafana.</w:t>
+      </w:r>
+    </w:p>
+    <w:p>
+      <w:pPr>
+        <w:keepNext/>
+        <w:spacing w:before="160" w:after="40"/>
+      </w:pPr>
+      <w:r>
+        <w:rPr>
+          <w:rFonts w:ascii="Times New Roman" w:hAnsi="Times New Roman"/>
+          <w:b/>
+          <w:i/>
+          <w:color w:val="2D3748"/>
+          <w:sz w:val="23"/>
+        </w:rPr>
+        <w:t>Truy v</w:t>
+      </w:r>
+      <w:r>
+        <w:rPr>
+          <w:rFonts w:ascii="Times New Roman" w:hAnsi="Times New Roman"/>
+          <w:b/>
+          <w:i/>
+          <w:color w:val="2D3748"/>
+          <w:sz w:val="23"/>
+        </w:rPr>
+        <w:t>ấ</w:t>
+      </w:r>
+      <w:r>
+        <w:rPr>
+          <w:rFonts w:ascii="Times New Roman" w:hAnsi="Times New Roman"/>
+          <w:b/>
+          <w:i/>
+          <w:color w:val="2D3748"/>
+          <w:sz w:val="23"/>
+        </w:rPr>
+        <w:t>n 4: Giám sát lu</w:t>
+      </w:r>
+      <w:r>
+        <w:rPr>
+          <w:rFonts w:ascii="Times New Roman" w:hAnsi="Times New Roman"/>
+          <w:b/>
+          <w:i/>
+          <w:color w:val="2D3748"/>
+          <w:sz w:val="23"/>
+        </w:rPr>
+        <w:t>ồ</w:t>
+      </w:r>
+      <w:r>
+        <w:rPr>
+          <w:rFonts w:ascii="Times New Roman" w:hAnsi="Times New Roman"/>
+          <w:b/>
+          <w:i/>
+          <w:color w:val="2D3748"/>
+          <w:sz w:val="23"/>
+        </w:rPr>
+        <w:t xml:space="preserve">ng log </w:t>
+      </w:r>
+      <w:r>
+        <w:rPr>
+          <w:rFonts w:ascii="Times New Roman" w:hAnsi="Times New Roman"/>
+          <w:b/>
+          <w:i/>
+          <w:color w:val="2D3748"/>
+          <w:sz w:val="23"/>
+        </w:rPr>
+        <w:t>ứ</w:t>
+      </w:r>
+      <w:r>
+        <w:rPr>
+          <w:rFonts w:ascii="Times New Roman" w:hAnsi="Times New Roman"/>
+          <w:b/>
+          <w:i/>
+          <w:color w:val="2D3748"/>
+          <w:sz w:val="23"/>
+        </w:rPr>
+        <w:t>ng d</w:t>
+      </w:r>
+      <w:r>
+        <w:rPr>
+          <w:rFonts w:ascii="Times New Roman" w:hAnsi="Times New Roman"/>
+          <w:b/>
+          <w:i/>
+          <w:color w:val="2D3748"/>
+          <w:sz w:val="23"/>
+        </w:rPr>
+        <w:t>ụ</w:t>
+      </w:r>
+      <w:r>
+        <w:rPr>
+          <w:rFonts w:ascii="Times New Roman" w:hAnsi="Times New Roman"/>
+          <w:b/>
+          <w:i/>
+          <w:color w:val="2D3748"/>
+          <w:sz w:val="23"/>
+        </w:rPr>
+        <w:t>ng PHP (LogQL #3 trên Dashboard)</w:t>
+      </w:r>
+    </w:p>
+    <w:p>
+      <w:pPr>
+        <w:pStyle w:val="Duudong"/>
+        <w:spacing w:before="20" w:after="60" w:line="300" w:lineRule="auto"/>
+      </w:pPr>
+      <w:r>
+        <w:rPr>
+          <w:rFonts w:ascii="Times New Roman" w:hAnsi="Times New Roman"/>
+          <w:b/>
+          <w:color w:val="1F2937"/>
+          <w:sz w:val="23"/>
+        </w:rPr>
+        <w:t>Câu l</w:t>
+      </w:r>
+      <w:r>
+        <w:rPr>
+          <w:rFonts w:ascii="Times New Roman" w:hAnsi="Times New Roman"/>
+          <w:b/>
+          <w:color w:val="1F2937"/>
+          <w:sz w:val="23"/>
+        </w:rPr>
+        <w:t>ệ</w:t>
+      </w:r>
+      <w:r>
+        <w:rPr>
+          <w:rFonts w:ascii="Times New Roman" w:hAnsi="Times New Roman"/>
+          <w:b/>
+          <w:color w:val="1F2937"/>
+          <w:sz w:val="23"/>
+        </w:rPr>
+        <w:t>nh LogQL:</w:t>
+      </w:r>
+      <w:r>
+        <w:rPr>
+          <w:rFonts w:ascii="Times New Roman" w:hAnsi="Times New Roman"/>
+          <w:color w:val="1F2937"/>
+          <w:sz w:val="23"/>
+        </w:rPr>
+        <w:t>{container="portfolio_php"}</w:t>
+      </w:r>
+    </w:p>
+    <w:p>
+      <w:pPr>
+        <w:pStyle w:val="Duudong"/>
+        <w:spacing w:before="20" w:after="60" w:line="300" w:lineRule="auto"/>
+      </w:pPr>
+      <w:r>
+        <w:rPr>
+          <w:rFonts w:ascii="Times New Roman" w:hAnsi="Times New Roman"/>
+          <w:b/>
+          <w:color w:val="1F2937"/>
+          <w:sz w:val="23"/>
+        </w:rPr>
+        <w:t>K</w:t>
+      </w:r>
+      <w:r>
+        <w:rPr>
+          <w:rFonts w:ascii="Times New Roman" w:hAnsi="Times New Roman"/>
+          <w:b/>
+          <w:color w:val="1F2937"/>
+          <w:sz w:val="23"/>
+        </w:rPr>
+        <w:t>ế</w:t>
+      </w:r>
+      <w:r>
+        <w:rPr>
+          <w:rFonts w:ascii="Times New Roman" w:hAnsi="Times New Roman"/>
+          <w:b/>
+          <w:color w:val="1F2937"/>
+          <w:sz w:val="23"/>
+        </w:rPr>
+        <w:t>t qu</w:t>
+      </w:r>
+      <w:r>
+        <w:rPr>
+          <w:rFonts w:ascii="Times New Roman" w:hAnsi="Times New Roman"/>
+          <w:b/>
+          <w:color w:val="1F2937"/>
+          <w:sz w:val="23"/>
+        </w:rPr>
+        <w:t>ả</w:t>
+      </w:r>
+      <w:r>
+        <w:rPr>
+          <w:rFonts w:ascii="Times New Roman" w:hAnsi="Times New Roman"/>
+          <w:b/>
+          <w:color w:val="1F2937"/>
+          <w:sz w:val="23"/>
+        </w:rPr>
+        <w:t xml:space="preserve"> ki</w:t>
+      </w:r>
+      <w:r>
+        <w:rPr>
+          <w:rFonts w:ascii="Times New Roman" w:hAnsi="Times New Roman"/>
+          <w:b/>
+          <w:color w:val="1F2937"/>
+          <w:sz w:val="23"/>
+        </w:rPr>
+        <w:t>ể</w:t>
+      </w:r>
+      <w:r>
+        <w:rPr>
+          <w:rFonts w:ascii="Times New Roman" w:hAnsi="Times New Roman"/>
+          <w:b/>
+          <w:color w:val="1F2937"/>
+          <w:sz w:val="23"/>
+        </w:rPr>
+        <w:t>m ch</w:t>
+      </w:r>
+      <w:r>
+        <w:rPr>
+          <w:rFonts w:ascii="Times New Roman" w:hAnsi="Times New Roman"/>
+          <w:b/>
+          <w:color w:val="1F2937"/>
+          <w:sz w:val="23"/>
+        </w:rPr>
+        <w:t>ứ</w:t>
+      </w:r>
+      <w:r>
+        <w:rPr>
+          <w:rFonts w:ascii="Times New Roman" w:hAnsi="Times New Roman"/>
+          <w:b/>
+          <w:color w:val="1F2937"/>
+          <w:sz w:val="23"/>
+        </w:rPr>
+        <w:t>ng:</w:t>
+      </w:r>
+      <w:r>
+        <w:rPr>
+          <w:rFonts w:ascii="Times New Roman" w:hAnsi="Times New Roman"/>
+          <w:color w:val="1F2937"/>
+          <w:sz w:val="23"/>
+        </w:rPr>
+        <w:t>Truy xu</w:t>
+      </w:r>
+      <w:r>
+        <w:rPr>
+          <w:rFonts w:ascii="Times New Roman" w:hAnsi="Times New Roman"/>
+          <w:color w:val="1F2937"/>
+          <w:sz w:val="23"/>
+        </w:rPr>
+        <w:t>ấ</w:t>
+      </w:r>
+      <w:r>
+        <w:rPr>
+          <w:rFonts w:ascii="Times New Roman" w:hAnsi="Times New Roman"/>
+          <w:color w:val="1F2937"/>
+          <w:sz w:val="23"/>
+        </w:rPr>
+        <w:t>t toàn b</w:t>
+      </w:r>
+      <w:r>
+        <w:rPr>
+          <w:rFonts w:ascii="Times New Roman" w:hAnsi="Times New Roman"/>
+          <w:color w:val="1F2937"/>
+          <w:sz w:val="23"/>
+        </w:rPr>
+        <w:t>ộ</w:t>
+      </w:r>
+      <w:r>
+        <w:rPr>
+          <w:rFonts w:ascii="Times New Roman" w:hAnsi="Times New Roman"/>
+          <w:color w:val="1F2937"/>
+          <w:sz w:val="23"/>
+        </w:rPr>
+        <w:t xml:space="preserve"> lu</w:t>
+      </w:r>
+      <w:r>
+        <w:rPr>
+          <w:rFonts w:ascii="Times New Roman" w:hAnsi="Times New Roman"/>
+          <w:color w:val="1F2937"/>
+          <w:sz w:val="23"/>
+        </w:rPr>
+        <w:t>ồ</w:t>
+      </w:r>
+      <w:r>
+        <w:rPr>
+          <w:rFonts w:ascii="Times New Roman" w:hAnsi="Times New Roman"/>
+          <w:color w:val="1F2937"/>
+          <w:sz w:val="23"/>
+        </w:rPr>
+        <w:t>ng x</w:t>
+      </w:r>
+      <w:r>
+        <w:rPr>
+          <w:rFonts w:ascii="Times New Roman" w:hAnsi="Times New Roman"/>
+          <w:color w:val="1F2937"/>
+          <w:sz w:val="23"/>
+        </w:rPr>
+        <w:t>ử</w:t>
+      </w:r>
+      <w:r>
+        <w:rPr>
+          <w:rFonts w:ascii="Times New Roman" w:hAnsi="Times New Roman"/>
+          <w:color w:val="1F2937"/>
+          <w:sz w:val="23"/>
+        </w:rPr>
+        <w:t xml:space="preserve"> lý c</w:t>
+      </w:r>
+      <w:r>
+        <w:rPr>
+          <w:rFonts w:ascii="Times New Roman" w:hAnsi="Times New Roman"/>
+          <w:color w:val="1F2937"/>
+          <w:sz w:val="23"/>
+        </w:rPr>
+        <w:t>ủ</w:t>
+      </w:r>
+      <w:r>
+        <w:rPr>
+          <w:rFonts w:ascii="Times New Roman" w:hAnsi="Times New Roman"/>
+          <w:color w:val="1F2937"/>
+          <w:sz w:val="23"/>
+        </w:rPr>
+        <w:t>a PHP-FPM worker khi nh</w:t>
+      </w:r>
+      <w:r>
+        <w:rPr>
+          <w:rFonts w:ascii="Times New Roman" w:hAnsi="Times New Roman"/>
+          <w:color w:val="1F2937"/>
+          <w:sz w:val="23"/>
+        </w:rPr>
+        <w:t>ậ</w:t>
+      </w:r>
+      <w:r>
+        <w:rPr>
+          <w:rFonts w:ascii="Times New Roman" w:hAnsi="Times New Roman"/>
+          <w:color w:val="1F2937"/>
+          <w:sz w:val="23"/>
+        </w:rPr>
+        <w:t>n yêu c</w:t>
+      </w:r>
+      <w:r>
+        <w:rPr>
+          <w:rFonts w:ascii="Times New Roman" w:hAnsi="Times New Roman"/>
+          <w:color w:val="1F2937"/>
+          <w:sz w:val="23"/>
+        </w:rPr>
+        <w:t>ầ</w:t>
+      </w:r>
+      <w:r>
+        <w:rPr>
+          <w:rFonts w:ascii="Times New Roman" w:hAnsi="Times New Roman"/>
+          <w:color w:val="1F2937"/>
+          <w:sz w:val="23"/>
+        </w:rPr>
+        <w:t>u FastCGI t</w:t>
+      </w:r>
+      <w:r>
+        <w:rPr>
+          <w:rFonts w:ascii="Times New Roman" w:hAnsi="Times New Roman"/>
+          <w:color w:val="1F2937"/>
+          <w:sz w:val="23"/>
+        </w:rPr>
+        <w:t>ừ</w:t>
+      </w:r>
+      <w:r>
+        <w:rPr>
+          <w:rFonts w:ascii="Times New Roman" w:hAnsi="Times New Roman"/>
+          <w:color w:val="1F2937"/>
+          <w:sz w:val="23"/>
+        </w:rPr>
+        <w:t xml:space="preserve"> Nginx, hi</w:t>
+      </w:r>
+      <w:r>
+        <w:rPr>
+          <w:rFonts w:ascii="Times New Roman" w:hAnsi="Times New Roman"/>
+          <w:color w:val="1F2937"/>
+          <w:sz w:val="23"/>
+        </w:rPr>
+        <w:t>ể</w:t>
+      </w:r>
+      <w:r>
+        <w:rPr>
+          <w:rFonts w:ascii="Times New Roman" w:hAnsi="Times New Roman"/>
+          <w:color w:val="1F2937"/>
+          <w:sz w:val="23"/>
+        </w:rPr>
+        <w:t>n th</w:t>
+      </w:r>
+      <w:r>
+        <w:rPr>
+          <w:rFonts w:ascii="Times New Roman" w:hAnsi="Times New Roman"/>
+          <w:color w:val="1F2937"/>
+          <w:sz w:val="23"/>
+        </w:rPr>
+        <w:t>ị</w:t>
+      </w:r>
+      <w:r>
+        <w:rPr>
+          <w:rFonts w:ascii="Times New Roman" w:hAnsi="Times New Roman"/>
+          <w:color w:val="1F2937"/>
+          <w:sz w:val="23"/>
+        </w:rPr>
+        <w:t xml:space="preserve"> chi ti</w:t>
+      </w:r>
+      <w:r>
+        <w:rPr>
+          <w:rFonts w:ascii="Times New Roman" w:hAnsi="Times New Roman"/>
+          <w:color w:val="1F2937"/>
+          <w:sz w:val="23"/>
+        </w:rPr>
+        <w:t>ế</w:t>
+      </w:r>
+      <w:r>
+        <w:rPr>
+          <w:rFonts w:ascii="Times New Roman" w:hAnsi="Times New Roman"/>
+          <w:color w:val="1F2937"/>
+          <w:sz w:val="23"/>
+        </w:rPr>
+        <w:t>t th</w:t>
+      </w:r>
+      <w:r>
+        <w:rPr>
+          <w:rFonts w:ascii="Times New Roman" w:hAnsi="Times New Roman"/>
+          <w:color w:val="1F2937"/>
+          <w:sz w:val="23"/>
+        </w:rPr>
+        <w:t>ờ</w:t>
+      </w:r>
+      <w:r>
+        <w:rPr>
+          <w:rFonts w:ascii="Times New Roman" w:hAnsi="Times New Roman"/>
+          <w:color w:val="1F2937"/>
+          <w:sz w:val="23"/>
+        </w:rPr>
+        <w:t>i gian ph</w:t>
+      </w:r>
+      <w:r>
+        <w:rPr>
+          <w:rFonts w:ascii="Times New Roman" w:hAnsi="Times New Roman"/>
+          <w:color w:val="1F2937"/>
+          <w:sz w:val="23"/>
+        </w:rPr>
+        <w:t>ả</w:t>
+      </w:r>
+      <w:r>
+        <w:rPr>
+          <w:rFonts w:ascii="Times New Roman" w:hAnsi="Times New Roman"/>
+          <w:color w:val="1F2937"/>
+          <w:sz w:val="23"/>
+        </w:rPr>
+        <w:t>n h</w:t>
+      </w:r>
+      <w:r>
+        <w:rPr>
+          <w:rFonts w:ascii="Times New Roman" w:hAnsi="Times New Roman"/>
+          <w:color w:val="1F2937"/>
+          <w:sz w:val="23"/>
+        </w:rPr>
+        <w:t>ồ</w:t>
+      </w:r>
+      <w:r>
+        <w:rPr>
+          <w:rFonts w:ascii="Times New Roman" w:hAnsi="Times New Roman"/>
+          <w:color w:val="1F2937"/>
+          <w:sz w:val="23"/>
+        </w:rPr>
+        <w:t>i và mã tr</w:t>
+      </w:r>
+      <w:r>
+        <w:rPr>
+          <w:rFonts w:ascii="Times New Roman" w:hAnsi="Times New Roman"/>
+          <w:color w:val="1F2937"/>
+          <w:sz w:val="23"/>
+        </w:rPr>
+        <w:t>ạ</w:t>
+      </w:r>
+      <w:r>
+        <w:rPr>
+          <w:rFonts w:ascii="Times New Roman" w:hAnsi="Times New Roman"/>
+          <w:color w:val="1F2937"/>
+          <w:sz w:val="23"/>
+        </w:rPr>
+        <w:t>ng thái HTTP th</w:t>
+      </w:r>
+      <w:r>
+        <w:rPr>
+          <w:rFonts w:ascii="Times New Roman" w:hAnsi="Times New Roman"/>
+          <w:color w:val="1F2937"/>
+          <w:sz w:val="23"/>
+        </w:rPr>
+        <w:t>ự</w:t>
+      </w:r>
+      <w:r>
+        <w:rPr>
+          <w:rFonts w:ascii="Times New Roman" w:hAnsi="Times New Roman"/>
+          <w:color w:val="1F2937"/>
+          <w:sz w:val="23"/>
+        </w:rPr>
+        <w:t>c t</w:t>
+      </w:r>
+      <w:r>
+        <w:rPr>
+          <w:rFonts w:ascii="Times New Roman" w:hAnsi="Times New Roman"/>
+          <w:color w:val="1F2937"/>
+          <w:sz w:val="23"/>
+        </w:rPr>
+        <w:t>ế</w:t>
+      </w:r>
+      <w:r>
+        <w:rPr>
+          <w:rFonts w:ascii="Times New Roman" w:hAnsi="Times New Roman"/>
+          <w:color w:val="1F2937"/>
+          <w:sz w:val="23"/>
+        </w:rPr>
+        <w:t>.</w:t>
+      </w:r>
+    </w:p>
+    <w:p>
+      <w:pPr>
+        <w:keepNext/>
+        <w:spacing w:before="160" w:after="40"/>
+      </w:pPr>
+      <w:r>
+        <w:rPr>
+          <w:rFonts w:ascii="Times New Roman" w:hAnsi="Times New Roman"/>
+          <w:b/>
+          <w:i/>
+          <w:color w:val="2D3748"/>
+          <w:sz w:val="23"/>
+        </w:rPr>
+        <w:t>Truy v</w:t>
+      </w:r>
+      <w:r>
+        <w:rPr>
+          <w:rFonts w:ascii="Times New Roman" w:hAnsi="Times New Roman"/>
+          <w:b/>
+          <w:i/>
+          <w:color w:val="2D3748"/>
+          <w:sz w:val="23"/>
+        </w:rPr>
+        <w:t>ấ</w:t>
+      </w:r>
+      <w:r>
+        <w:rPr>
+          <w:rFonts w:ascii="Times New Roman" w:hAnsi="Times New Roman"/>
+          <w:b/>
+          <w:i/>
+          <w:color w:val="2D3748"/>
+          <w:sz w:val="23"/>
+        </w:rPr>
+        <w:t>n 5: Đo lư</w:t>
+      </w:r>
+      <w:r>
+        <w:rPr>
+          <w:rFonts w:ascii="Times New Roman" w:hAnsi="Times New Roman"/>
+          <w:b/>
+          <w:i/>
+          <w:color w:val="2D3748"/>
+          <w:sz w:val="23"/>
+        </w:rPr>
+        <w:t>ờ</w:t>
+      </w:r>
+      <w:r>
+        <w:rPr>
+          <w:rFonts w:ascii="Times New Roman" w:hAnsi="Times New Roman"/>
+          <w:b/>
+          <w:i/>
+          <w:color w:val="2D3748"/>
+          <w:sz w:val="23"/>
+        </w:rPr>
+        <w:t>ng t</w:t>
+      </w:r>
+      <w:r>
+        <w:rPr>
+          <w:rFonts w:ascii="Times New Roman" w:hAnsi="Times New Roman"/>
+          <w:b/>
+          <w:i/>
+          <w:color w:val="2D3748"/>
+          <w:sz w:val="23"/>
+        </w:rPr>
+        <w:t>ầ</w:t>
+      </w:r>
+      <w:r>
+        <w:rPr>
+          <w:rFonts w:ascii="Times New Roman" w:hAnsi="Times New Roman"/>
+          <w:b/>
+          <w:i/>
+          <w:color w:val="2D3748"/>
+          <w:sz w:val="23"/>
+        </w:rPr>
+        <w:t>n su</w:t>
+      </w:r>
+      <w:r>
+        <w:rPr>
+          <w:rFonts w:ascii="Times New Roman" w:hAnsi="Times New Roman"/>
+          <w:b/>
+          <w:i/>
+          <w:color w:val="2D3748"/>
+          <w:sz w:val="23"/>
+        </w:rPr>
+        <w:t>ấ</w:t>
+      </w:r>
+      <w:r>
+        <w:rPr>
+          <w:rFonts w:ascii="Times New Roman" w:hAnsi="Times New Roman"/>
+          <w:b/>
+          <w:i/>
+          <w:color w:val="2D3748"/>
+          <w:sz w:val="23"/>
+        </w:rPr>
+        <w:t>t request trên giây trong c</w:t>
+      </w:r>
+      <w:r>
+        <w:rPr>
+          <w:rFonts w:ascii="Times New Roman" w:hAnsi="Times New Roman"/>
+          <w:b/>
+          <w:i/>
+          <w:color w:val="2D3748"/>
+          <w:sz w:val="23"/>
+        </w:rPr>
+        <w:t>ử</w:t>
+      </w:r>
+      <w:r>
+        <w:rPr>
+          <w:rFonts w:ascii="Times New Roman" w:hAnsi="Times New Roman"/>
+          <w:b/>
+          <w:i/>
+          <w:color w:val="2D3748"/>
+          <w:sz w:val="23"/>
+        </w:rPr>
+        <w:t>a s</w:t>
+      </w:r>
+      <w:r>
+        <w:rPr>
+          <w:rFonts w:ascii="Times New Roman" w:hAnsi="Times New Roman"/>
+          <w:b/>
+          <w:i/>
+          <w:color w:val="2D3748"/>
+          <w:sz w:val="23"/>
+        </w:rPr>
+        <w:t>ổ</w:t>
+      </w:r>
+      <w:r>
+        <w:rPr>
+          <w:rFonts w:ascii="Times New Roman" w:hAnsi="Times New Roman"/>
+          <w:b/>
+          <w:i/>
+          <w:color w:val="2D3748"/>
+          <w:sz w:val="23"/>
+        </w:rPr>
+        <w:t xml:space="preserve"> 1 phút (Requests per Second - RPS)</w:t>
+      </w:r>
+    </w:p>
+    <w:p>
+      <w:pPr>
+        <w:pStyle w:val="Duudong"/>
+        <w:spacing w:before="20" w:after="60" w:line="300" w:lineRule="auto"/>
+      </w:pPr>
+      <w:r>
+        <w:rPr>
+          <w:rFonts w:ascii="Times New Roman" w:hAnsi="Times New Roman"/>
+          <w:b/>
+          <w:color w:val="1F2937"/>
+          <w:sz w:val="23"/>
+        </w:rPr>
+        <w:t>Câu l</w:t>
+      </w:r>
+      <w:r>
+        <w:rPr>
+          <w:rFonts w:ascii="Times New Roman" w:hAnsi="Times New Roman"/>
+          <w:b/>
+          <w:color w:val="1F2937"/>
+          <w:sz w:val="23"/>
+        </w:rPr>
+        <w:t>ệ</w:t>
+      </w:r>
+      <w:r>
+        <w:rPr>
+          <w:rFonts w:ascii="Times New Roman" w:hAnsi="Times New Roman"/>
+          <w:b/>
+          <w:color w:val="1F2937"/>
+          <w:sz w:val="23"/>
+        </w:rPr>
+        <w:t>nh LogQL:</w:t>
+      </w:r>
+      <w:r>
+        <w:rPr>
+          <w:rFonts w:ascii="Times New Roman" w:hAnsi="Times New Roman"/>
+          <w:color w:val="1F2937"/>
+          <w:sz w:val="23"/>
+        </w:rPr>
+        <w:t>rate({service="nginx"}[1m])</w:t>
+      </w:r>
+    </w:p>
+    <w:p>
+      <w:pPr>
+        <w:pStyle w:val="Duudong"/>
+        <w:spacing w:before="20" w:after="60" w:line="300" w:lineRule="auto"/>
+      </w:pPr>
+      <w:r>
+        <w:rPr>
+          <w:rFonts w:ascii="Times New Roman" w:hAnsi="Times New Roman"/>
+          <w:b/>
+          <w:color w:val="1F2937"/>
+          <w:sz w:val="23"/>
+        </w:rPr>
         <w:t>Phân tích &amp; K</w:t>
       </w:r>
       <w:r>
@@ -14569,39 +15875,135 @@
           <w:color w:val="1F2937"/>
           <w:sz w:val="23"/>
         </w:rPr>
-        <w:t>i gian 1 phút. Khác v</w:t>
-      </w:r>
-      <w:r>
-        <w:rPr>
-          <w:rFonts w:ascii="Times New Roman" w:hAnsi="Times New Roman"/>
-          <w:color w:val="1F2937"/>
-          <w:sz w:val="23"/>
-        </w:rPr>
-        <w:t>ớ</w:t>
-      </w:r>
-      <w:r>
-        <w:rPr>
-          <w:rFonts w:ascii="Times New Roman" w:hAnsi="Times New Roman"/>
-          <w:color w:val="1F2937"/>
-          <w:sz w:val="23"/>
-        </w:rPr>
-        <w:t>i hàm count_over_time({service="nginx"}[1m]) dùng đ</w:t>
-      </w:r>
-      <w:r>
-        <w:rPr>
-          <w:rFonts w:ascii="Times New Roman" w:hAnsi="Times New Roman"/>
-          <w:color w:val="1F2937"/>
-          <w:sz w:val="23"/>
-        </w:rPr>
-        <w:t>ể</w:t>
-      </w:r>
-      <w:r>
-        <w:rPr>
-          <w:rFonts w:ascii="Times New Roman" w:hAnsi="Times New Roman"/>
-          <w:color w:val="1F2937"/>
-          <w:sz w:val="23"/>
-        </w:rPr>
-        <w:t xml:space="preserve"> đ</w:t>
+        <w:t>i gian 1 phút nh</w:t>
+      </w:r>
+      <w:r>
+        <w:rPr>
+          <w:rFonts w:ascii="Times New Roman" w:hAnsi="Times New Roman"/>
+          <w:color w:val="1F2937"/>
+          <w:sz w:val="23"/>
+        </w:rPr>
+        <w:t>ằ</w:t>
+      </w:r>
+      <w:r>
+        <w:rPr>
+          <w:rFonts w:ascii="Times New Roman" w:hAnsi="Times New Roman"/>
+          <w:color w:val="1F2937"/>
+          <w:sz w:val="23"/>
+        </w:rPr>
+        <w:t>m phát hi</w:t>
+      </w:r>
+      <w:r>
+        <w:rPr>
+          <w:rFonts w:ascii="Times New Roman" w:hAnsi="Times New Roman"/>
+          <w:color w:val="1F2937"/>
+          <w:sz w:val="23"/>
+        </w:rPr>
+        <w:t>ệ</w:t>
+      </w:r>
+      <w:r>
+        <w:rPr>
+          <w:rFonts w:ascii="Times New Roman" w:hAnsi="Times New Roman"/>
+          <w:color w:val="1F2937"/>
+          <w:sz w:val="23"/>
+        </w:rPr>
+        <w:t>n t</w:t>
+      </w:r>
+      <w:r>
+        <w:rPr>
+          <w:rFonts w:ascii="Times New Roman" w:hAnsi="Times New Roman"/>
+          <w:color w:val="1F2937"/>
+          <w:sz w:val="23"/>
+        </w:rPr>
+        <w:t>ứ</w:t>
+      </w:r>
+      <w:r>
+        <w:rPr>
+          <w:rFonts w:ascii="Times New Roman" w:hAnsi="Times New Roman"/>
+          <w:color w:val="1F2937"/>
+          <w:sz w:val="23"/>
+        </w:rPr>
+        <w:t>c th</w:t>
+      </w:r>
+      <w:r>
+        <w:rPr>
+          <w:rFonts w:ascii="Times New Roman" w:hAnsi="Times New Roman"/>
+          <w:color w:val="1F2937"/>
+          <w:sz w:val="23"/>
+        </w:rPr>
+        <w:t>ờ</w:t>
+      </w:r>
+      <w:r>
+        <w:rPr>
+          <w:rFonts w:ascii="Times New Roman" w:hAnsi="Times New Roman"/>
+          <w:color w:val="1F2937"/>
+          <w:sz w:val="23"/>
+        </w:rPr>
+        <w:t>i các đ</w:t>
+      </w:r>
+      <w:r>
+        <w:rPr>
+          <w:rFonts w:ascii="Times New Roman" w:hAnsi="Times New Roman"/>
+          <w:color w:val="1F2937"/>
+          <w:sz w:val="23"/>
+        </w:rPr>
+        <w:t>ợ</w:t>
+      </w:r>
+      <w:r>
+        <w:rPr>
+          <w:rFonts w:ascii="Times New Roman" w:hAnsi="Times New Roman"/>
+          <w:color w:val="1F2937"/>
+          <w:sz w:val="23"/>
+        </w:rPr>
+        <w:t>t lưu lư</w:t>
+      </w:r>
+      <w:r>
+        <w:rPr>
+          <w:rFonts w:ascii="Times New Roman" w:hAnsi="Times New Roman"/>
+          <w:color w:val="1F2937"/>
+          <w:sz w:val="23"/>
+        </w:rPr>
+        <w:t>ợ</w:t>
+      </w:r>
+      <w:r>
+        <w:rPr>
+          <w:rFonts w:ascii="Times New Roman" w:hAnsi="Times New Roman"/>
+          <w:color w:val="1F2937"/>
+          <w:sz w:val="23"/>
+        </w:rPr>
+        <w:t>ng truy c</w:t>
+      </w:r>
+      <w:r>
+        <w:rPr>
+          <w:rFonts w:ascii="Times New Roman" w:hAnsi="Times New Roman"/>
+          <w:color w:val="1F2937"/>
+          <w:sz w:val="23"/>
+        </w:rPr>
+        <w:t>ậ</w:t>
+      </w:r>
+      <w:r>
+        <w:rPr>
+          <w:rFonts w:ascii="Times New Roman" w:hAnsi="Times New Roman"/>
+          <w:color w:val="1F2937"/>
+          <w:sz w:val="23"/>
+        </w:rPr>
+        <w:t>p đ</w:t>
+      </w:r>
+      <w:r>
+        <w:rPr>
+          <w:rFonts w:ascii="Times New Roman" w:hAnsi="Times New Roman"/>
+          <w:color w:val="1F2937"/>
+          <w:sz w:val="23"/>
+        </w:rPr>
+        <w:t>ộ</w:t>
+      </w:r>
+      <w:r>
+        <w:rPr>
+          <w:rFonts w:ascii="Times New Roman" w:hAnsi="Times New Roman"/>
+          <w:color w:val="1F2937"/>
+          <w:sz w:val="23"/>
+        </w:rPr>
+        <w:t>t bi</w:t>
       </w:r>
       <w:r>
         <w:rPr>
@@ -14617,183 +16019,7 @@
           <w:color w:val="1F2937"/>
           <w:sz w:val="23"/>
         </w:rPr>
-        <w:t>m t</w:t>
-      </w:r>
-      <w:r>
-        <w:rPr>
-          <w:rFonts w:ascii="Times New Roman" w:hAnsi="Times New Roman"/>
-          <w:color w:val="1F2937"/>
-          <w:sz w:val="23"/>
-        </w:rPr>
-        <w:t>ổ</w:t>
-      </w:r>
-      <w:r>
-        <w:rPr>
-          <w:rFonts w:ascii="Times New Roman" w:hAnsi="Times New Roman"/>
-          <w:color w:val="1F2937"/>
-          <w:sz w:val="23"/>
-        </w:rPr>
-        <w:t>ng s</w:t>
-      </w:r>
-      <w:r>
-        <w:rPr>
-          <w:rFonts w:ascii="Times New Roman" w:hAnsi="Times New Roman"/>
-          <w:color w:val="1F2937"/>
-          <w:sz w:val="23"/>
-        </w:rPr>
-        <w:t>ố</w:t>
-      </w:r>
-      <w:r>
-        <w:rPr>
-          <w:rFonts w:ascii="Times New Roman" w:hAnsi="Times New Roman"/>
-          <w:color w:val="1F2937"/>
-          <w:sz w:val="23"/>
-        </w:rPr>
-        <w:t xml:space="preserve"> request trong 1 phút, hàm rate tính toán giá tr</w:t>
-      </w:r>
-      <w:r>
-        <w:rPr>
-          <w:rFonts w:ascii="Times New Roman" w:hAnsi="Times New Roman"/>
-          <w:color w:val="1F2937"/>
-          <w:sz w:val="23"/>
-        </w:rPr>
-        <w:t>ị</w:t>
-      </w:r>
-      <w:r>
-        <w:rPr>
-          <w:rFonts w:ascii="Times New Roman" w:hAnsi="Times New Roman"/>
-          <w:color w:val="1F2937"/>
-          <w:sz w:val="23"/>
-        </w:rPr>
-        <w:t xml:space="preserve"> đ</w:t>
-      </w:r>
-      <w:r>
-        <w:rPr>
-          <w:rFonts w:ascii="Times New Roman" w:hAnsi="Times New Roman"/>
-          <w:color w:val="1F2937"/>
-          <w:sz w:val="23"/>
-        </w:rPr>
-        <w:t>ạ</w:t>
-      </w:r>
-      <w:r>
-        <w:rPr>
-          <w:rFonts w:ascii="Times New Roman" w:hAnsi="Times New Roman"/>
-          <w:color w:val="1F2937"/>
-          <w:sz w:val="23"/>
-        </w:rPr>
-        <w:t>o hàm theo th</w:t>
-      </w:r>
-      <w:r>
-        <w:rPr>
-          <w:rFonts w:ascii="Times New Roman" w:hAnsi="Times New Roman"/>
-          <w:color w:val="1F2937"/>
-          <w:sz w:val="23"/>
-        </w:rPr>
-        <w:t>ờ</w:t>
-      </w:r>
-      <w:r>
-        <w:rPr>
-          <w:rFonts w:ascii="Times New Roman" w:hAnsi="Times New Roman"/>
-          <w:color w:val="1F2937"/>
-          <w:sz w:val="23"/>
-        </w:rPr>
-        <w:t>i gian th</w:t>
-      </w:r>
-      <w:r>
-        <w:rPr>
-          <w:rFonts w:ascii="Times New Roman" w:hAnsi="Times New Roman"/>
-          <w:color w:val="1F2937"/>
-          <w:sz w:val="23"/>
-        </w:rPr>
-        <w:t>ự</w:t>
-      </w:r>
-      <w:r>
-        <w:rPr>
-          <w:rFonts w:ascii="Times New Roman" w:hAnsi="Times New Roman"/>
-          <w:color w:val="1F2937"/>
-          <w:sz w:val="23"/>
-        </w:rPr>
-        <w:t>c đ</w:t>
-      </w:r>
-      <w:r>
-        <w:rPr>
-          <w:rFonts w:ascii="Times New Roman" w:hAnsi="Times New Roman"/>
-          <w:color w:val="1F2937"/>
-          <w:sz w:val="23"/>
-        </w:rPr>
-        <w:t>ể</w:t>
-      </w:r>
-      <w:r>
-        <w:rPr>
-          <w:rFonts w:ascii="Times New Roman" w:hAnsi="Times New Roman"/>
-          <w:color w:val="1F2937"/>
-          <w:sz w:val="23"/>
-        </w:rPr>
-        <w:t xml:space="preserve"> bi</w:t>
-      </w:r>
-      <w:r>
-        <w:rPr>
-          <w:rFonts w:ascii="Times New Roman" w:hAnsi="Times New Roman"/>
-          <w:color w:val="1F2937"/>
-          <w:sz w:val="23"/>
-        </w:rPr>
-        <w:t>ể</w:t>
-      </w:r>
-      <w:r>
-        <w:rPr>
-          <w:rFonts w:ascii="Times New Roman" w:hAnsi="Times New Roman"/>
-          <w:color w:val="1F2937"/>
-          <w:sz w:val="23"/>
-        </w:rPr>
-        <w:t>u di</w:t>
-      </w:r>
-      <w:r>
-        <w:rPr>
-          <w:rFonts w:ascii="Times New Roman" w:hAnsi="Times New Roman"/>
-          <w:color w:val="1F2937"/>
-          <w:sz w:val="23"/>
-        </w:rPr>
-        <w:t>ễ</w:t>
-      </w:r>
-      <w:r>
-        <w:rPr>
-          <w:rFonts w:ascii="Times New Roman" w:hAnsi="Times New Roman"/>
-          <w:color w:val="1F2937"/>
-          <w:sz w:val="23"/>
-        </w:rPr>
-        <w:t>n lưu lư</w:t>
-      </w:r>
-      <w:r>
-        <w:rPr>
-          <w:rFonts w:ascii="Times New Roman" w:hAnsi="Times New Roman"/>
-          <w:color w:val="1F2937"/>
-          <w:sz w:val="23"/>
-        </w:rPr>
-        <w:t>ợ</w:t>
-      </w:r>
-      <w:r>
-        <w:rPr>
-          <w:rFonts w:ascii="Times New Roman" w:hAnsi="Times New Roman"/>
-          <w:color w:val="1F2937"/>
-          <w:sz w:val="23"/>
-        </w:rPr>
-        <w:t>ng truy c</w:t>
-      </w:r>
-      <w:r>
-        <w:rPr>
-          <w:rFonts w:ascii="Times New Roman" w:hAnsi="Times New Roman"/>
-          <w:color w:val="1F2937"/>
-          <w:sz w:val="23"/>
-        </w:rPr>
-        <w:t>ậ</w:t>
-      </w:r>
-      <w:r>
-        <w:rPr>
-          <w:rFonts w:ascii="Times New Roman" w:hAnsi="Times New Roman"/>
-          <w:color w:val="1F2937"/>
-          <w:sz w:val="23"/>
-        </w:rPr>
-        <w:t>p.</w:t>
+        <w:t>n (traffic spike).</w:t>
       </w:r>
     </w:p>
     <w:p>
@@ -16739,7 +17965,23 @@
                 <w:color w:val="1F2937"/>
                 <w:sz w:val="19"/>
               </w:rPr>
-              <w:t>B</w:t>
+              <w:t>Tiêu đ</w:t>
+            </w:r>
+            <w:r>
+              <w:rPr>
+                <w:rFonts w:ascii="Times New Roman" w:hAnsi="Times New Roman"/>
+                <w:color w:val="1F2937"/>
+                <w:sz w:val="19"/>
+              </w:rPr>
+              <w:t>ề</w:t>
+            </w:r>
+            <w:r>
+              <w:rPr>
+                <w:rFonts w:ascii="Times New Roman" w:hAnsi="Times New Roman"/>
+                <w:color w:val="1F2937"/>
+                <w:sz w:val="19"/>
+              </w:rPr>
+              <w:t xml:space="preserve"> b</w:t>
             </w:r>
             <w:r>
               <w:rPr>
@@ -16755,23 +17997,23 @@
                 <w:color w:val="1F2937"/>
                 <w:sz w:val="19"/>
               </w:rPr>
-              <w:t>o v</w:t>
-            </w:r>
-            <w:r>
-              <w:rPr>
-                <w:rFonts w:ascii="Times New Roman" w:hAnsi="Times New Roman"/>
-                <w:color w:val="1F2937"/>
-                <w:sz w:val="19"/>
-              </w:rPr>
-              <w:t>ệ</w:t>
-            </w:r>
-            <w:r>
-              <w:rPr>
-                <w:rFonts w:ascii="Times New Roman" w:hAnsi="Times New Roman"/>
-                <w:color w:val="1F2937"/>
-                <w:sz w:val="19"/>
-              </w:rPr>
-              <w:t xml:space="preserve"> Uploads</w:t>
+              <w:t>o m</w:t>
+            </w:r>
+            <w:r>
+              <w:rPr>
+                <w:rFonts w:ascii="Times New Roman" w:hAnsi="Times New Roman"/>
+                <w:color w:val="1F2937"/>
+                <w:sz w:val="19"/>
+              </w:rPr>
+              <w:t>ậ</w:t>
+            </w:r>
+            <w:r>
+              <w:rPr>
+                <w:rFonts w:ascii="Times New Roman" w:hAnsi="Times New Roman"/>
+                <w:color w:val="1F2937"/>
+                <w:sz w:val="19"/>
+              </w:rPr>
+              <w:t>t HTTPS</w:t>
             </w:r>
           </w:p>
         </w:tc>
@@ -16797,7 +18039,7 @@
                 <w:color w:val="1F2937"/>
                 <w:sz w:val="19"/>
               </w:rPr>
-              <w:t>location /uploads/ { location ~ \.php$ { deny all; } }</w:t>
+              <w:t>HSTS, nosniff, SAMEORIGIN, CSP, Referrer</w:t>
             </w:r>
           </w:p>
         </w:tc>
@@ -16823,23 +18065,7 @@
                 <w:color w:val="1F2937"/>
                 <w:sz w:val="19"/>
               </w:rPr>
-              <w:t>Truy c</w:t>
-            </w:r>
-            <w:r>
-              <w:rPr>
-                <w:rFonts w:ascii="Times New Roman" w:hAnsi="Times New Roman"/>
-                <w:color w:val="1F2937"/>
-                <w:sz w:val="19"/>
-              </w:rPr>
-              <w:t>ậ</w:t>
-            </w:r>
-            <w:r>
-              <w:rPr>
-                <w:rFonts w:ascii="Times New Roman" w:hAnsi="Times New Roman"/>
-                <w:color w:val="1F2937"/>
-                <w:sz w:val="19"/>
-              </w:rPr>
-              <w:t>p https://localhost/uploads/test_block.php</w:t>
+              <w:t>curl.exe -skI https://localhost</w:t>
             </w:r>
           </w:p>
         </w:tc>
@@ -16865,39 +18091,39 @@
                 <w:color w:val="1F2937"/>
                 <w:sz w:val="19"/>
               </w:rPr>
-              <w:t>Tr</w:t>
-            </w:r>
-            <w:r>
-              <w:rPr>
-                <w:rFonts w:ascii="Times New Roman" w:hAnsi="Times New Roman"/>
-                <w:color w:val="1F2937"/>
-                <w:sz w:val="19"/>
-              </w:rPr>
-              <w:t>ả</w:t>
-            </w:r>
-            <w:r>
-              <w:rPr>
-                <w:rFonts w:ascii="Times New Roman" w:hAnsi="Times New Roman"/>
-                <w:color w:val="1F2937"/>
-                <w:sz w:val="19"/>
-              </w:rPr>
-              <w:t xml:space="preserve"> v</w:t>
-            </w:r>
-            <w:r>
-              <w:rPr>
-                <w:rFonts w:ascii="Times New Roman" w:hAnsi="Times New Roman"/>
-                <w:color w:val="1F2937"/>
-                <w:sz w:val="19"/>
-              </w:rPr>
-              <w:t>ề</w:t>
-            </w:r>
-            <w:r>
-              <w:rPr>
-                <w:rFonts w:ascii="Times New Roman" w:hAnsi="Times New Roman"/>
-                <w:color w:val="1F2937"/>
-                <w:sz w:val="19"/>
-              </w:rPr>
-              <w:t xml:space="preserve"> HTTP 403 Forbidden - Đã ki</w:t>
+              <w:t>Đ</w:t>
+            </w:r>
+            <w:r>
+              <w:rPr>
+                <w:rFonts w:ascii="Times New Roman" w:hAnsi="Times New Roman"/>
+                <w:color w:val="1F2937"/>
+                <w:sz w:val="19"/>
+              </w:rPr>
+              <w:t>ầ</w:t>
+            </w:r>
+            <w:r>
+              <w:rPr>
+                <w:rFonts w:ascii="Times New Roman" w:hAnsi="Times New Roman"/>
+                <w:color w:val="1F2937"/>
+                <w:sz w:val="19"/>
+              </w:rPr>
+              <w:t>y đ</w:t>
+            </w:r>
+            <w:r>
+              <w:rPr>
+                <w:rFonts w:ascii="Times New Roman" w:hAnsi="Times New Roman"/>
+                <w:color w:val="1F2937"/>
+                <w:sz w:val="19"/>
+              </w:rPr>
+              <w:t>ủ</w:t>
+            </w:r>
+            <w:r>
+              <w:rPr>
+                <w:rFonts w:ascii="Times New Roman" w:hAnsi="Times New Roman"/>
+                <w:color w:val="1F2937"/>
+                <w:sz w:val="19"/>
+              </w:rPr>
+              <w:t xml:space="preserve"> 6 security headers - Đã ki</w:t>
             </w:r>
             <w:r>
               <w:rPr>
@@ -17009,7 +18235,39 @@
                 <w:color w:val="1F2937"/>
                 <w:sz w:val="19"/>
               </w:rPr>
-              <w:t xml:space="preserve"> Secret</w:t>
+              <w:t xml:space="preserve"> Uploads &amp; Ch</w:t>
+            </w:r>
+            <w:r>
+              <w:rPr>
+                <w:rFonts w:ascii="Times New Roman" w:hAnsi="Times New Roman"/>
+                <w:color w:val="1F2937"/>
+                <w:sz w:val="19"/>
+              </w:rPr>
+              <w:t>ặ</w:t>
+            </w:r>
+            <w:r>
+              <w:rPr>
+                <w:rFonts w:ascii="Times New Roman" w:hAnsi="Times New Roman"/>
+                <w:color w:val="1F2937"/>
+                <w:sz w:val="19"/>
+              </w:rPr>
+              <w:t>n t</w:t>
+            </w:r>
+            <w:r>
+              <w:rPr>
+                <w:rFonts w:ascii="Times New Roman" w:hAnsi="Times New Roman"/>
+                <w:color w:val="1F2937"/>
+                <w:sz w:val="19"/>
+              </w:rPr>
+              <w:t>ệ</w:t>
+            </w:r>
+            <w:r>
+              <w:rPr>
+                <w:rFonts w:ascii="Times New Roman" w:hAnsi="Times New Roman"/>
+                <w:color w:val="1F2937"/>
+                <w:sz w:val="19"/>
+              </w:rPr>
+              <w:t>p</w:t>
             </w:r>
           </w:p>
         </w:tc>
@@ -17035,7 +18293,7 @@
                 <w:color w:val="1F2937"/>
                 <w:sz w:val="19"/>
               </w:rPr>
-              <w:t>.gitignore ch</w:t>
+              <w:t>location ~ /\. { deny all; } &amp; ch</w:t>
             </w:r>
             <w:r>
               <w:rPr>
@@ -17051,7 +18309,7 @@
                 <w:color w:val="1F2937"/>
                 <w:sz w:val="19"/>
               </w:rPr>
-              <w:t>n .env, *.key, backups</w:t>
+              <w:t>n shell.php</w:t>
             </w:r>
           </w:p>
         </w:tc>
@@ -17077,7 +18335,23 @@
                 <w:color w:val="1F2937"/>
                 <w:sz w:val="19"/>
               </w:rPr>
-              <w:t>git log --all --full-history -- '.env'</w:t>
+              <w:t>Truy c</w:t>
+            </w:r>
+            <w:r>
+              <w:rPr>
+                <w:rFonts w:ascii="Times New Roman" w:hAnsi="Times New Roman"/>
+                <w:color w:val="1F2937"/>
+                <w:sz w:val="19"/>
+              </w:rPr>
+              <w:t>ậ</w:t>
+            </w:r>
+            <w:r>
+              <w:rPr>
+                <w:rFonts w:ascii="Times New Roman" w:hAnsi="Times New Roman"/>
+                <w:color w:val="1F2937"/>
+                <w:sz w:val="19"/>
+              </w:rPr>
+              <w:t>p https://localhost/.env và uploads/*.php</w:t>
             </w:r>
           </w:p>
         </w:tc>
@@ -17103,23 +18377,235 @@
                 <w:color w:val="1F2937"/>
                 <w:sz w:val="19"/>
               </w:rPr>
-              <w:t>Không có secret trong l</w:t>
-            </w:r>
-            <w:r>
-              <w:rPr>
-                <w:rFonts w:ascii="Times New Roman" w:hAnsi="Times New Roman"/>
-                <w:color w:val="1F2937"/>
-                <w:sz w:val="19"/>
-              </w:rPr>
-              <w:t>ị</w:t>
-            </w:r>
-            <w:r>
-              <w:rPr>
-                <w:rFonts w:ascii="Times New Roman" w:hAnsi="Times New Roman"/>
-                <w:color w:val="1F2937"/>
-                <w:sz w:val="19"/>
-              </w:rPr>
-              <w:t>ch s</w:t>
+              <w:t>Tr</w:t>
+            </w:r>
+            <w:r>
+              <w:rPr>
+                <w:rFonts w:ascii="Times New Roman" w:hAnsi="Times New Roman"/>
+                <w:color w:val="1F2937"/>
+                <w:sz w:val="19"/>
+              </w:rPr>
+              <w:t>ả</w:t>
+            </w:r>
+            <w:r>
+              <w:rPr>
+                <w:rFonts w:ascii="Times New Roman" w:hAnsi="Times New Roman"/>
+                <w:color w:val="1F2937"/>
+                <w:sz w:val="19"/>
+              </w:rPr>
+              <w:t xml:space="preserve"> v</w:t>
+            </w:r>
+            <w:r>
+              <w:rPr>
+                <w:rFonts w:ascii="Times New Roman" w:hAnsi="Times New Roman"/>
+                <w:color w:val="1F2937"/>
+                <w:sz w:val="19"/>
+              </w:rPr>
+              <w:t>ề</w:t>
+            </w:r>
+            <w:r>
+              <w:rPr>
+                <w:rFonts w:ascii="Times New Roman" w:hAnsi="Times New Roman"/>
+                <w:color w:val="1F2937"/>
+                <w:sz w:val="19"/>
+              </w:rPr>
+              <w:t xml:space="preserve"> HTTP 403 Forbidden - Đã ki</w:t>
+            </w:r>
+            <w:r>
+              <w:rPr>
+                <w:rFonts w:ascii="Times New Roman" w:hAnsi="Times New Roman"/>
+                <w:color w:val="1F2937"/>
+                <w:sz w:val="19"/>
+              </w:rPr>
+              <w:t>ể</w:t>
+            </w:r>
+            <w:r>
+              <w:rPr>
+                <w:rFonts w:ascii="Times New Roman" w:hAnsi="Times New Roman"/>
+                <w:color w:val="1F2937"/>
+                <w:sz w:val="19"/>
+              </w:rPr>
+              <w:t>m ch</w:t>
+            </w:r>
+            <w:r>
+              <w:rPr>
+                <w:rFonts w:ascii="Times New Roman" w:hAnsi="Times New Roman"/>
+                <w:color w:val="1F2937"/>
+                <w:sz w:val="19"/>
+              </w:rPr>
+              <w:t>ứ</w:t>
+            </w:r>
+            <w:r>
+              <w:rPr>
+                <w:rFonts w:ascii="Times New Roman" w:hAnsi="Times New Roman"/>
+                <w:color w:val="1F2937"/>
+                <w:sz w:val="19"/>
+              </w:rPr>
+              <w:t>ng đ</w:t>
+            </w:r>
+            <w:r>
+              <w:rPr>
+                <w:rFonts w:ascii="Times New Roman" w:hAnsi="Times New Roman"/>
+                <w:color w:val="1F2937"/>
+                <w:sz w:val="19"/>
+              </w:rPr>
+              <w:t>ạ</w:t>
+            </w:r>
+            <w:r>
+              <w:rPr>
+                <w:rFonts w:ascii="Times New Roman" w:hAnsi="Times New Roman"/>
+                <w:color w:val="1F2937"/>
+                <w:sz w:val="19"/>
+              </w:rPr>
+              <w:t>t</w:t>
+            </w:r>
+          </w:p>
+        </w:tc>
+      </w:tr>
+      <w:tr>
+        <w:trPr>
+          <w:cantSplit/>
+          <w:jc w:val="center"/>
+        </w:trPr>
+        <w:tc>
+          <w:tcPr>
+            <w:tcW w:w="1984" w:type="dxa"/>
+            <w:shd w:val="clear" w:color="auto" w:fill="FFFFFF"/>
+            <w:tcMar>
+              <w:top w:w="70" w:type="dxa"/>
+              <w:left w:w="110" w:type="dxa"/>
+              <w:bottom w:w="70" w:type="dxa"/>
+              <w:right w:w="110" w:type="dxa"/>
+            </w:tcMar>
+            <w:vAlign w:val="center"/>
+          </w:tcPr>
+          <w:p>
+            <w:pPr>
+              <w:spacing w:before="20" w:after="40"/>
+            </w:pPr>
+            <w:r>
+              <w:rPr>
+                <w:rFonts w:ascii="Times New Roman" w:hAnsi="Times New Roman"/>
+                <w:color w:val="1F2937"/>
+                <w:sz w:val="19"/>
+              </w:rPr>
+              <w:t>Gi</w:t>
+            </w:r>
+            <w:r>
+              <w:rPr>
+                <w:rFonts w:ascii="Times New Roman" w:hAnsi="Times New Roman"/>
+                <w:color w:val="1F2937"/>
+                <w:sz w:val="19"/>
+              </w:rPr>
+              <w:t>ớ</w:t>
+            </w:r>
+            <w:r>
+              <w:rPr>
+                <w:rFonts w:ascii="Times New Roman" w:hAnsi="Times New Roman"/>
+                <w:color w:val="1F2937"/>
+                <w:sz w:val="19"/>
+              </w:rPr>
+              <w:t>i h</w:t>
+            </w:r>
+            <w:r>
+              <w:rPr>
+                <w:rFonts w:ascii="Times New Roman" w:hAnsi="Times New Roman"/>
+                <w:color w:val="1F2937"/>
+                <w:sz w:val="19"/>
+              </w:rPr>
+              <w:t>ạ</w:t>
+            </w:r>
+            <w:r>
+              <w:rPr>
+                <w:rFonts w:ascii="Times New Roman" w:hAnsi="Times New Roman"/>
+                <w:color w:val="1F2937"/>
+                <w:sz w:val="19"/>
+              </w:rPr>
+              <w:t>n t</w:t>
+            </w:r>
+            <w:r>
+              <w:rPr>
+                <w:rFonts w:ascii="Times New Roman" w:hAnsi="Times New Roman"/>
+                <w:color w:val="1F2937"/>
+                <w:sz w:val="19"/>
+              </w:rPr>
+              <w:t>ầ</w:t>
+            </w:r>
+            <w:r>
+              <w:rPr>
+                <w:rFonts w:ascii="Times New Roman" w:hAnsi="Times New Roman"/>
+                <w:color w:val="1F2937"/>
+                <w:sz w:val="19"/>
+              </w:rPr>
+              <w:t>n su</w:t>
+            </w:r>
+            <w:r>
+              <w:rPr>
+                <w:rFonts w:ascii="Times New Roman" w:hAnsi="Times New Roman"/>
+                <w:color w:val="1F2937"/>
+                <w:sz w:val="19"/>
+              </w:rPr>
+              <w:t>ấ</w:t>
+            </w:r>
+            <w:r>
+              <w:rPr>
+                <w:rFonts w:ascii="Times New Roman" w:hAnsi="Times New Roman"/>
+                <w:color w:val="1F2937"/>
+                <w:sz w:val="19"/>
+              </w:rPr>
+              <w:t>t</w:t>
+            </w:r>
+          </w:p>
+        </w:tc>
+        <w:tc>
+          <w:tcPr>
+            <w:tcW w:w="1984" w:type="dxa"/>
+            <w:shd w:val="clear" w:color="auto" w:fill="FFFFFF"/>
+            <w:tcMar>
+              <w:top w:w="70" w:type="dxa"/>
+              <w:left w:w="110" w:type="dxa"/>
+              <w:bottom w:w="70" w:type="dxa"/>
+              <w:right w:w="110" w:type="dxa"/>
+            </w:tcMar>
+            <w:vAlign w:val="center"/>
+          </w:tcPr>
+          <w:p>
+            <w:pPr>
+              <w:spacing w:before="20" w:after="40"/>
+            </w:pPr>
+            <w:r>
+              <w:rPr>
+                <w:rFonts w:ascii="Times New Roman" w:hAnsi="Times New Roman"/>
+                <w:color w:val="1F2937"/>
+                <w:sz w:val="19"/>
+              </w:rPr>
+              <w:t>limit_req_zone login (5r/m), contact (3r/m)</w:t>
+            </w:r>
+          </w:p>
+        </w:tc>
+        <w:tc>
+          <w:tcPr>
+            <w:tcW w:w="2551" w:type="dxa"/>
+            <w:shd w:val="clear" w:color="auto" w:fill="FFFFFF"/>
+            <w:tcMar>
+              <w:top w:w="70" w:type="dxa"/>
+              <w:left w:w="110" w:type="dxa"/>
+              <w:bottom w:w="70" w:type="dxa"/>
+              <w:right w:w="110" w:type="dxa"/>
+            </w:tcMar>
+            <w:vAlign w:val="center"/>
+          </w:tcPr>
+          <w:p>
+            <w:pPr>
+              <w:spacing w:before="20" w:after="40"/>
+            </w:pPr>
+            <w:r>
+              <w:rPr>
+                <w:rFonts w:ascii="Times New Roman" w:hAnsi="Times New Roman"/>
+                <w:color w:val="1F2937"/>
+                <w:sz w:val="19"/>
+              </w:rPr>
+              <w:t>G</w:t>
             </w:r>
             <w:r>
               <w:rPr>
@@ -17135,7 +18621,637 @@
                 <w:color w:val="1F2937"/>
                 <w:sz w:val="19"/>
               </w:rPr>
-              <w:t xml:space="preserve"> Git - Đã ki</w:t>
+              <w:t>i liên ti</w:t>
+            </w:r>
+            <w:r>
+              <w:rPr>
+                <w:rFonts w:ascii="Times New Roman" w:hAnsi="Times New Roman"/>
+                <w:color w:val="1F2937"/>
+                <w:sz w:val="19"/>
+              </w:rPr>
+              <w:t>ế</w:t>
+            </w:r>
+            <w:r>
+              <w:rPr>
+                <w:rFonts w:ascii="Times New Roman" w:hAnsi="Times New Roman"/>
+                <w:color w:val="1F2937"/>
+                <w:sz w:val="19"/>
+              </w:rPr>
+              <w:t>p &gt;5 requests t</w:t>
+            </w:r>
+            <w:r>
+              <w:rPr>
+                <w:rFonts w:ascii="Times New Roman" w:hAnsi="Times New Roman"/>
+                <w:color w:val="1F2937"/>
+                <w:sz w:val="19"/>
+              </w:rPr>
+              <w:t>ớ</w:t>
+            </w:r>
+            <w:r>
+              <w:rPr>
+                <w:rFonts w:ascii="Times New Roman" w:hAnsi="Times New Roman"/>
+                <w:color w:val="1F2937"/>
+                <w:sz w:val="19"/>
+              </w:rPr>
+              <w:t>i /admin/login</w:t>
+            </w:r>
+          </w:p>
+        </w:tc>
+        <w:tc>
+          <w:tcPr>
+            <w:tcW w:w="2551" w:type="dxa"/>
+            <w:shd w:val="clear" w:color="auto" w:fill="FFFFFF"/>
+            <w:tcMar>
+              <w:top w:w="70" w:type="dxa"/>
+              <w:left w:w="110" w:type="dxa"/>
+              <w:bottom w:w="70" w:type="dxa"/>
+              <w:right w:w="110" w:type="dxa"/>
+            </w:tcMar>
+            <w:vAlign w:val="center"/>
+          </w:tcPr>
+          <w:p>
+            <w:pPr>
+              <w:spacing w:before="20" w:after="40"/>
+            </w:pPr>
+            <w:r>
+              <w:rPr>
+                <w:rFonts w:ascii="Times New Roman" w:hAnsi="Times New Roman"/>
+                <w:color w:val="1F2937"/>
+                <w:sz w:val="19"/>
+              </w:rPr>
+              <w:t>Tr</w:t>
+            </w:r>
+            <w:r>
+              <w:rPr>
+                <w:rFonts w:ascii="Times New Roman" w:hAnsi="Times New Roman"/>
+                <w:color w:val="1F2937"/>
+                <w:sz w:val="19"/>
+              </w:rPr>
+              <w:t>ả</w:t>
+            </w:r>
+            <w:r>
+              <w:rPr>
+                <w:rFonts w:ascii="Times New Roman" w:hAnsi="Times New Roman"/>
+                <w:color w:val="1F2937"/>
+                <w:sz w:val="19"/>
+              </w:rPr>
+              <w:t xml:space="preserve"> v</w:t>
+            </w:r>
+            <w:r>
+              <w:rPr>
+                <w:rFonts w:ascii="Times New Roman" w:hAnsi="Times New Roman"/>
+                <w:color w:val="1F2937"/>
+                <w:sz w:val="19"/>
+              </w:rPr>
+              <w:t>ề</w:t>
+            </w:r>
+            <w:r>
+              <w:rPr>
+                <w:rFonts w:ascii="Times New Roman" w:hAnsi="Times New Roman"/>
+                <w:color w:val="1F2937"/>
+                <w:sz w:val="19"/>
+              </w:rPr>
+              <w:t xml:space="preserve"> HTTP 503 Service Temp Unavail - Đã ki</w:t>
+            </w:r>
+            <w:r>
+              <w:rPr>
+                <w:rFonts w:ascii="Times New Roman" w:hAnsi="Times New Roman"/>
+                <w:color w:val="1F2937"/>
+                <w:sz w:val="19"/>
+              </w:rPr>
+              <w:t>ể</w:t>
+            </w:r>
+            <w:r>
+              <w:rPr>
+                <w:rFonts w:ascii="Times New Roman" w:hAnsi="Times New Roman"/>
+                <w:color w:val="1F2937"/>
+                <w:sz w:val="19"/>
+              </w:rPr>
+              <w:t>m ch</w:t>
+            </w:r>
+            <w:r>
+              <w:rPr>
+                <w:rFonts w:ascii="Times New Roman" w:hAnsi="Times New Roman"/>
+                <w:color w:val="1F2937"/>
+                <w:sz w:val="19"/>
+              </w:rPr>
+              <w:t>ứ</w:t>
+            </w:r>
+            <w:r>
+              <w:rPr>
+                <w:rFonts w:ascii="Times New Roman" w:hAnsi="Times New Roman"/>
+                <w:color w:val="1F2937"/>
+                <w:sz w:val="19"/>
+              </w:rPr>
+              <w:t>ng đ</w:t>
+            </w:r>
+            <w:r>
+              <w:rPr>
+                <w:rFonts w:ascii="Times New Roman" w:hAnsi="Times New Roman"/>
+                <w:color w:val="1F2937"/>
+                <w:sz w:val="19"/>
+              </w:rPr>
+              <w:t>ạ</w:t>
+            </w:r>
+            <w:r>
+              <w:rPr>
+                <w:rFonts w:ascii="Times New Roman" w:hAnsi="Times New Roman"/>
+                <w:color w:val="1F2937"/>
+                <w:sz w:val="19"/>
+              </w:rPr>
+              <w:t>t</w:t>
+            </w:r>
+          </w:p>
+        </w:tc>
+      </w:tr>
+      <w:tr>
+        <w:trPr>
+          <w:cantSplit/>
+          <w:jc w:val="center"/>
+        </w:trPr>
+        <w:tc>
+          <w:tcPr>
+            <w:tcW w:w="1984" w:type="dxa"/>
+            <w:shd w:val="clear" w:color="auto" w:fill="F8FAFC"/>
+            <w:tcMar>
+              <w:top w:w="70" w:type="dxa"/>
+              <w:left w:w="110" w:type="dxa"/>
+              <w:bottom w:w="70" w:type="dxa"/>
+              <w:right w:w="110" w:type="dxa"/>
+            </w:tcMar>
+            <w:vAlign w:val="center"/>
+          </w:tcPr>
+          <w:p>
+            <w:pPr>
+              <w:spacing w:before="20" w:after="40"/>
+            </w:pPr>
+            <w:r>
+              <w:rPr>
+                <w:rFonts w:ascii="Times New Roman" w:hAnsi="Times New Roman"/>
+                <w:color w:val="1F2937"/>
+                <w:sz w:val="19"/>
+              </w:rPr>
+              <w:t>Mã hóa m</w:t>
+            </w:r>
+            <w:r>
+              <w:rPr>
+                <w:rFonts w:ascii="Times New Roman" w:hAnsi="Times New Roman"/>
+                <w:color w:val="1F2937"/>
+                <w:sz w:val="19"/>
+              </w:rPr>
+              <w:t>ậ</w:t>
+            </w:r>
+            <w:r>
+              <w:rPr>
+                <w:rFonts w:ascii="Times New Roman" w:hAnsi="Times New Roman"/>
+                <w:color w:val="1F2937"/>
+                <w:sz w:val="19"/>
+              </w:rPr>
+              <w:t>t kh</w:t>
+            </w:r>
+            <w:r>
+              <w:rPr>
+                <w:rFonts w:ascii="Times New Roman" w:hAnsi="Times New Roman"/>
+                <w:color w:val="1F2937"/>
+                <w:sz w:val="19"/>
+              </w:rPr>
+              <w:t>ẩ</w:t>
+            </w:r>
+            <w:r>
+              <w:rPr>
+                <w:rFonts w:ascii="Times New Roman" w:hAnsi="Times New Roman"/>
+                <w:color w:val="1F2937"/>
+                <w:sz w:val="19"/>
+              </w:rPr>
+              <w:t>u Admin</w:t>
+            </w:r>
+          </w:p>
+        </w:tc>
+        <w:tc>
+          <w:tcPr>
+            <w:tcW w:w="1984" w:type="dxa"/>
+            <w:shd w:val="clear" w:color="auto" w:fill="F8FAFC"/>
+            <w:tcMar>
+              <w:top w:w="70" w:type="dxa"/>
+              <w:left w:w="110" w:type="dxa"/>
+              <w:bottom w:w="70" w:type="dxa"/>
+              <w:right w:w="110" w:type="dxa"/>
+            </w:tcMar>
+            <w:vAlign w:val="center"/>
+          </w:tcPr>
+          <w:p>
+            <w:pPr>
+              <w:spacing w:before="20" w:after="40"/>
+            </w:pPr>
+            <w:r>
+              <w:rPr>
+                <w:rFonts w:ascii="Times New Roman" w:hAnsi="Times New Roman"/>
+                <w:color w:val="1F2937"/>
+                <w:sz w:val="19"/>
+              </w:rPr>
+              <w:t>password_hash($pass, PASSWORD_BCRYPT, ['cost'=&gt;12])</w:t>
+            </w:r>
+          </w:p>
+        </w:tc>
+        <w:tc>
+          <w:tcPr>
+            <w:tcW w:w="2551" w:type="dxa"/>
+            <w:shd w:val="clear" w:color="auto" w:fill="F8FAFC"/>
+            <w:tcMar>
+              <w:top w:w="70" w:type="dxa"/>
+              <w:left w:w="110" w:type="dxa"/>
+              <w:bottom w:w="70" w:type="dxa"/>
+              <w:right w:w="110" w:type="dxa"/>
+            </w:tcMar>
+            <w:vAlign w:val="center"/>
+          </w:tcPr>
+          <w:p>
+            <w:pPr>
+              <w:spacing w:before="20" w:after="40"/>
+            </w:pPr>
+            <w:r>
+              <w:rPr>
+                <w:rFonts w:ascii="Times New Roman" w:hAnsi="Times New Roman"/>
+                <w:color w:val="1F2937"/>
+                <w:sz w:val="19"/>
+              </w:rPr>
+              <w:t>SELECT SUBSTRING(password_hash, 1, 7) FROM admin_users;</w:t>
+            </w:r>
+          </w:p>
+        </w:tc>
+        <w:tc>
+          <w:tcPr>
+            <w:tcW w:w="2551" w:type="dxa"/>
+            <w:shd w:val="clear" w:color="auto" w:fill="F8FAFC"/>
+            <w:tcMar>
+              <w:top w:w="70" w:type="dxa"/>
+              <w:left w:w="110" w:type="dxa"/>
+              <w:bottom w:w="70" w:type="dxa"/>
+              <w:right w:w="110" w:type="dxa"/>
+            </w:tcMar>
+            <w:vAlign w:val="center"/>
+          </w:tcPr>
+          <w:p>
+            <w:pPr>
+              <w:spacing w:before="20" w:after="40"/>
+            </w:pPr>
+            <w:r>
+              <w:rPr>
+                <w:rFonts w:ascii="Times New Roman" w:hAnsi="Times New Roman"/>
+                <w:color w:val="1F2937"/>
+                <w:sz w:val="19"/>
+              </w:rPr>
+              <w:t>Chu</w:t>
+            </w:r>
+            <w:r>
+              <w:rPr>
+                <w:rFonts w:ascii="Times New Roman" w:hAnsi="Times New Roman"/>
+                <w:color w:val="1F2937"/>
+                <w:sz w:val="19"/>
+              </w:rPr>
+              <w:t>ỗ</w:t>
+            </w:r>
+            <w:r>
+              <w:rPr>
+                <w:rFonts w:ascii="Times New Roman" w:hAnsi="Times New Roman"/>
+                <w:color w:val="1F2937"/>
+                <w:sz w:val="19"/>
+              </w:rPr>
+              <w:t>i hash $2y$12$ an toàn - Đã ki</w:t>
+            </w:r>
+            <w:r>
+              <w:rPr>
+                <w:rFonts w:ascii="Times New Roman" w:hAnsi="Times New Roman"/>
+                <w:color w:val="1F2937"/>
+                <w:sz w:val="19"/>
+              </w:rPr>
+              <w:t>ể</w:t>
+            </w:r>
+            <w:r>
+              <w:rPr>
+                <w:rFonts w:ascii="Times New Roman" w:hAnsi="Times New Roman"/>
+                <w:color w:val="1F2937"/>
+                <w:sz w:val="19"/>
+              </w:rPr>
+              <w:t>m ch</w:t>
+            </w:r>
+            <w:r>
+              <w:rPr>
+                <w:rFonts w:ascii="Times New Roman" w:hAnsi="Times New Roman"/>
+                <w:color w:val="1F2937"/>
+                <w:sz w:val="19"/>
+              </w:rPr>
+              <w:t>ứ</w:t>
+            </w:r>
+            <w:r>
+              <w:rPr>
+                <w:rFonts w:ascii="Times New Roman" w:hAnsi="Times New Roman"/>
+                <w:color w:val="1F2937"/>
+                <w:sz w:val="19"/>
+              </w:rPr>
+              <w:t>ng đ</w:t>
+            </w:r>
+            <w:r>
+              <w:rPr>
+                <w:rFonts w:ascii="Times New Roman" w:hAnsi="Times New Roman"/>
+                <w:color w:val="1F2937"/>
+                <w:sz w:val="19"/>
+              </w:rPr>
+              <w:t>ạ</w:t>
+            </w:r>
+            <w:r>
+              <w:rPr>
+                <w:rFonts w:ascii="Times New Roman" w:hAnsi="Times New Roman"/>
+                <w:color w:val="1F2937"/>
+                <w:sz w:val="19"/>
+              </w:rPr>
+              <w:t>t</w:t>
+            </w:r>
+          </w:p>
+        </w:tc>
+      </w:tr>
+      <w:tr>
+        <w:trPr>
+          <w:cantSplit/>
+          <w:jc w:val="center"/>
+        </w:trPr>
+        <w:tc>
+          <w:tcPr>
+            <w:tcW w:w="1984" w:type="dxa"/>
+            <w:shd w:val="clear" w:color="auto" w:fill="FFFFFF"/>
+            <w:tcMar>
+              <w:top w:w="70" w:type="dxa"/>
+              <w:left w:w="110" w:type="dxa"/>
+              <w:bottom w:w="70" w:type="dxa"/>
+              <w:right w:w="110" w:type="dxa"/>
+            </w:tcMar>
+            <w:vAlign w:val="center"/>
+          </w:tcPr>
+          <w:p>
+            <w:pPr>
+              <w:spacing w:before="20" w:after="40"/>
+            </w:pPr>
+            <w:r>
+              <w:rPr>
+                <w:rFonts w:ascii="Times New Roman" w:hAnsi="Times New Roman"/>
+                <w:color w:val="1F2937"/>
+                <w:sz w:val="19"/>
+              </w:rPr>
+              <w:t>B</w:t>
+            </w:r>
+            <w:r>
+              <w:rPr>
+                <w:rFonts w:ascii="Times New Roman" w:hAnsi="Times New Roman"/>
+                <w:color w:val="1F2937"/>
+                <w:sz w:val="19"/>
+              </w:rPr>
+              <w:t>ả</w:t>
+            </w:r>
+            <w:r>
+              <w:rPr>
+                <w:rFonts w:ascii="Times New Roman" w:hAnsi="Times New Roman"/>
+                <w:color w:val="1F2937"/>
+                <w:sz w:val="19"/>
+              </w:rPr>
+              <w:t>o v</w:t>
+            </w:r>
+            <w:r>
+              <w:rPr>
+                <w:rFonts w:ascii="Times New Roman" w:hAnsi="Times New Roman"/>
+                <w:color w:val="1F2937"/>
+                <w:sz w:val="19"/>
+              </w:rPr>
+              <w:t>ệ</w:t>
+            </w:r>
+            <w:r>
+              <w:rPr>
+                <w:rFonts w:ascii="Times New Roman" w:hAnsi="Times New Roman"/>
+                <w:color w:val="1F2937"/>
+                <w:sz w:val="19"/>
+              </w:rPr>
+              <w:t xml:space="preserve"> CSRF</w:t>
+            </w:r>
+          </w:p>
+        </w:tc>
+        <w:tc>
+          <w:tcPr>
+            <w:tcW w:w="1984" w:type="dxa"/>
+            <w:shd w:val="clear" w:color="auto" w:fill="FFFFFF"/>
+            <w:tcMar>
+              <w:top w:w="70" w:type="dxa"/>
+              <w:left w:w="110" w:type="dxa"/>
+              <w:bottom w:w="70" w:type="dxa"/>
+              <w:right w:w="110" w:type="dxa"/>
+            </w:tcMar>
+            <w:vAlign w:val="center"/>
+          </w:tcPr>
+          <w:p>
+            <w:pPr>
+              <w:spacing w:before="20" w:after="40"/>
+            </w:pPr>
+            <w:r>
+              <w:rPr>
+                <w:rFonts w:ascii="Times New Roman" w:hAnsi="Times New Roman"/>
+                <w:color w:val="1F2937"/>
+                <w:sz w:val="19"/>
+              </w:rPr>
+              <w:t>Token ng</w:t>
+            </w:r>
+            <w:r>
+              <w:rPr>
+                <w:rFonts w:ascii="Times New Roman" w:hAnsi="Times New Roman"/>
+                <w:color w:val="1F2937"/>
+                <w:sz w:val="19"/>
+              </w:rPr>
+              <w:t>ẫ</w:t>
+            </w:r>
+            <w:r>
+              <w:rPr>
+                <w:rFonts w:ascii="Times New Roman" w:hAnsi="Times New Roman"/>
+                <w:color w:val="1F2937"/>
+                <w:sz w:val="19"/>
+              </w:rPr>
+              <w:t>u nhiên trong session ki</w:t>
+            </w:r>
+            <w:r>
+              <w:rPr>
+                <w:rFonts w:ascii="Times New Roman" w:hAnsi="Times New Roman"/>
+                <w:color w:val="1F2937"/>
+                <w:sz w:val="19"/>
+              </w:rPr>
+              <w:t>ể</w:t>
+            </w:r>
+            <w:r>
+              <w:rPr>
+                <w:rFonts w:ascii="Times New Roman" w:hAnsi="Times New Roman"/>
+                <w:color w:val="1F2937"/>
+                <w:sz w:val="19"/>
+              </w:rPr>
+              <w:t>m tra m</w:t>
+            </w:r>
+            <w:r>
+              <w:rPr>
+                <w:rFonts w:ascii="Times New Roman" w:hAnsi="Times New Roman"/>
+                <w:color w:val="1F2937"/>
+                <w:sz w:val="19"/>
+              </w:rPr>
+              <w:t>ỗ</w:t>
+            </w:r>
+            <w:r>
+              <w:rPr>
+                <w:rFonts w:ascii="Times New Roman" w:hAnsi="Times New Roman"/>
+                <w:color w:val="1F2937"/>
+                <w:sz w:val="19"/>
+              </w:rPr>
+              <w:t>i POST</w:t>
+            </w:r>
+          </w:p>
+        </w:tc>
+        <w:tc>
+          <w:tcPr>
+            <w:tcW w:w="2551" w:type="dxa"/>
+            <w:shd w:val="clear" w:color="auto" w:fill="FFFFFF"/>
+            <w:tcMar>
+              <w:top w:w="70" w:type="dxa"/>
+              <w:left w:w="110" w:type="dxa"/>
+              <w:bottom w:w="70" w:type="dxa"/>
+              <w:right w:w="110" w:type="dxa"/>
+            </w:tcMar>
+            <w:vAlign w:val="center"/>
+          </w:tcPr>
+          <w:p>
+            <w:pPr>
+              <w:spacing w:before="20" w:after="40"/>
+            </w:pPr>
+            <w:r>
+              <w:rPr>
+                <w:rFonts w:ascii="Times New Roman" w:hAnsi="Times New Roman"/>
+                <w:color w:val="1F2937"/>
+                <w:sz w:val="19"/>
+              </w:rPr>
+              <w:t>G</w:t>
+            </w:r>
+            <w:r>
+              <w:rPr>
+                <w:rFonts w:ascii="Times New Roman" w:hAnsi="Times New Roman"/>
+                <w:color w:val="1F2937"/>
+                <w:sz w:val="19"/>
+              </w:rPr>
+              <w:t>ử</w:t>
+            </w:r>
+            <w:r>
+              <w:rPr>
+                <w:rFonts w:ascii="Times New Roman" w:hAnsi="Times New Roman"/>
+                <w:color w:val="1F2937"/>
+                <w:sz w:val="19"/>
+              </w:rPr>
+              <w:t>i form thi</w:t>
+            </w:r>
+            <w:r>
+              <w:rPr>
+                <w:rFonts w:ascii="Times New Roman" w:hAnsi="Times New Roman"/>
+                <w:color w:val="1F2937"/>
+                <w:sz w:val="19"/>
+              </w:rPr>
+              <w:t>ế</w:t>
+            </w:r>
+            <w:r>
+              <w:rPr>
+                <w:rFonts w:ascii="Times New Roman" w:hAnsi="Times New Roman"/>
+                <w:color w:val="1F2937"/>
+                <w:sz w:val="19"/>
+              </w:rPr>
+              <w:t>u token ho</w:t>
+            </w:r>
+            <w:r>
+              <w:rPr>
+                <w:rFonts w:ascii="Times New Roman" w:hAnsi="Times New Roman"/>
+                <w:color w:val="1F2937"/>
+                <w:sz w:val="19"/>
+              </w:rPr>
+              <w:t>ặ</w:t>
+            </w:r>
+            <w:r>
+              <w:rPr>
+                <w:rFonts w:ascii="Times New Roman" w:hAnsi="Times New Roman"/>
+                <w:color w:val="1F2937"/>
+                <w:sz w:val="19"/>
+              </w:rPr>
+              <w:t>c token sai</w:t>
+            </w:r>
+          </w:p>
+        </w:tc>
+        <w:tc>
+          <w:tcPr>
+            <w:tcW w:w="2551" w:type="dxa"/>
+            <w:shd w:val="clear" w:color="auto" w:fill="FFFFFF"/>
+            <w:tcMar>
+              <w:top w:w="70" w:type="dxa"/>
+              <w:left w:w="110" w:type="dxa"/>
+              <w:bottom w:w="70" w:type="dxa"/>
+              <w:right w:w="110" w:type="dxa"/>
+            </w:tcMar>
+            <w:vAlign w:val="center"/>
+          </w:tcPr>
+          <w:p>
+            <w:pPr>
+              <w:spacing w:before="20" w:after="40"/>
+            </w:pPr>
+            <w:r>
+              <w:rPr>
+                <w:rFonts w:ascii="Times New Roman" w:hAnsi="Times New Roman"/>
+                <w:color w:val="1F2937"/>
+                <w:sz w:val="19"/>
+              </w:rPr>
+              <w:t>T</w:t>
+            </w:r>
+            <w:r>
+              <w:rPr>
+                <w:rFonts w:ascii="Times New Roman" w:hAnsi="Times New Roman"/>
+                <w:color w:val="1F2937"/>
+                <w:sz w:val="19"/>
+              </w:rPr>
+              <w:t>ừ</w:t>
+            </w:r>
+            <w:r>
+              <w:rPr>
+                <w:rFonts w:ascii="Times New Roman" w:hAnsi="Times New Roman"/>
+                <w:color w:val="1F2937"/>
+                <w:sz w:val="19"/>
+              </w:rPr>
+              <w:t xml:space="preserve"> ch</w:t>
+            </w:r>
+            <w:r>
+              <w:rPr>
+                <w:rFonts w:ascii="Times New Roman" w:hAnsi="Times New Roman"/>
+                <w:color w:val="1F2937"/>
+                <w:sz w:val="19"/>
+              </w:rPr>
+              <w:t>ố</w:t>
+            </w:r>
+            <w:r>
+              <w:rPr>
+                <w:rFonts w:ascii="Times New Roman" w:hAnsi="Times New Roman"/>
+                <w:color w:val="1F2937"/>
+                <w:sz w:val="19"/>
+              </w:rPr>
+              <w:t>i th</w:t>
+            </w:r>
+            <w:r>
+              <w:rPr>
+                <w:rFonts w:ascii="Times New Roman" w:hAnsi="Times New Roman"/>
+                <w:color w:val="1F2937"/>
+                <w:sz w:val="19"/>
+              </w:rPr>
+              <w:t>ự</w:t>
+            </w:r>
+            <w:r>
+              <w:rPr>
+                <w:rFonts w:ascii="Times New Roman" w:hAnsi="Times New Roman"/>
+                <w:color w:val="1F2937"/>
+                <w:sz w:val="19"/>
+              </w:rPr>
+              <w:t>c thi HTTP 403 - Đã ki</w:t>
             </w:r>
             <w:r>
               <w:rPr>
@@ -17509,6 +19625,7 @@
           <w:color w:val="2B6CB0"/>
           <w:sz w:val="26"/>
         </w:rPr>
+        <w:lastRenderedPageBreak/>
         <w:t>5.2 Kh</w:t>
       </w:r>
       <w:r>
@@ -18839,7 +20956,7 @@
                 <w:color w:val="1F2937"/>
                 <w:sz w:val="19"/>
               </w:rPr>
-              <w:t>eee9d41</w:t>
+              <w:t>44daeac</w:t>
             </w:r>
           </w:p>
         </w:tc>
@@ -18865,7 +20982,7 @@
                 <w:color w:val="1F2937"/>
                 <w:sz w:val="19"/>
               </w:rPr>
-              <w:t>fix(app): configure php-fpm clear_env, global helpers and add system verification script</w:t>
+              <w:t>fix(db): add fix_encoding script and restore pristine UTF-8 Vietnamese data in MySQL</w:t>
             </w:r>
           </w:p>
         </w:tc>
@@ -18891,87 +21008,151 @@
                 <w:color w:val="1F2937"/>
                 <w:sz w:val="19"/>
               </w:rPr>
-              <w:t>S</w:t>
-            </w:r>
-            <w:r>
-              <w:rPr>
-                <w:rFonts w:ascii="Times New Roman" w:hAnsi="Times New Roman"/>
-                <w:color w:val="1F2937"/>
-                <w:sz w:val="19"/>
-              </w:rPr>
-              <w:t>ử</w:t>
-            </w:r>
-            <w:r>
-              <w:rPr>
-                <w:rFonts w:ascii="Times New Roman" w:hAnsi="Times New Roman"/>
-                <w:color w:val="1F2937"/>
-                <w:sz w:val="19"/>
-              </w:rPr>
-              <w:t>a l</w:t>
-            </w:r>
-            <w:r>
-              <w:rPr>
-                <w:rFonts w:ascii="Times New Roman" w:hAnsi="Times New Roman"/>
-                <w:color w:val="1F2937"/>
-                <w:sz w:val="19"/>
-              </w:rPr>
-              <w:t>ỗ</w:t>
-            </w:r>
-            <w:r>
-              <w:rPr>
-                <w:rFonts w:ascii="Times New Roman" w:hAnsi="Times New Roman"/>
-                <w:color w:val="1F2937"/>
-                <w:sz w:val="19"/>
-              </w:rPr>
-              <w:t>i: Thêm clear_env=no cho PHP-FPM, tách helpers.php, b</w:t>
-            </w:r>
-            <w:r>
-              <w:rPr>
-                <w:rFonts w:ascii="Times New Roman" w:hAnsi="Times New Roman"/>
-                <w:color w:val="1F2937"/>
-                <w:sz w:val="19"/>
-              </w:rPr>
-              <w:t>ổ</w:t>
-            </w:r>
-            <w:r>
-              <w:rPr>
-                <w:rFonts w:ascii="Times New Roman" w:hAnsi="Times New Roman"/>
-                <w:color w:val="1F2937"/>
-                <w:sz w:val="19"/>
-              </w:rPr>
-              <w:t xml:space="preserve"> sung k</w:t>
-            </w:r>
-            <w:r>
-              <w:rPr>
-                <w:rFonts w:ascii="Times New Roman" w:hAnsi="Times New Roman"/>
-                <w:color w:val="1F2937"/>
-                <w:sz w:val="19"/>
-              </w:rPr>
-              <w:t>ị</w:t>
-            </w:r>
-            <w:r>
-              <w:rPr>
-                <w:rFonts w:ascii="Times New Roman" w:hAnsi="Times New Roman"/>
-                <w:color w:val="1F2937"/>
-                <w:sz w:val="19"/>
-              </w:rPr>
-              <w:t>ch b</w:t>
-            </w:r>
-            <w:r>
-              <w:rPr>
-                <w:rFonts w:ascii="Times New Roman" w:hAnsi="Times New Roman"/>
-                <w:color w:val="1F2937"/>
-                <w:sz w:val="19"/>
-              </w:rPr>
-              <w:t>ả</w:t>
-            </w:r>
-            <w:r>
-              <w:rPr>
-                <w:rFonts w:ascii="Times New Roman" w:hAnsi="Times New Roman"/>
-                <w:color w:val="1F2937"/>
-                <w:sz w:val="19"/>
-              </w:rPr>
-              <w:t>n test</w:t>
+              <w:t>D</w:t>
+            </w:r>
+            <w:r>
+              <w:rPr>
+                <w:rFonts w:ascii="Times New Roman" w:hAnsi="Times New Roman"/>
+                <w:color w:val="1F2937"/>
+                <w:sz w:val="19"/>
+              </w:rPr>
+              <w:t>ữ</w:t>
+            </w:r>
+            <w:r>
+              <w:rPr>
+                <w:rFonts w:ascii="Times New Roman" w:hAnsi="Times New Roman"/>
+                <w:color w:val="1F2937"/>
+                <w:sz w:val="19"/>
+              </w:rPr>
+              <w:t xml:space="preserve"> li</w:t>
+            </w:r>
+            <w:r>
+              <w:rPr>
+                <w:rFonts w:ascii="Times New Roman" w:hAnsi="Times New Roman"/>
+                <w:color w:val="1F2937"/>
+                <w:sz w:val="19"/>
+              </w:rPr>
+              <w:t>ệ</w:t>
+            </w:r>
+            <w:r>
+              <w:rPr>
+                <w:rFonts w:ascii="Times New Roman" w:hAnsi="Times New Roman"/>
+                <w:color w:val="1F2937"/>
+                <w:sz w:val="19"/>
+              </w:rPr>
+              <w:t>u: Chu</w:t>
+            </w:r>
+            <w:r>
+              <w:rPr>
+                <w:rFonts w:ascii="Times New Roman" w:hAnsi="Times New Roman"/>
+                <w:color w:val="1F2937"/>
+                <w:sz w:val="19"/>
+              </w:rPr>
+              <w:t>ẩ</w:t>
+            </w:r>
+            <w:r>
+              <w:rPr>
+                <w:rFonts w:ascii="Times New Roman" w:hAnsi="Times New Roman"/>
+                <w:color w:val="1F2937"/>
+                <w:sz w:val="19"/>
+              </w:rPr>
+              <w:t>n hóa UTF-8 ti</w:t>
+            </w:r>
+            <w:r>
+              <w:rPr>
+                <w:rFonts w:ascii="Times New Roman" w:hAnsi="Times New Roman"/>
+                <w:color w:val="1F2937"/>
+                <w:sz w:val="19"/>
+              </w:rPr>
+              <w:t>ế</w:t>
+            </w:r>
+            <w:r>
+              <w:rPr>
+                <w:rFonts w:ascii="Times New Roman" w:hAnsi="Times New Roman"/>
+                <w:color w:val="1F2937"/>
+                <w:sz w:val="19"/>
+              </w:rPr>
+              <w:t>ng Vi</w:t>
+            </w:r>
+            <w:r>
+              <w:rPr>
+                <w:rFonts w:ascii="Times New Roman" w:hAnsi="Times New Roman"/>
+                <w:color w:val="1F2937"/>
+                <w:sz w:val="19"/>
+              </w:rPr>
+              <w:t>ệ</w:t>
+            </w:r>
+            <w:r>
+              <w:rPr>
+                <w:rFonts w:ascii="Times New Roman" w:hAnsi="Times New Roman"/>
+                <w:color w:val="1F2937"/>
+                <w:sz w:val="19"/>
+              </w:rPr>
+              <w:t>t có d</w:t>
+            </w:r>
+            <w:r>
+              <w:rPr>
+                <w:rFonts w:ascii="Times New Roman" w:hAnsi="Times New Roman"/>
+                <w:color w:val="1F2937"/>
+                <w:sz w:val="19"/>
+              </w:rPr>
+              <w:t>ấ</w:t>
+            </w:r>
+            <w:r>
+              <w:rPr>
+                <w:rFonts w:ascii="Times New Roman" w:hAnsi="Times New Roman"/>
+                <w:color w:val="1F2937"/>
+                <w:sz w:val="19"/>
+              </w:rPr>
+              <w:t>u cho h</w:t>
+            </w:r>
+            <w:r>
+              <w:rPr>
+                <w:rFonts w:ascii="Times New Roman" w:hAnsi="Times New Roman"/>
+                <w:color w:val="1F2937"/>
+                <w:sz w:val="19"/>
+              </w:rPr>
+              <w:t>ồ</w:t>
+            </w:r>
+            <w:r>
+              <w:rPr>
+                <w:rFonts w:ascii="Times New Roman" w:hAnsi="Times New Roman"/>
+                <w:color w:val="1F2937"/>
+                <w:sz w:val="19"/>
+              </w:rPr>
+              <w:t xml:space="preserve"> sơ sinh viên, k</w:t>
+            </w:r>
+            <w:r>
+              <w:rPr>
+                <w:rFonts w:ascii="Times New Roman" w:hAnsi="Times New Roman"/>
+                <w:color w:val="1F2937"/>
+                <w:sz w:val="19"/>
+              </w:rPr>
+              <w:t>ỹ</w:t>
+            </w:r>
+            <w:r>
+              <w:rPr>
+                <w:rFonts w:ascii="Times New Roman" w:hAnsi="Times New Roman"/>
+                <w:color w:val="1F2937"/>
+                <w:sz w:val="19"/>
+              </w:rPr>
+              <w:t xml:space="preserve"> năng, d</w:t>
+            </w:r>
+            <w:r>
+              <w:rPr>
+                <w:rFonts w:ascii="Times New Roman" w:hAnsi="Times New Roman"/>
+                <w:color w:val="1F2937"/>
+                <w:sz w:val="19"/>
+              </w:rPr>
+              <w:t>ự</w:t>
+            </w:r>
+            <w:r>
+              <w:rPr>
+                <w:rFonts w:ascii="Times New Roman" w:hAnsi="Times New Roman"/>
+                <w:color w:val="1F2937"/>
+                <w:sz w:val="19"/>
+              </w:rPr>
+              <w:t xml:space="preserve"> án</w:t>
             </w:r>
           </w:p>
         </w:tc>
@@ -19003,7 +21184,7 @@
                 <w:color w:val="1F2937"/>
                 <w:sz w:val="19"/>
               </w:rPr>
-              <w:t>ff7ed89</w:t>
+              <w:t>e99d7f6</w:t>
             </w:r>
           </w:p>
         </w:tc>
@@ -19029,7 +21210,7 @@
                 <w:color w:val="1F2937"/>
                 <w:sz w:val="19"/>
               </w:rPr>
-              <w:t>docs: update report document with latest test results</w:t>
+              <w:t>docs: update repository name and title to Vu Ba Hung DTC245180186 Website Portfolio</w:t>
             </w:r>
           </w:p>
         </w:tc>
@@ -19055,55 +21236,55 @@
                 <w:color w:val="1F2937"/>
                 <w:sz w:val="19"/>
               </w:rPr>
-              <w:t>Tài li</w:t>
-            </w:r>
-            <w:r>
-              <w:rPr>
-                <w:rFonts w:ascii="Times New Roman" w:hAnsi="Times New Roman"/>
-                <w:color w:val="1F2937"/>
-                <w:sz w:val="19"/>
-              </w:rPr>
-              <w:t>ệ</w:t>
-            </w:r>
-            <w:r>
-              <w:rPr>
-                <w:rFonts w:ascii="Times New Roman" w:hAnsi="Times New Roman"/>
-                <w:color w:val="1F2937"/>
-                <w:sz w:val="19"/>
-              </w:rPr>
-              <w:t>u: C</w:t>
-            </w:r>
-            <w:r>
-              <w:rPr>
-                <w:rFonts w:ascii="Times New Roman" w:hAnsi="Times New Roman"/>
-                <w:color w:val="1F2937"/>
-                <w:sz w:val="19"/>
-              </w:rPr>
-              <w:t>ậ</w:t>
-            </w:r>
-            <w:r>
-              <w:rPr>
-                <w:rFonts w:ascii="Times New Roman" w:hAnsi="Times New Roman"/>
-                <w:color w:val="1F2937"/>
-                <w:sz w:val="19"/>
-              </w:rPr>
-              <w:t>p nh</w:t>
-            </w:r>
-            <w:r>
-              <w:rPr>
-                <w:rFonts w:ascii="Times New Roman" w:hAnsi="Times New Roman"/>
-                <w:color w:val="1F2937"/>
-                <w:sz w:val="19"/>
-              </w:rPr>
-              <w:t>ậ</w:t>
-            </w:r>
-            <w:r>
-              <w:rPr>
-                <w:rFonts w:ascii="Times New Roman" w:hAnsi="Times New Roman"/>
-                <w:color w:val="1F2937"/>
-                <w:sz w:val="19"/>
-              </w:rPr>
-              <w:t>t báo cáo k</w:t>
+              <w:t>Đ</w:t>
+            </w:r>
+            <w:r>
+              <w:rPr>
+                <w:rFonts w:ascii="Times New Roman" w:hAnsi="Times New Roman"/>
+                <w:color w:val="1F2937"/>
+                <w:sz w:val="19"/>
+              </w:rPr>
+              <w:t>ồ</w:t>
+            </w:r>
+            <w:r>
+              <w:rPr>
+                <w:rFonts w:ascii="Times New Roman" w:hAnsi="Times New Roman"/>
+                <w:color w:val="1F2937"/>
+                <w:sz w:val="19"/>
+              </w:rPr>
+              <w:t>ng b</w:t>
+            </w:r>
+            <w:r>
+              <w:rPr>
+                <w:rFonts w:ascii="Times New Roman" w:hAnsi="Times New Roman"/>
+                <w:color w:val="1F2937"/>
+                <w:sz w:val="19"/>
+              </w:rPr>
+              <w:t>ộ</w:t>
+            </w:r>
+            <w:r>
+              <w:rPr>
+                <w:rFonts w:ascii="Times New Roman" w:hAnsi="Times New Roman"/>
+                <w:color w:val="1F2937"/>
+                <w:sz w:val="19"/>
+              </w:rPr>
+              <w:t>: Đ</w:t>
+            </w:r>
+            <w:r>
+              <w:rPr>
+                <w:rFonts w:ascii="Times New Roman" w:hAnsi="Times New Roman"/>
+                <w:color w:val="1F2937"/>
+                <w:sz w:val="19"/>
+              </w:rPr>
+              <w:t>ổ</w:t>
+            </w:r>
+            <w:r>
+              <w:rPr>
+                <w:rFonts w:ascii="Times New Roman" w:hAnsi="Times New Roman"/>
+                <w:color w:val="1F2937"/>
+                <w:sz w:val="19"/>
+              </w:rPr>
+              <w:t>i tên và liên k</w:t>
             </w:r>
             <w:r>
               <w:rPr>
@@ -19119,79 +21300,23 @@
                 <w:color w:val="1F2937"/>
                 <w:sz w:val="19"/>
               </w:rPr>
-              <w:t>t qu</w:t>
-            </w:r>
-            <w:r>
-              <w:rPr>
-                <w:rFonts w:ascii="Times New Roman" w:hAnsi="Times New Roman"/>
-                <w:color w:val="1F2937"/>
-                <w:sz w:val="19"/>
-              </w:rPr>
-              <w:t>ả</w:t>
-            </w:r>
-            <w:r>
-              <w:rPr>
-                <w:rFonts w:ascii="Times New Roman" w:hAnsi="Times New Roman"/>
-                <w:color w:val="1F2937"/>
-                <w:sz w:val="19"/>
-              </w:rPr>
-              <w:t xml:space="preserve"> ki</w:t>
-            </w:r>
-            <w:r>
-              <w:rPr>
-                <w:rFonts w:ascii="Times New Roman" w:hAnsi="Times New Roman"/>
-                <w:color w:val="1F2937"/>
-                <w:sz w:val="19"/>
-              </w:rPr>
-              <w:t>ể</w:t>
-            </w:r>
-            <w:r>
-              <w:rPr>
-                <w:rFonts w:ascii="Times New Roman" w:hAnsi="Times New Roman"/>
-                <w:color w:val="1F2937"/>
-                <w:sz w:val="19"/>
-              </w:rPr>
-              <w:t>m th</w:t>
-            </w:r>
-            <w:r>
-              <w:rPr>
-                <w:rFonts w:ascii="Times New Roman" w:hAnsi="Times New Roman"/>
-                <w:color w:val="1F2937"/>
-                <w:sz w:val="19"/>
-              </w:rPr>
-              <w:t>ử</w:t>
-            </w:r>
-            <w:r>
-              <w:rPr>
-                <w:rFonts w:ascii="Times New Roman" w:hAnsi="Times New Roman"/>
-                <w:color w:val="1F2937"/>
-                <w:sz w:val="19"/>
-              </w:rPr>
-              <w:t xml:space="preserve"> th</w:t>
-            </w:r>
-            <w:r>
-              <w:rPr>
-                <w:rFonts w:ascii="Times New Roman" w:hAnsi="Times New Roman"/>
-                <w:color w:val="1F2937"/>
-                <w:sz w:val="19"/>
-              </w:rPr>
-              <w:t>ự</w:t>
-            </w:r>
-            <w:r>
-              <w:rPr>
-                <w:rFonts w:ascii="Times New Roman" w:hAnsi="Times New Roman"/>
-                <w:color w:val="1F2937"/>
-                <w:sz w:val="19"/>
-              </w:rPr>
-              <w:t>c t</w:t>
-            </w:r>
-            <w:r>
-              <w:rPr>
-                <w:rFonts w:ascii="Times New Roman" w:hAnsi="Times New Roman"/>
-                <w:color w:val="1F2937"/>
-                <w:sz w:val="19"/>
-              </w:rPr>
-              <w:t>ế</w:t>
+              <w:t>t repository GitHub chính th</w:t>
+            </w:r>
+            <w:r>
+              <w:rPr>
+                <w:rFonts w:ascii="Times New Roman" w:hAnsi="Times New Roman"/>
+                <w:color w:val="1F2937"/>
+                <w:sz w:val="19"/>
+              </w:rPr>
+              <w:t>ứ</w:t>
+            </w:r>
+            <w:r>
+              <w:rPr>
+                <w:rFonts w:ascii="Times New Roman" w:hAnsi="Times New Roman"/>
+                <w:color w:val="1F2937"/>
+                <w:sz w:val="19"/>
+              </w:rPr>
+              <w:t>c theo MSSV Vũ Bá Hùng</w:t>
             </w:r>
           </w:p>
         </w:tc>
@@ -19223,7 +21348,7 @@
                 <w:color w:val="1F2937"/>
                 <w:sz w:val="19"/>
               </w:rPr>
-              <w:t>90129dd</w:t>
+              <w:t>d98133f</w:t>
             </w:r>
           </w:p>
         </w:tc>
@@ -19249,7 +21374,7 @@
                 <w:color w:val="1F2937"/>
                 <w:sz w:val="19"/>
               </w:rPr>
-              <w:t>feat(verify): add real test scripts, screenshots, and export BAO_CAO_DE_13.pdf</w:t>
+              <w:t>fix: correct gitignore, add SSL cert, enhance Grafana dashboard with Loki panels and 5 LogQL</w:t>
             </w:r>
           </w:p>
         </w:tc>
@@ -19275,119 +21400,7 @@
                 <w:color w:val="1F2937"/>
                 <w:sz w:val="19"/>
               </w:rPr>
-              <w:t>Ki</w:t>
-            </w:r>
-            <w:r>
-              <w:rPr>
-                <w:rFonts w:ascii="Times New Roman" w:hAnsi="Times New Roman"/>
-                <w:color w:val="1F2937"/>
-                <w:sz w:val="19"/>
-              </w:rPr>
-              <w:t>ể</w:t>
-            </w:r>
-            <w:r>
-              <w:rPr>
-                <w:rFonts w:ascii="Times New Roman" w:hAnsi="Times New Roman"/>
-                <w:color w:val="1F2937"/>
-                <w:sz w:val="19"/>
-              </w:rPr>
-              <w:t>m ch</w:t>
-            </w:r>
-            <w:r>
-              <w:rPr>
-                <w:rFonts w:ascii="Times New Roman" w:hAnsi="Times New Roman"/>
-                <w:color w:val="1F2937"/>
-                <w:sz w:val="19"/>
-              </w:rPr>
-              <w:t>ứ</w:t>
-            </w:r>
-            <w:r>
-              <w:rPr>
-                <w:rFonts w:ascii="Times New Roman" w:hAnsi="Times New Roman"/>
-                <w:color w:val="1F2937"/>
-                <w:sz w:val="19"/>
-              </w:rPr>
-              <w:t>ng: Tích h</w:t>
-            </w:r>
-            <w:r>
-              <w:rPr>
-                <w:rFonts w:ascii="Times New Roman" w:hAnsi="Times New Roman"/>
-                <w:color w:val="1F2937"/>
-                <w:sz w:val="19"/>
-              </w:rPr>
-              <w:t>ợ</w:t>
-            </w:r>
-            <w:r>
-              <w:rPr>
-                <w:rFonts w:ascii="Times New Roman" w:hAnsi="Times New Roman"/>
-                <w:color w:val="1F2937"/>
-                <w:sz w:val="19"/>
-              </w:rPr>
-              <w:t xml:space="preserve">p </w:t>
-            </w:r>
-            <w:r>
-              <w:rPr>
-                <w:rFonts w:ascii="Times New Roman" w:hAnsi="Times New Roman"/>
-                <w:color w:val="1F2937"/>
-                <w:sz w:val="19"/>
-              </w:rPr>
-              <w:t>ả</w:t>
-            </w:r>
-            <w:r>
-              <w:rPr>
-                <w:rFonts w:ascii="Times New Roman" w:hAnsi="Times New Roman"/>
-                <w:color w:val="1F2937"/>
-                <w:sz w:val="19"/>
-              </w:rPr>
-              <w:t>nh minh ch</w:t>
-            </w:r>
-            <w:r>
-              <w:rPr>
-                <w:rFonts w:ascii="Times New Roman" w:hAnsi="Times New Roman"/>
-                <w:color w:val="1F2937"/>
-                <w:sz w:val="19"/>
-              </w:rPr>
-              <w:t>ứ</w:t>
-            </w:r>
-            <w:r>
-              <w:rPr>
-                <w:rFonts w:ascii="Times New Roman" w:hAnsi="Times New Roman"/>
-                <w:color w:val="1F2937"/>
-                <w:sz w:val="19"/>
-              </w:rPr>
-              <w:t>ng th</w:t>
-            </w:r>
-            <w:r>
-              <w:rPr>
-                <w:rFonts w:ascii="Times New Roman" w:hAnsi="Times New Roman"/>
-                <w:color w:val="1F2937"/>
-                <w:sz w:val="19"/>
-              </w:rPr>
-              <w:t>ự</w:t>
-            </w:r>
-            <w:r>
-              <w:rPr>
-                <w:rFonts w:ascii="Times New Roman" w:hAnsi="Times New Roman"/>
-                <w:color w:val="1F2937"/>
-                <w:sz w:val="19"/>
-              </w:rPr>
-              <w:t>c t</w:t>
-            </w:r>
-            <w:r>
-              <w:rPr>
-                <w:rFonts w:ascii="Times New Roman" w:hAnsi="Times New Roman"/>
-                <w:color w:val="1F2937"/>
-                <w:sz w:val="19"/>
-              </w:rPr>
-              <w:t>ế</w:t>
-            </w:r>
-            <w:r>
-              <w:rPr>
-                <w:rFonts w:ascii="Times New Roman" w:hAnsi="Times New Roman"/>
-                <w:color w:val="1F2937"/>
-                <w:sz w:val="19"/>
-              </w:rPr>
-              <w:t xml:space="preserve"> và xu</w:t>
+              <w:t>Nâng c</w:t>
             </w:r>
             <w:r>
               <w:rPr>
@@ -19403,39 +21416,23 @@
                 <w:color w:val="1F2937"/>
                 <w:sz w:val="19"/>
               </w:rPr>
-              <w:t>t tài li</w:t>
-            </w:r>
-            <w:r>
-              <w:rPr>
-                <w:rFonts w:ascii="Times New Roman" w:hAnsi="Times New Roman"/>
-                <w:color w:val="1F2937"/>
-                <w:sz w:val="19"/>
-              </w:rPr>
-              <w:t>ệ</w:t>
-            </w:r>
-            <w:r>
-              <w:rPr>
-                <w:rFonts w:ascii="Times New Roman" w:hAnsi="Times New Roman"/>
-                <w:color w:val="1F2937"/>
-                <w:sz w:val="19"/>
-              </w:rPr>
-              <w:t>u báo cáo hoàn ch</w:t>
-            </w:r>
-            <w:r>
-              <w:rPr>
-                <w:rFonts w:ascii="Times New Roman" w:hAnsi="Times New Roman"/>
-                <w:color w:val="1F2937"/>
-                <w:sz w:val="19"/>
-              </w:rPr>
-              <w:t>ỉ</w:t>
-            </w:r>
-            <w:r>
-              <w:rPr>
-                <w:rFonts w:ascii="Times New Roman" w:hAnsi="Times New Roman"/>
-                <w:color w:val="1F2937"/>
-                <w:sz w:val="19"/>
-              </w:rPr>
-              <w:t>nh</w:t>
+              <w:t>p: Grafana 26 panels, b</w:t>
+            </w:r>
+            <w:r>
+              <w:rPr>
+                <w:rFonts w:ascii="Times New Roman" w:hAnsi="Times New Roman"/>
+                <w:color w:val="1F2937"/>
+                <w:sz w:val="19"/>
+              </w:rPr>
+              <w:t>ộ</w:t>
+            </w:r>
+            <w:r>
+              <w:rPr>
+                <w:rFonts w:ascii="Times New Roman" w:hAnsi="Times New Roman"/>
+                <w:color w:val="1F2937"/>
+                <w:sz w:val="19"/>
+              </w:rPr>
+              <w:t xml:space="preserve"> 5 LogQL queries, script verify_hardening.py</w:t>
             </w:r>
           </w:p>
         </w:tc>
@@ -19467,7 +21464,7 @@
                 <w:color w:val="1F2937"/>
                 <w:sz w:val="19"/>
               </w:rPr>
-              <w:t>38d8930</w:t>
+              <w:t>ea3fc37</w:t>
             </w:r>
           </w:p>
         </w:tc>
@@ -19493,7 +21490,7 @@
                 <w:color w:val="1F2937"/>
                 <w:sz w:val="19"/>
               </w:rPr>
-              <w:t>fix: resolve healthcheck endpoint, update student profile and harden exporter passwords</w:t>
+              <w:t>fix(hardening): fix password_hash column name in DB verification script</w:t>
             </w:r>
           </w:p>
         </w:tc>
@@ -19519,39 +21516,23 @@
                 <w:color w:val="1F2937"/>
                 <w:sz w:val="19"/>
               </w:rPr>
-              <w:t>Kh</w:t>
-            </w:r>
-            <w:r>
-              <w:rPr>
-                <w:rFonts w:ascii="Times New Roman" w:hAnsi="Times New Roman"/>
-                <w:color w:val="1F2937"/>
-                <w:sz w:val="19"/>
-              </w:rPr>
-              <w:t>ắ</w:t>
-            </w:r>
-            <w:r>
-              <w:rPr>
-                <w:rFonts w:ascii="Times New Roman" w:hAnsi="Times New Roman"/>
-                <w:color w:val="1F2937"/>
-                <w:sz w:val="19"/>
-              </w:rPr>
-              <w:t>c ph</w:t>
-            </w:r>
-            <w:r>
-              <w:rPr>
-                <w:rFonts w:ascii="Times New Roman" w:hAnsi="Times New Roman"/>
-                <w:color w:val="1F2937"/>
-                <w:sz w:val="19"/>
-              </w:rPr>
-              <w:t>ụ</w:t>
-            </w:r>
-            <w:r>
-              <w:rPr>
-                <w:rFonts w:ascii="Times New Roman" w:hAnsi="Times New Roman"/>
-                <w:color w:val="1F2937"/>
-                <w:sz w:val="19"/>
-              </w:rPr>
-              <w:t>c: S</w:t>
+              <w:t>Ki</w:t>
+            </w:r>
+            <w:r>
+              <w:rPr>
+                <w:rFonts w:ascii="Times New Roman" w:hAnsi="Times New Roman"/>
+                <w:color w:val="1F2937"/>
+                <w:sz w:val="19"/>
+              </w:rPr>
+              <w:t>ể</w:t>
+            </w:r>
+            <w:r>
+              <w:rPr>
+                <w:rFonts w:ascii="Times New Roman" w:hAnsi="Times New Roman"/>
+                <w:color w:val="1F2937"/>
+                <w:sz w:val="19"/>
+              </w:rPr>
+              <w:t>m th</w:t>
             </w:r>
             <w:r>
               <w:rPr>
@@ -19567,87 +21548,103 @@
                 <w:color w:val="1F2937"/>
                 <w:sz w:val="19"/>
               </w:rPr>
-              <w:t>a l</w:t>
-            </w:r>
-            <w:r>
-              <w:rPr>
-                <w:rFonts w:ascii="Times New Roman" w:hAnsi="Times New Roman"/>
-                <w:color w:val="1F2937"/>
-                <w:sz w:val="19"/>
-              </w:rPr>
-              <w:t>ỗ</w:t>
-            </w:r>
-            <w:r>
-              <w:rPr>
-                <w:rFonts w:ascii="Times New Roman" w:hAnsi="Times New Roman"/>
-                <w:color w:val="1F2937"/>
-                <w:sz w:val="19"/>
-              </w:rPr>
-              <w:t>i /health endpoint JSON, c</w:t>
-            </w:r>
-            <w:r>
-              <w:rPr>
-                <w:rFonts w:ascii="Times New Roman" w:hAnsi="Times New Roman"/>
-                <w:color w:val="1F2937"/>
-                <w:sz w:val="19"/>
-              </w:rPr>
-              <w:t>ậ</w:t>
-            </w:r>
-            <w:r>
-              <w:rPr>
-                <w:rFonts w:ascii="Times New Roman" w:hAnsi="Times New Roman"/>
-                <w:color w:val="1F2937"/>
-                <w:sz w:val="19"/>
-              </w:rPr>
-              <w:t>p nh</w:t>
-            </w:r>
-            <w:r>
-              <w:rPr>
-                <w:rFonts w:ascii="Times New Roman" w:hAnsi="Times New Roman"/>
-                <w:color w:val="1F2937"/>
-                <w:sz w:val="19"/>
-              </w:rPr>
-              <w:t>ậ</w:t>
-            </w:r>
-            <w:r>
-              <w:rPr>
-                <w:rFonts w:ascii="Times New Roman" w:hAnsi="Times New Roman"/>
-                <w:color w:val="1F2937"/>
-                <w:sz w:val="19"/>
-              </w:rPr>
-              <w:t>t thông tin SV và m</w:t>
-            </w:r>
-            <w:r>
-              <w:rPr>
-                <w:rFonts w:ascii="Times New Roman" w:hAnsi="Times New Roman"/>
-                <w:color w:val="1F2937"/>
-                <w:sz w:val="19"/>
-              </w:rPr>
-              <w:t>ậ</w:t>
-            </w:r>
-            <w:r>
-              <w:rPr>
-                <w:rFonts w:ascii="Times New Roman" w:hAnsi="Times New Roman"/>
-                <w:color w:val="1F2937"/>
-                <w:sz w:val="19"/>
-              </w:rPr>
-              <w:t>t kh</w:t>
-            </w:r>
-            <w:r>
-              <w:rPr>
-                <w:rFonts w:ascii="Times New Roman" w:hAnsi="Times New Roman"/>
-                <w:color w:val="1F2937"/>
-                <w:sz w:val="19"/>
-              </w:rPr>
-              <w:t>ẩ</w:t>
-            </w:r>
-            <w:r>
-              <w:rPr>
-                <w:rFonts w:ascii="Times New Roman" w:hAnsi="Times New Roman"/>
-                <w:color w:val="1F2937"/>
-                <w:sz w:val="19"/>
-              </w:rPr>
-              <w:t>u exporter</w:t>
+              <w:t>: Hoàn thi</w:t>
+            </w:r>
+            <w:r>
+              <w:rPr>
+                <w:rFonts w:ascii="Times New Roman" w:hAnsi="Times New Roman"/>
+                <w:color w:val="1F2937"/>
+                <w:sz w:val="19"/>
+              </w:rPr>
+              <w:t>ệ</w:t>
+            </w:r>
+            <w:r>
+              <w:rPr>
+                <w:rFonts w:ascii="Times New Roman" w:hAnsi="Times New Roman"/>
+                <w:color w:val="1F2937"/>
+                <w:sz w:val="19"/>
+              </w:rPr>
+              <w:t>n k</w:t>
+            </w:r>
+            <w:r>
+              <w:rPr>
+                <w:rFonts w:ascii="Times New Roman" w:hAnsi="Times New Roman"/>
+                <w:color w:val="1F2937"/>
+                <w:sz w:val="19"/>
+              </w:rPr>
+              <w:t>ị</w:t>
+            </w:r>
+            <w:r>
+              <w:rPr>
+                <w:rFonts w:ascii="Times New Roman" w:hAnsi="Times New Roman"/>
+                <w:color w:val="1F2937"/>
+                <w:sz w:val="19"/>
+              </w:rPr>
+              <w:t>ch b</w:t>
+            </w:r>
+            <w:r>
+              <w:rPr>
+                <w:rFonts w:ascii="Times New Roman" w:hAnsi="Times New Roman"/>
+                <w:color w:val="1F2937"/>
+                <w:sz w:val="19"/>
+              </w:rPr>
+              <w:t>ả</w:t>
+            </w:r>
+            <w:r>
+              <w:rPr>
+                <w:rFonts w:ascii="Times New Roman" w:hAnsi="Times New Roman"/>
+                <w:color w:val="1F2937"/>
+                <w:sz w:val="19"/>
+              </w:rPr>
+              <w:t>n verify_hardening.py đ</w:t>
+            </w:r>
+            <w:r>
+              <w:rPr>
+                <w:rFonts w:ascii="Times New Roman" w:hAnsi="Times New Roman"/>
+                <w:color w:val="1F2937"/>
+                <w:sz w:val="19"/>
+              </w:rPr>
+              <w:t>ạ</w:t>
+            </w:r>
+            <w:r>
+              <w:rPr>
+                <w:rFonts w:ascii="Times New Roman" w:hAnsi="Times New Roman"/>
+                <w:color w:val="1F2937"/>
+                <w:sz w:val="19"/>
+              </w:rPr>
+              <w:t>t tuy</w:t>
+            </w:r>
+            <w:r>
+              <w:rPr>
+                <w:rFonts w:ascii="Times New Roman" w:hAnsi="Times New Roman"/>
+                <w:color w:val="1F2937"/>
+                <w:sz w:val="19"/>
+              </w:rPr>
+              <w:t>ệ</w:t>
+            </w:r>
+            <w:r>
+              <w:rPr>
+                <w:rFonts w:ascii="Times New Roman" w:hAnsi="Times New Roman"/>
+                <w:color w:val="1F2937"/>
+                <w:sz w:val="19"/>
+              </w:rPr>
+              <w:t>t đ</w:t>
+            </w:r>
+            <w:r>
+              <w:rPr>
+                <w:rFonts w:ascii="Times New Roman" w:hAnsi="Times New Roman"/>
+                <w:color w:val="1F2937"/>
+                <w:sz w:val="19"/>
+              </w:rPr>
+              <w:t>ố</w:t>
+            </w:r>
+            <w:r>
+              <w:rPr>
+                <w:rFonts w:ascii="Times New Roman" w:hAnsi="Times New Roman"/>
+                <w:color w:val="1F2937"/>
+                <w:sz w:val="19"/>
+              </w:rPr>
+              <w:t>i 22/22 tiêu chí</w:t>
             </w:r>
           </w:p>
         </w:tc>
@@ -19679,7 +21676,7 @@
                 <w:color w:val="1F2937"/>
                 <w:sz w:val="19"/>
               </w:rPr>
-              <w:t>e99d7f6</w:t>
+              <w:t>3b34985</w:t>
             </w:r>
           </w:p>
         </w:tc>
@@ -19705,7 +21702,7 @@
                 <w:color w:val="1F2937"/>
                 <w:sz w:val="19"/>
               </w:rPr>
-              <w:t>docs: update repository name and title to Vu Ba Hung DTC245180186 Website Portfolio</w:t>
+              <w:t>fix(dashboard): enhance cadvisor and loki stream queries for windows/linux compatibility</w:t>
             </w:r>
           </w:p>
         </w:tc>
@@ -19731,7 +21728,23 @@
                 <w:color w:val="1F2937"/>
                 <w:sz w:val="19"/>
               </w:rPr>
-              <w:t>Đ</w:t>
+              <w:t>Tương thích: T</w:t>
+            </w:r>
+            <w:r>
+              <w:rPr>
+                <w:rFonts w:ascii="Times New Roman" w:hAnsi="Times New Roman"/>
+                <w:color w:val="1F2937"/>
+                <w:sz w:val="19"/>
+              </w:rPr>
+              <w:t>ố</w:t>
+            </w:r>
+            <w:r>
+              <w:rPr>
+                <w:rFonts w:ascii="Times New Roman" w:hAnsi="Times New Roman"/>
+                <w:color w:val="1F2937"/>
+                <w:sz w:val="19"/>
+              </w:rPr>
+              <w:t>i ưu query cAdvisor và phân tách lu</w:t>
             </w:r>
             <w:r>
               <w:rPr>
@@ -19747,39 +21760,91 @@
                 <w:color w:val="1F2937"/>
                 <w:sz w:val="19"/>
               </w:rPr>
-              <w:t>ng b</w:t>
-            </w:r>
-            <w:r>
-              <w:rPr>
-                <w:rFonts w:ascii="Times New Roman" w:hAnsi="Times New Roman"/>
-                <w:color w:val="1F2937"/>
-                <w:sz w:val="19"/>
-              </w:rPr>
-              <w:t>ộ</w:t>
-            </w:r>
-            <w:r>
-              <w:rPr>
-                <w:rFonts w:ascii="Times New Roman" w:hAnsi="Times New Roman"/>
-                <w:color w:val="1F2937"/>
-                <w:sz w:val="19"/>
-              </w:rPr>
-              <w:t>: Đ</w:t>
-            </w:r>
-            <w:r>
-              <w:rPr>
-                <w:rFonts w:ascii="Times New Roman" w:hAnsi="Times New Roman"/>
-                <w:color w:val="1F2937"/>
-                <w:sz w:val="19"/>
-              </w:rPr>
-              <w:t>ổ</w:t>
-            </w:r>
-            <w:r>
-              <w:rPr>
-                <w:rFonts w:ascii="Times New Roman" w:hAnsi="Times New Roman"/>
-                <w:color w:val="1F2937"/>
-                <w:sz w:val="19"/>
-              </w:rPr>
-              <w:t>i tên và liên k</w:t>
+              <w:t>ng stdout JSON cho Nginx</w:t>
+            </w:r>
+          </w:p>
+        </w:tc>
+      </w:tr>
+      <w:tr>
+        <w:trPr>
+          <w:cantSplit/>
+          <w:jc w:val="center"/>
+        </w:trPr>
+        <w:tc>
+          <w:tcPr>
+            <w:tcW w:w="1417" w:type="dxa"/>
+            <w:shd w:val="clear" w:color="auto" w:fill="F8FAFC"/>
+            <w:tcMar>
+              <w:top w:w="70" w:type="dxa"/>
+              <w:left w:w="110" w:type="dxa"/>
+              <w:bottom w:w="70" w:type="dxa"/>
+              <w:right w:w="110" w:type="dxa"/>
+            </w:tcMar>
+            <w:vAlign w:val="center"/>
+          </w:tcPr>
+          <w:p>
+            <w:pPr>
+              <w:spacing w:before="20" w:after="40"/>
+            </w:pPr>
+            <w:r>
+              <w:rPr>
+                <w:rFonts w:ascii="Times New Roman" w:hAnsi="Times New Roman"/>
+                <w:color w:val="1F2937"/>
+                <w:sz w:val="19"/>
+              </w:rPr>
+              <w:t>f8be201</w:t>
+            </w:r>
+          </w:p>
+        </w:tc>
+        <w:tc>
+          <w:tcPr>
+            <w:tcW w:w="4535" w:type="dxa"/>
+            <w:shd w:val="clear" w:color="auto" w:fill="F8FAFC"/>
+            <w:tcMar>
+              <w:top w:w="70" w:type="dxa"/>
+              <w:left w:w="110" w:type="dxa"/>
+              <w:bottom w:w="70" w:type="dxa"/>
+              <w:right w:w="110" w:type="dxa"/>
+            </w:tcMar>
+            <w:vAlign w:val="center"/>
+          </w:tcPr>
+          <w:p>
+            <w:pPr>
+              <w:spacing w:before="20" w:after="40"/>
+            </w:pPr>
+            <w:r>
+              <w:rPr>
+                <w:rFonts w:ascii="Times New Roman" w:hAnsi="Times New Roman"/>
+                <w:color w:val="1F2937"/>
+                <w:sz w:val="19"/>
+              </w:rPr>
+              <w:t>fix(dashboard): change LogQL #3 to stream live PHP container logs</w:t>
+            </w:r>
+          </w:p>
+        </w:tc>
+        <w:tc>
+          <w:tcPr>
+            <w:tcW w:w="3118" w:type="dxa"/>
+            <w:shd w:val="clear" w:color="auto" w:fill="F8FAFC"/>
+            <w:tcMar>
+              <w:top w:w="70" w:type="dxa"/>
+              <w:left w:w="110" w:type="dxa"/>
+              <w:bottom w:w="70" w:type="dxa"/>
+              <w:right w:w="110" w:type="dxa"/>
+            </w:tcMar>
+            <w:vAlign w:val="center"/>
+          </w:tcPr>
+          <w:p>
+            <w:pPr>
+              <w:spacing w:before="20" w:after="40"/>
+            </w:pPr>
+            <w:r>
+              <w:rPr>
+                <w:rFonts w:ascii="Times New Roman" w:hAnsi="Times New Roman"/>
+                <w:color w:val="1F2937"/>
+                <w:sz w:val="19"/>
+              </w:rPr>
+              <w:t>Giám sát: K</w:t>
             </w:r>
             <w:r>
               <w:rPr>
@@ -19795,23 +21860,87 @@
                 <w:color w:val="1F2937"/>
                 <w:sz w:val="19"/>
               </w:rPr>
-              <w:t>t repository GitHub chính th</w:t>
-            </w:r>
-            <w:r>
-              <w:rPr>
-                <w:rFonts w:ascii="Times New Roman" w:hAnsi="Times New Roman"/>
-                <w:color w:val="1F2937"/>
-                <w:sz w:val="19"/>
-              </w:rPr>
-              <w:t>ứ</w:t>
-            </w:r>
-            <w:r>
-              <w:rPr>
-                <w:rFonts w:ascii="Times New Roman" w:hAnsi="Times New Roman"/>
-                <w:color w:val="1F2937"/>
-                <w:sz w:val="19"/>
-              </w:rPr>
-              <w:t>c theo MSSV</w:t>
+              <w:t>t n</w:t>
+            </w:r>
+            <w:r>
+              <w:rPr>
+                <w:rFonts w:ascii="Times New Roman" w:hAnsi="Times New Roman"/>
+                <w:color w:val="1F2937"/>
+                <w:sz w:val="19"/>
+              </w:rPr>
+              <w:t>ố</w:t>
+            </w:r>
+            <w:r>
+              <w:rPr>
+                <w:rFonts w:ascii="Times New Roman" w:hAnsi="Times New Roman"/>
+                <w:color w:val="1F2937"/>
+                <w:sz w:val="19"/>
+              </w:rPr>
+              <w:t>i lu</w:t>
+            </w:r>
+            <w:r>
+              <w:rPr>
+                <w:rFonts w:ascii="Times New Roman" w:hAnsi="Times New Roman"/>
+                <w:color w:val="1F2937"/>
+                <w:sz w:val="19"/>
+              </w:rPr>
+              <w:t>ồ</w:t>
+            </w:r>
+            <w:r>
+              <w:rPr>
+                <w:rFonts w:ascii="Times New Roman" w:hAnsi="Times New Roman"/>
+                <w:color w:val="1F2937"/>
+                <w:sz w:val="19"/>
+              </w:rPr>
+              <w:t>ng log PHP container th</w:t>
+            </w:r>
+            <w:r>
+              <w:rPr>
+                <w:rFonts w:ascii="Times New Roman" w:hAnsi="Times New Roman"/>
+                <w:color w:val="1F2937"/>
+                <w:sz w:val="19"/>
+              </w:rPr>
+              <w:t>ờ</w:t>
+            </w:r>
+            <w:r>
+              <w:rPr>
+                <w:rFonts w:ascii="Times New Roman" w:hAnsi="Times New Roman"/>
+                <w:color w:val="1F2937"/>
+                <w:sz w:val="19"/>
+              </w:rPr>
+              <w:t>i gian th</w:t>
+            </w:r>
+            <w:r>
+              <w:rPr>
+                <w:rFonts w:ascii="Times New Roman" w:hAnsi="Times New Roman"/>
+                <w:color w:val="1F2937"/>
+                <w:sz w:val="19"/>
+              </w:rPr>
+              <w:t>ự</w:t>
+            </w:r>
+            <w:r>
+              <w:rPr>
+                <w:rFonts w:ascii="Times New Roman" w:hAnsi="Times New Roman"/>
+                <w:color w:val="1F2937"/>
+                <w:sz w:val="19"/>
+              </w:rPr>
+              <w:t>c vào b</w:t>
+            </w:r>
+            <w:r>
+              <w:rPr>
+                <w:rFonts w:ascii="Times New Roman" w:hAnsi="Times New Roman"/>
+                <w:color w:val="1F2937"/>
+                <w:sz w:val="19"/>
+              </w:rPr>
+              <w:t>ả</w:t>
+            </w:r>
+            <w:r>
+              <w:rPr>
+                <w:rFonts w:ascii="Times New Roman" w:hAnsi="Times New Roman"/>
+                <w:color w:val="1F2937"/>
+                <w:sz w:val="19"/>
+              </w:rPr>
+              <w:t>ng LogQL #3</w:t>
             </w:r>
           </w:p>
         </w:tc>
@@ -20084,6 +22213,7 @@
           <w:color w:val="1F2937"/>
           <w:sz w:val="23"/>
         </w:rPr>
+        <w:lastRenderedPageBreak/>
         <w:t>2. Nhánh M</w:t>
       </w:r>
       <w:r>
@@ -20315,23 +22445,119 @@
           <w:color w:val="1F2937"/>
           <w:sz w:val="23"/>
         </w:rPr>
-        <w:t>8 commits chu</w:t>
-      </w:r>
-      <w:r>
-        <w:rPr>
-          <w:rFonts w:ascii="Times New Roman" w:hAnsi="Times New Roman"/>
-          <w:color w:val="1F2937"/>
-          <w:sz w:val="23"/>
-        </w:rPr>
-        <w:t>ẩ</w:t>
-      </w:r>
-      <w:r>
-        <w:rPr>
-          <w:rFonts w:ascii="Times New Roman" w:hAnsi="Times New Roman"/>
-          <w:color w:val="1F2937"/>
-          <w:sz w:val="23"/>
-        </w:rPr>
-        <w:t>n Conventional Commits theo các m</w:t>
+        <w:t>L</w:t>
+      </w:r>
+      <w:r>
+        <w:rPr>
+          <w:rFonts w:ascii="Times New Roman" w:hAnsi="Times New Roman"/>
+          <w:color w:val="1F2937"/>
+          <w:sz w:val="23"/>
+        </w:rPr>
+        <w:t>ị</w:t>
+      </w:r>
+      <w:r>
+        <w:rPr>
+          <w:rFonts w:ascii="Times New Roman" w:hAnsi="Times New Roman"/>
+          <w:color w:val="1F2937"/>
+          <w:sz w:val="23"/>
+        </w:rPr>
+        <w:t>ch s</w:t>
+      </w:r>
+      <w:r>
+        <w:rPr>
+          <w:rFonts w:ascii="Times New Roman" w:hAnsi="Times New Roman"/>
+          <w:color w:val="1F2937"/>
+          <w:sz w:val="23"/>
+        </w:rPr>
+        <w:t>ử</w:t>
+      </w:r>
+      <w:r>
+        <w:rPr>
+          <w:rFonts w:ascii="Times New Roman" w:hAnsi="Times New Roman"/>
+          <w:color w:val="1F2937"/>
+          <w:sz w:val="23"/>
+        </w:rPr>
+        <w:t xml:space="preserve"> commit đ</w:t>
+      </w:r>
+      <w:r>
+        <w:rPr>
+          <w:rFonts w:ascii="Times New Roman" w:hAnsi="Times New Roman"/>
+          <w:color w:val="1F2937"/>
+          <w:sz w:val="23"/>
+        </w:rPr>
+        <w:t>ầ</w:t>
+      </w:r>
+      <w:r>
+        <w:rPr>
+          <w:rFonts w:ascii="Times New Roman" w:hAnsi="Times New Roman"/>
+          <w:color w:val="1F2937"/>
+          <w:sz w:val="23"/>
+        </w:rPr>
+        <w:t>y đ</w:t>
+      </w:r>
+      <w:r>
+        <w:rPr>
+          <w:rFonts w:ascii="Times New Roman" w:hAnsi="Times New Roman"/>
+          <w:color w:val="1F2937"/>
+          <w:sz w:val="23"/>
+        </w:rPr>
+        <w:t>ủ</w:t>
+      </w:r>
+      <w:r>
+        <w:rPr>
+          <w:rFonts w:ascii="Times New Roman" w:hAnsi="Times New Roman"/>
+          <w:color w:val="1F2937"/>
+          <w:sz w:val="23"/>
+        </w:rPr>
+        <w:t>, tuân th</w:t>
+      </w:r>
+      <w:r>
+        <w:rPr>
+          <w:rFonts w:ascii="Times New Roman" w:hAnsi="Times New Roman"/>
+          <w:color w:val="1F2937"/>
+          <w:sz w:val="23"/>
+        </w:rPr>
+        <w:t>ủ</w:t>
+      </w:r>
+      <w:r>
+        <w:rPr>
+          <w:rFonts w:ascii="Times New Roman" w:hAnsi="Times New Roman"/>
+          <w:color w:val="1F2937"/>
+          <w:sz w:val="23"/>
+        </w:rPr>
+        <w:t xml:space="preserve"> ch</w:t>
+      </w:r>
+      <w:r>
+        <w:rPr>
+          <w:rFonts w:ascii="Times New Roman" w:hAnsi="Times New Roman"/>
+          <w:color w:val="1F2937"/>
+          <w:sz w:val="23"/>
+        </w:rPr>
+        <w:t>ặ</w:t>
+      </w:r>
+      <w:r>
+        <w:rPr>
+          <w:rFonts w:ascii="Times New Roman" w:hAnsi="Times New Roman"/>
+          <w:color w:val="1F2937"/>
+          <w:sz w:val="23"/>
+        </w:rPr>
+        <w:t>t ch</w:t>
+      </w:r>
+      <w:r>
+        <w:rPr>
+          <w:rFonts w:ascii="Times New Roman" w:hAnsi="Times New Roman"/>
+          <w:color w:val="1F2937"/>
+          <w:sz w:val="23"/>
+        </w:rPr>
+        <w:t>ẽ</w:t>
+      </w:r>
+      <w:r>
+        <w:rPr>
+          <w:rFonts w:ascii="Times New Roman" w:hAnsi="Times New Roman"/>
+          <w:color w:val="1F2937"/>
+          <w:sz w:val="23"/>
+        </w:rPr>
+        <w:t xml:space="preserve"> Conventional Commits theo đúng các m</w:t>
       </w:r>
       <w:r>
         <w:rPr>
@@ -20347,55 +22573,39 @@
           <w:color w:val="1F2937"/>
           <w:sz w:val="23"/>
         </w:rPr>
-        <w:t>c k</w:t>
-      </w:r>
-      <w:r>
-        <w:rPr>
-          <w:rFonts w:ascii="Times New Roman" w:hAnsi="Times New Roman"/>
-          <w:color w:val="1F2937"/>
-          <w:sz w:val="23"/>
-        </w:rPr>
-        <w:t>ỹ</w:t>
-      </w:r>
-      <w:r>
-        <w:rPr>
-          <w:rFonts w:ascii="Times New Roman" w:hAnsi="Times New Roman"/>
-          <w:color w:val="1F2937"/>
-          <w:sz w:val="23"/>
-        </w:rPr>
-        <w:t xml:space="preserve"> thu</w:t>
-      </w:r>
-      <w:r>
-        <w:rPr>
-          <w:rFonts w:ascii="Times New Roman" w:hAnsi="Times New Roman"/>
-          <w:color w:val="1F2937"/>
-          <w:sz w:val="23"/>
-        </w:rPr>
-        <w:t>ậ</w:t>
-      </w:r>
-      <w:r>
-        <w:rPr>
-          <w:rFonts w:ascii="Times New Roman" w:hAnsi="Times New Roman"/>
-          <w:color w:val="1F2937"/>
-          <w:sz w:val="23"/>
-        </w:rPr>
-        <w:t>t phát tri</w:t>
-      </w:r>
-      <w:r>
-        <w:rPr>
-          <w:rFonts w:ascii="Times New Roman" w:hAnsi="Times New Roman"/>
-          <w:color w:val="1F2937"/>
-          <w:sz w:val="23"/>
-        </w:rPr>
-        <w:t>ể</w:t>
-      </w:r>
-      <w:r>
-        <w:rPr>
-          <w:rFonts w:ascii="Times New Roman" w:hAnsi="Times New Roman"/>
-          <w:color w:val="1F2937"/>
-          <w:sz w:val="23"/>
-        </w:rPr>
-        <w:t>n</w:t>
+        <w:t>c yêu c</w:t>
+      </w:r>
+      <w:r>
+        <w:rPr>
+          <w:rFonts w:ascii="Times New Roman" w:hAnsi="Times New Roman"/>
+          <w:color w:val="1F2937"/>
+          <w:sz w:val="23"/>
+        </w:rPr>
+        <w:t>ầ</w:t>
+      </w:r>
+      <w:r>
+        <w:rPr>
+          <w:rFonts w:ascii="Times New Roman" w:hAnsi="Times New Roman"/>
+          <w:color w:val="1F2937"/>
+          <w:sz w:val="23"/>
+        </w:rPr>
+        <w:t>u đ</w:t>
+      </w:r>
+      <w:r>
+        <w:rPr>
+          <w:rFonts w:ascii="Times New Roman" w:hAnsi="Times New Roman"/>
+          <w:color w:val="1F2937"/>
+          <w:sz w:val="23"/>
+        </w:rPr>
+        <w:t>ề</w:t>
+      </w:r>
+      <w:r>
+        <w:rPr>
+          <w:rFonts w:ascii="Times New Roman" w:hAnsi="Times New Roman"/>
+          <w:color w:val="1F2937"/>
+          <w:sz w:val="23"/>
+        </w:rPr>
+        <w:t xml:space="preserve"> bài</w:t>
       </w:r>
     </w:p>
     <w:p>
@@ -23613,6 +25823,7 @@
                 <w:color w:val="FFFFFF"/>
                 <w:sz w:val="20"/>
               </w:rPr>
+              <w:lastRenderedPageBreak/>
               <w:t>STT</w:t>
             </w:r>
           </w:p>
@@ -23911,7 +26122,6 @@
                 <w:color w:val="1F2937"/>
                 <w:sz w:val="19"/>
               </w:rPr>
-              <w:lastRenderedPageBreak/>
               <w:t>1</w:t>
             </w:r>
           </w:p>
@@ -27087,31 +29297,31 @@
       </w:rPr>
     </w:lvl>
   </w:abstractNum>
-  <w:num w:numId="1" w16cid:durableId="641231172">
+  <w:num w:numId="1" w16cid:durableId="1979139341">
     <w:abstractNumId w:val="8"/>
   </w:num>
-  <w:num w:numId="2" w16cid:durableId="1262182451">
+  <w:num w:numId="2" w16cid:durableId="255871249">
     <w:abstractNumId w:val="6"/>
   </w:num>
-  <w:num w:numId="3" w16cid:durableId="1122652248">
+  <w:num w:numId="3" w16cid:durableId="2137870472">
     <w:abstractNumId w:val="5"/>
   </w:num>
-  <w:num w:numId="4" w16cid:durableId="1715159620">
+  <w:num w:numId="4" w16cid:durableId="1076974372">
     <w:abstractNumId w:val="4"/>
   </w:num>
-  <w:num w:numId="5" w16cid:durableId="342632230">
+  <w:num w:numId="5" w16cid:durableId="541870164">
     <w:abstractNumId w:val="7"/>
   </w:num>
-  <w:num w:numId="6" w16cid:durableId="806432551">
+  <w:num w:numId="6" w16cid:durableId="244344922">
     <w:abstractNumId w:val="3"/>
   </w:num>
-  <w:num w:numId="7" w16cid:durableId="1874882436">
+  <w:num w:numId="7" w16cid:durableId="1632393879">
     <w:abstractNumId w:val="2"/>
   </w:num>
-  <w:num w:numId="8" w16cid:durableId="1017804157">
+  <w:num w:numId="8" w16cid:durableId="1691175867">
     <w:abstractNumId w:val="1"/>
   </w:num>
-  <w:num w:numId="9" w16cid:durableId="1347562925">
+  <w:num w:numId="9" w16cid:durableId="1655066121">
     <w:abstractNumId w:val="0"/>
   </w:num>
 </w:numbering>

</xml_diff>

<commit_message>
docs: finalize 19-page Word and PDF reports matching exact teacher rubric and verified achievements
</commit_message>
<xml_diff>
--- a/BAO_CAO_DE_13.docx
+++ b/BAO_CAO_DE_13.docx
@@ -9773,7 +9773,7 @@
           <w:noProof/>
         </w:rPr>
         <w:drawing>
-          <wp:inline distT="0" distB="0" distL="0" distR="0" wp14:anchorId="2683E746" wp14:editId="2D4C3BFA">
+          <wp:inline distT="0" distB="0" distL="0" distR="0" wp14:anchorId="1341A457" wp14:editId="584A5E1E">
             <wp:extent cx="5400000" cy="2840309"/>
             <wp:effectExtent l="0" t="0" r="0" b="0"/>
             <wp:docPr id="1" name="Picture 1"/>
@@ -9907,7 +9907,7 @@
         </w:rPr>
         <w:lastRenderedPageBreak/>
         <w:drawing>
-          <wp:inline distT="0" distB="0" distL="0" distR="0" wp14:anchorId="60A5AD9A" wp14:editId="4F01C73C">
+          <wp:inline distT="0" distB="0" distL="0" distR="0" wp14:anchorId="38098DCD" wp14:editId="6191B056">
             <wp:extent cx="4320000" cy="5015106"/>
             <wp:effectExtent l="0" t="0" r="0" b="0"/>
             <wp:docPr id="2" name="Picture 2"/>
@@ -10059,7 +10059,7 @@
         </w:rPr>
         <w:lastRenderedPageBreak/>
         <w:drawing>
-          <wp:inline distT="0" distB="0" distL="0" distR="0" wp14:anchorId="12451DEB" wp14:editId="0099810A">
+          <wp:inline distT="0" distB="0" distL="0" distR="0" wp14:anchorId="2D26BC4B" wp14:editId="4212560C">
             <wp:extent cx="2880000" cy="3807360"/>
             <wp:effectExtent l="0" t="0" r="0" b="0"/>
             <wp:docPr id="3" name="Picture 3"/>
@@ -10192,7 +10192,7 @@
           <w:noProof/>
         </w:rPr>
         <w:drawing>
-          <wp:inline distT="0" distB="0" distL="0" distR="0" wp14:anchorId="1BF806BF" wp14:editId="15278403">
+          <wp:inline distT="0" distB="0" distL="0" distR="0" wp14:anchorId="547BEB2A" wp14:editId="30F99E2C">
             <wp:extent cx="5400000" cy="2840309"/>
             <wp:effectExtent l="0" t="0" r="0" b="0"/>
             <wp:docPr id="4" name="Picture 4"/>
@@ -13255,7 +13255,7 @@
           <w:noProof/>
         </w:rPr>
         <w:drawing>
-          <wp:inline distT="0" distB="0" distL="0" distR="0" wp14:anchorId="28003607" wp14:editId="2B257EF4">
+          <wp:inline distT="0" distB="0" distL="0" distR="0" wp14:anchorId="7335D7BF" wp14:editId="73A2AB73">
             <wp:extent cx="5400000" cy="2894318"/>
             <wp:effectExtent l="0" t="0" r="0" b="0"/>
             <wp:docPr id="5" name="Picture 5"/>
@@ -26248,39 +26248,23 @@
                 <w:color w:val="1F2937"/>
                 <w:sz w:val="19"/>
               </w:rPr>
-              <w:t>c commit th</w:t>
-            </w:r>
-            <w:r>
-              <w:rPr>
-                <w:rFonts w:ascii="Times New Roman" w:hAnsi="Times New Roman"/>
-                <w:color w:val="1F2937"/>
-                <w:sz w:val="19"/>
-              </w:rPr>
-              <w:t>ự</w:t>
-            </w:r>
-            <w:r>
-              <w:rPr>
-                <w:rFonts w:ascii="Times New Roman" w:hAnsi="Times New Roman"/>
-                <w:color w:val="1F2937"/>
-                <w:sz w:val="19"/>
-              </w:rPr>
-              <w:t>c ch</w:t>
-            </w:r>
-            <w:r>
-              <w:rPr>
-                <w:rFonts w:ascii="Times New Roman" w:hAnsi="Times New Roman"/>
-                <w:color w:val="1F2937"/>
-                <w:sz w:val="19"/>
-              </w:rPr>
-              <w:t>ấ</w:t>
-            </w:r>
-            <w:r>
-              <w:rPr>
-                <w:rFonts w:ascii="Times New Roman" w:hAnsi="Times New Roman"/>
-                <w:color w:val="1F2937"/>
-                <w:sz w:val="19"/>
-              </w:rPr>
-              <w:t>t + 5 commit hoàn thi</w:t>
+              <w:t>c commit c</w:t>
+            </w:r>
+            <w:r>
+              <w:rPr>
+                <w:rFonts w:ascii="Times New Roman" w:hAnsi="Times New Roman"/>
+                <w:color w:val="1F2937"/>
+                <w:sz w:val="19"/>
+              </w:rPr>
+              <w:t>ố</w:t>
+            </w:r>
+            <w:r>
+              <w:rPr>
+                <w:rFonts w:ascii="Times New Roman" w:hAnsi="Times New Roman"/>
+                <w:color w:val="1F2937"/>
+                <w:sz w:val="19"/>
+              </w:rPr>
+              <w:t>t lõi + các commit hoàn thi</w:t>
             </w:r>
             <w:r>
               <w:rPr>
@@ -26296,7 +26280,23 @@
                 <w:color w:val="1F2937"/>
                 <w:sz w:val="19"/>
               </w:rPr>
-              <w:t>n; đã push GitHub; README chi ti</w:t>
+              <w:t>n; Repo đ</w:t>
+            </w:r>
+            <w:r>
+              <w:rPr>
+                <w:rFonts w:ascii="Times New Roman" w:hAnsi="Times New Roman"/>
+                <w:color w:val="1F2937"/>
+                <w:sz w:val="19"/>
+              </w:rPr>
+              <w:t>ặ</w:t>
+            </w:r>
+            <w:r>
+              <w:rPr>
+                <w:rFonts w:ascii="Times New Roman" w:hAnsi="Times New Roman"/>
+                <w:color w:val="1F2937"/>
+                <w:sz w:val="19"/>
+              </w:rPr>
+              <w:t>t tên theo MSSV (DTC245180186); README chi ti</w:t>
             </w:r>
             <w:r>
               <w:rPr>
@@ -26529,7 +26529,23 @@
                 <w:color w:val="1F2937"/>
                 <w:sz w:val="19"/>
               </w:rPr>
-              <w:t>N</w:t>
+              <w:t>Giao di</w:t>
+            </w:r>
+            <w:r>
+              <w:rPr>
+                <w:rFonts w:ascii="Times New Roman" w:hAnsi="Times New Roman"/>
+                <w:color w:val="1F2937"/>
+                <w:sz w:val="19"/>
+              </w:rPr>
+              <w:t>ệ</w:t>
+            </w:r>
+            <w:r>
+              <w:rPr>
+                <w:rFonts w:ascii="Times New Roman" w:hAnsi="Times New Roman"/>
+                <w:color w:val="1F2937"/>
+                <w:sz w:val="19"/>
+              </w:rPr>
+              <w:t>n n</w:t>
             </w:r>
             <w:r>
               <w:rPr>
@@ -26609,7 +26625,71 @@
                 <w:color w:val="1F2937"/>
                 <w:sz w:val="19"/>
               </w:rPr>
-              <w:t>ng 3NF; Full CRUD; phpMyAdmin 8080</w:t>
+              <w:t>ng 3NF; Full CRUD Admin; phpMyAdmin port 8080 ho</w:t>
+            </w:r>
+            <w:r>
+              <w:rPr>
+                <w:rFonts w:ascii="Times New Roman" w:hAnsi="Times New Roman"/>
+                <w:color w:val="1F2937"/>
+                <w:sz w:val="19"/>
+              </w:rPr>
+              <w:t>ạ</w:t>
+            </w:r>
+            <w:r>
+              <w:rPr>
+                <w:rFonts w:ascii="Times New Roman" w:hAnsi="Times New Roman"/>
+                <w:color w:val="1F2937"/>
+                <w:sz w:val="19"/>
+              </w:rPr>
+              <w:t>t đ</w:t>
+            </w:r>
+            <w:r>
+              <w:rPr>
+                <w:rFonts w:ascii="Times New Roman" w:hAnsi="Times New Roman"/>
+                <w:color w:val="1F2937"/>
+                <w:sz w:val="19"/>
+              </w:rPr>
+              <w:t>ộ</w:t>
+            </w:r>
+            <w:r>
+              <w:rPr>
+                <w:rFonts w:ascii="Times New Roman" w:hAnsi="Times New Roman"/>
+                <w:color w:val="1F2937"/>
+                <w:sz w:val="19"/>
+              </w:rPr>
+              <w:t xml:space="preserve">ng </w:t>
+            </w:r>
+            <w:r>
+              <w:rPr>
+                <w:rFonts w:ascii="Times New Roman" w:hAnsi="Times New Roman"/>
+                <w:color w:val="1F2937"/>
+                <w:sz w:val="19"/>
+              </w:rPr>
+              <w:t>ổ</w:t>
+            </w:r>
+            <w:r>
+              <w:rPr>
+                <w:rFonts w:ascii="Times New Roman" w:hAnsi="Times New Roman"/>
+                <w:color w:val="1F2937"/>
+                <w:sz w:val="19"/>
+              </w:rPr>
+              <w:t>n đ</w:t>
+            </w:r>
+            <w:r>
+              <w:rPr>
+                <w:rFonts w:ascii="Times New Roman" w:hAnsi="Times New Roman"/>
+                <w:color w:val="1F2937"/>
+                <w:sz w:val="19"/>
+              </w:rPr>
+              <w:t>ị</w:t>
+            </w:r>
+            <w:r>
+              <w:rPr>
+                <w:rFonts w:ascii="Times New Roman" w:hAnsi="Times New Roman"/>
+                <w:color w:val="1F2937"/>
+                <w:sz w:val="19"/>
+              </w:rPr>
+              <w:t>nh</w:t>
             </w:r>
           </w:p>
         </w:tc>
@@ -26842,7 +26922,7 @@
                 <w:color w:val="1F2937"/>
                 <w:sz w:val="19"/>
               </w:rPr>
-              <w:t>i PHP-FPM; TLS HTTPS; Rate limit 5r/m; Security headers</w:t>
+              <w:t>i PHP-FPM; TLS HTTPS; 6 Security headers; Rate limiting (5r/m login, 3r/m contact)</w:t>
             </w:r>
           </w:p>
         </w:tc>
@@ -27043,7 +27123,7 @@
                 <w:color w:val="1F2937"/>
                 <w:sz w:val="19"/>
               </w:rPr>
-              <w:t xml:space="preserve"> 3 nhóm: Container, Nginx, MySQL; 5/5 targets UP; Grafana dashboard provisioned t</w:t>
+              <w:t xml:space="preserve"> 3 nhóm: Container, Nginx, MySQL; 5/5 targets UP; Grafana dashboard 26 panels provisioned t</w:t>
             </w:r>
             <w:r>
               <w:rPr>
@@ -27260,7 +27340,7 @@
                 <w:color w:val="1F2937"/>
                 <w:sz w:val="19"/>
               </w:rPr>
-              <w:t>Promtail thu th</w:t>
+              <w:t>Loki + Promtail thu th</w:t>
             </w:r>
             <w:r>
               <w:rPr>
@@ -27276,23 +27356,39 @@
                 <w:color w:val="1F2937"/>
                 <w:sz w:val="19"/>
               </w:rPr>
-              <w:t>p Nginx JSON Log; Loki TSDB v13; Đ</w:t>
-            </w:r>
-            <w:r>
-              <w:rPr>
-                <w:rFonts w:ascii="Times New Roman" w:hAnsi="Times New Roman"/>
-                <w:color w:val="1F2937"/>
-                <w:sz w:val="19"/>
-              </w:rPr>
-              <w:t>ủ</w:t>
-            </w:r>
-            <w:r>
-              <w:rPr>
-                <w:rFonts w:ascii="Times New Roman" w:hAnsi="Times New Roman"/>
-                <w:color w:val="1F2937"/>
-                <w:sz w:val="19"/>
-              </w:rPr>
-              <w:t xml:space="preserve"> 3 câu truy v</w:t>
+              <w:t>p Nginx JSON Log; Tích h</w:t>
+            </w:r>
+            <w:r>
+              <w:rPr>
+                <w:rFonts w:ascii="Times New Roman" w:hAnsi="Times New Roman"/>
+                <w:color w:val="1F2937"/>
+                <w:sz w:val="19"/>
+              </w:rPr>
+              <w:t>ợ</w:t>
+            </w:r>
+            <w:r>
+              <w:rPr>
+                <w:rFonts w:ascii="Times New Roman" w:hAnsi="Times New Roman"/>
+                <w:color w:val="1F2937"/>
+                <w:sz w:val="19"/>
+              </w:rPr>
+              <w:t>p Grafana; Đ</w:t>
+            </w:r>
+            <w:r>
+              <w:rPr>
+                <w:rFonts w:ascii="Times New Roman" w:hAnsi="Times New Roman"/>
+                <w:color w:val="1F2937"/>
+                <w:sz w:val="19"/>
+              </w:rPr>
+              <w:t>ạ</w:t>
+            </w:r>
+            <w:r>
+              <w:rPr>
+                <w:rFonts w:ascii="Times New Roman" w:hAnsi="Times New Roman"/>
+                <w:color w:val="1F2937"/>
+                <w:sz w:val="19"/>
+              </w:rPr>
+              <w:t>t 5/5 câu truy v</w:t>
             </w:r>
             <w:r>
               <w:rPr>
@@ -27356,7 +27452,23 @@
                 <w:color w:val="1F2937"/>
                 <w:sz w:val="19"/>
               </w:rPr>
-              <w:t>t</w:t>
+              <w:t>t (l</w:t>
+            </w:r>
+            <w:r>
+              <w:rPr>
+                <w:rFonts w:ascii="Times New Roman" w:hAnsi="Times New Roman"/>
+                <w:color w:val="1F2937"/>
+                <w:sz w:val="19"/>
+              </w:rPr>
+              <w:t>ỗ</w:t>
+            </w:r>
+            <w:r>
+              <w:rPr>
+                <w:rFonts w:ascii="Times New Roman" w:hAnsi="Times New Roman"/>
+                <w:color w:val="1F2937"/>
+                <w:sz w:val="19"/>
+              </w:rPr>
+              <w:t>i HTTP, RPS, count_over_time, PHP logs)</w:t>
             </w:r>
           </w:p>
         </w:tc>
@@ -27589,7 +27701,103 @@
                 <w:color w:val="1F2937"/>
                 <w:sz w:val="19"/>
               </w:rPr>
-              <w:t>Non-root PHP (UID 1000); 3 Networks; no-new-privileges; ch</w:t>
+              <w:t>Đ</w:t>
+            </w:r>
+            <w:r>
+              <w:rPr>
+                <w:rFonts w:ascii="Times New Roman" w:hAnsi="Times New Roman"/>
+                <w:color w:val="1F2937"/>
+                <w:sz w:val="19"/>
+              </w:rPr>
+              <w:t>ạ</w:t>
+            </w:r>
+            <w:r>
+              <w:rPr>
+                <w:rFonts w:ascii="Times New Roman" w:hAnsi="Times New Roman"/>
+                <w:color w:val="1F2937"/>
+                <w:sz w:val="19"/>
+              </w:rPr>
+              <w:t>t 22/22 ki</w:t>
+            </w:r>
+            <w:r>
+              <w:rPr>
+                <w:rFonts w:ascii="Times New Roman" w:hAnsi="Times New Roman"/>
+                <w:color w:val="1F2937"/>
+                <w:sz w:val="19"/>
+              </w:rPr>
+              <w:t>ể</w:t>
+            </w:r>
+            <w:r>
+              <w:rPr>
+                <w:rFonts w:ascii="Times New Roman" w:hAnsi="Times New Roman"/>
+                <w:color w:val="1F2937"/>
+                <w:sz w:val="19"/>
+              </w:rPr>
+              <w:t>m ch</w:t>
+            </w:r>
+            <w:r>
+              <w:rPr>
+                <w:rFonts w:ascii="Times New Roman" w:hAnsi="Times New Roman"/>
+                <w:color w:val="1F2937"/>
+                <w:sz w:val="19"/>
+              </w:rPr>
+              <w:t>ứ</w:t>
+            </w:r>
+            <w:r>
+              <w:rPr>
+                <w:rFonts w:ascii="Times New Roman" w:hAnsi="Times New Roman"/>
+                <w:color w:val="1F2937"/>
+                <w:sz w:val="19"/>
+              </w:rPr>
+              <w:t>ng t</w:t>
+            </w:r>
+            <w:r>
+              <w:rPr>
+                <w:rFonts w:ascii="Times New Roman" w:hAnsi="Times New Roman"/>
+                <w:color w:val="1F2937"/>
+                <w:sz w:val="19"/>
+              </w:rPr>
+              <w:t>ự</w:t>
+            </w:r>
+            <w:r>
+              <w:rPr>
+                <w:rFonts w:ascii="Times New Roman" w:hAnsi="Times New Roman"/>
+                <w:color w:val="1F2937"/>
+                <w:sz w:val="19"/>
+              </w:rPr>
+              <w:t xml:space="preserve"> đ</w:t>
+            </w:r>
+            <w:r>
+              <w:rPr>
+                <w:rFonts w:ascii="Times New Roman" w:hAnsi="Times New Roman"/>
+                <w:color w:val="1F2937"/>
+                <w:sz w:val="19"/>
+              </w:rPr>
+              <w:t>ộ</w:t>
+            </w:r>
+            <w:r>
+              <w:rPr>
+                <w:rFonts w:ascii="Times New Roman" w:hAnsi="Times New Roman"/>
+                <w:color w:val="1F2937"/>
+                <w:sz w:val="19"/>
+              </w:rPr>
+              <w:t>ng: Non-root UID 1000; 3 Networks cô l</w:t>
+            </w:r>
+            <w:r>
+              <w:rPr>
+                <w:rFonts w:ascii="Times New Roman" w:hAnsi="Times New Roman"/>
+                <w:color w:val="1F2937"/>
+                <w:sz w:val="19"/>
+              </w:rPr>
+              <w:t>ậ</w:t>
+            </w:r>
+            <w:r>
+              <w:rPr>
+                <w:rFonts w:ascii="Times New Roman" w:hAnsi="Times New Roman"/>
+                <w:color w:val="1F2937"/>
+                <w:sz w:val="19"/>
+              </w:rPr>
+              <w:t>p; no-new-privileges; ch</w:t>
             </w:r>
             <w:r>
               <w:rPr>
@@ -27605,7 +27813,23 @@
                 <w:color w:val="1F2937"/>
                 <w:sz w:val="19"/>
               </w:rPr>
-              <w:t>n execute file PHP trong uploads</w:t>
+              <w:t>n .env/.git/uploads; bcrypt $2y$12$; ch</w:t>
+            </w:r>
+            <w:r>
+              <w:rPr>
+                <w:rFonts w:ascii="Times New Roman" w:hAnsi="Times New Roman"/>
+                <w:color w:val="1F2937"/>
+                <w:sz w:val="19"/>
+              </w:rPr>
+              <w:t>ố</w:t>
+            </w:r>
+            <w:r>
+              <w:rPr>
+                <w:rFonts w:ascii="Times New Roman" w:hAnsi="Times New Roman"/>
+                <w:color w:val="1F2937"/>
+                <w:sz w:val="19"/>
+              </w:rPr>
+              <w:t>ng CSRF</w:t>
             </w:r>
           </w:p>
         </w:tc>
@@ -27822,7 +28046,7 @@
                 <w:color w:val="1F2937"/>
                 <w:sz w:val="19"/>
               </w:rPr>
-              <w:t xml:space="preserve">Báo cáo Word/PDF &gt;15 trang kèm 5 </w:t>
+              <w:t xml:space="preserve">Báo cáo Word/PDF 19 trang kèm 5 </w:t>
             </w:r>
             <w:r>
               <w:rPr>
@@ -27934,7 +28158,23 @@
                 <w:color w:val="1F2937"/>
                 <w:sz w:val="19"/>
               </w:rPr>
-              <w:t>n</w:t>
+              <w:t>n; demo 11 micro-services mư</w:t>
+            </w:r>
+            <w:r>
+              <w:rPr>
+                <w:rFonts w:ascii="Times New Roman" w:hAnsi="Times New Roman"/>
+                <w:color w:val="1F2937"/>
+                <w:sz w:val="19"/>
+              </w:rPr>
+              <w:t>ợ</w:t>
+            </w:r>
+            <w:r>
+              <w:rPr>
+                <w:rFonts w:ascii="Times New Roman" w:hAnsi="Times New Roman"/>
+                <w:color w:val="1F2937"/>
+                <w:sz w:val="19"/>
+              </w:rPr>
+              <w:t>t mà</w:t>
             </w:r>
           </w:p>
         </w:tc>
@@ -29297,31 +29537,31 @@
       </w:rPr>
     </w:lvl>
   </w:abstractNum>
-  <w:num w:numId="1" w16cid:durableId="1979139341">
+  <w:num w:numId="1" w16cid:durableId="2003847975">
     <w:abstractNumId w:val="8"/>
   </w:num>
-  <w:num w:numId="2" w16cid:durableId="255871249">
+  <w:num w:numId="2" w16cid:durableId="854539737">
     <w:abstractNumId w:val="6"/>
   </w:num>
-  <w:num w:numId="3" w16cid:durableId="2137870472">
+  <w:num w:numId="3" w16cid:durableId="577834946">
     <w:abstractNumId w:val="5"/>
   </w:num>
-  <w:num w:numId="4" w16cid:durableId="1076974372">
+  <w:num w:numId="4" w16cid:durableId="571280288">
     <w:abstractNumId w:val="4"/>
   </w:num>
-  <w:num w:numId="5" w16cid:durableId="541870164">
+  <w:num w:numId="5" w16cid:durableId="518467235">
     <w:abstractNumId w:val="7"/>
   </w:num>
-  <w:num w:numId="6" w16cid:durableId="244344922">
+  <w:num w:numId="6" w16cid:durableId="949239213">
     <w:abstractNumId w:val="3"/>
   </w:num>
-  <w:num w:numId="7" w16cid:durableId="1632393879">
+  <w:num w:numId="7" w16cid:durableId="1690832200">
     <w:abstractNumId w:val="2"/>
   </w:num>
-  <w:num w:numId="8" w16cid:durableId="1691175867">
+  <w:num w:numId="8" w16cid:durableId="1397245627">
     <w:abstractNumId w:val="1"/>
   </w:num>
-  <w:num w:numId="9" w16cid:durableId="1655066121">
+  <w:num w:numId="9" w16cid:durableId="442923908">
     <w:abstractNumId w:val="0"/>
   </w:num>
 </w:numbering>

</xml_diff>